<commit_message>
Improvements to merge diagrams, conflicts, undoing
</commit_message>
<xml_diff>
--- a/Intro to Git and Github.docx
+++ b/Intro to Git and Github.docx
@@ -1,6 +1,6 @@
 
 <file path=word/document.xml><?xml version="1.0" encoding="utf-8"?>
-<w:document xmlns:wpc="http://schemas.microsoft.com/office/word/2010/wordprocessingCanvas" xmlns:cx="http://schemas.microsoft.com/office/drawing/2014/chartex" xmlns:cx1="http://schemas.microsoft.com/office/drawing/2015/9/8/chartex" xmlns:cx2="http://schemas.microsoft.com/office/drawing/2015/10/21/chartex" xmlns:cx3="http://schemas.microsoft.com/office/drawing/2016/5/9/chartex" xmlns:cx4="http://schemas.microsoft.com/office/drawing/2016/5/10/chartex" xmlns:cx5="http://schemas.microsoft.com/office/drawing/2016/5/11/chartex" xmlns:cx6="http://schemas.microsoft.com/office/drawing/2016/5/12/chartex" xmlns:cx7="http://schemas.microsoft.com/office/drawing/2016/5/13/chartex" xmlns:cx8="http://schemas.microsoft.com/office/drawing/2016/5/14/chartex" xmlns:mc="http://schemas.openxmlformats.org/markup-compatibility/2006" xmlns:aink="http://schemas.microsoft.com/office/drawing/2016/ink" xmlns:am3d="http://schemas.microsoft.com/office/drawing/2017/model3d" xmlns:o="urn:schemas-microsoft-com:office:office" xmlns:oel="http://schemas.microsoft.com/office/2019/extlst" xmlns:r="http://schemas.openxmlformats.org/officeDocument/2006/relationships" xmlns:m="http://schemas.openxmlformats.org/officeDocument/2006/math" xmlns:v="urn:schemas-microsoft-com:vml" xmlns:wp14="http://schemas.microsoft.com/office/word/2010/wordprocessingDrawing" xmlns:wp="http://schemas.openxmlformats.org/drawingml/2006/wordprocessingDrawing" xmlns:w10="urn:schemas-microsoft-com:office:word" xmlns:w="http://schemas.openxmlformats.org/wordprocessingml/2006/main" xmlns:w14="http://schemas.microsoft.com/office/word/2010/wordml" xmlns:w15="http://schemas.microsoft.com/office/word/2012/wordml" xmlns:w16cex="http://schemas.microsoft.com/office/word/2018/wordml/cex" xmlns:w16cid="http://schemas.microsoft.com/office/word/2016/wordml/cid" xmlns:w16="http://schemas.microsoft.com/office/word/2018/wordml" xmlns:w16sdtdh="http://schemas.microsoft.com/office/word/2020/wordml/sdtdatahash" xmlns:w16se="http://schemas.microsoft.com/office/word/2015/wordml/symex" xmlns:wpg="http://schemas.microsoft.com/office/word/2010/wordprocessingGroup" xmlns:wpi="http://schemas.microsoft.com/office/word/2010/wordprocessingInk" xmlns:wne="http://schemas.microsoft.com/office/word/2006/wordml" xmlns:wps="http://schemas.microsoft.com/office/word/2010/wordprocessingShape" mc:Ignorable="w14 w15 w16se w16cid w16 w16cex w16sdtdh wp14">
+<w:document xmlns:wpc="http://schemas.microsoft.com/office/word/2010/wordprocessingCanvas" xmlns:cx="http://schemas.microsoft.com/office/drawing/2014/chartex" xmlns:cx1="http://schemas.microsoft.com/office/drawing/2015/9/8/chartex" xmlns:cx2="http://schemas.microsoft.com/office/drawing/2015/10/21/chartex" xmlns:cx3="http://schemas.microsoft.com/office/drawing/2016/5/9/chartex" xmlns:cx4="http://schemas.microsoft.com/office/drawing/2016/5/10/chartex" xmlns:cx5="http://schemas.microsoft.com/office/drawing/2016/5/11/chartex" xmlns:cx6="http://schemas.microsoft.com/office/drawing/2016/5/12/chartex" xmlns:cx7="http://schemas.microsoft.com/office/drawing/2016/5/13/chartex" xmlns:cx8="http://schemas.microsoft.com/office/drawing/2016/5/14/chartex" xmlns:mc="http://schemas.openxmlformats.org/markup-compatibility/2006" xmlns:aink="http://schemas.microsoft.com/office/drawing/2016/ink" xmlns:am3d="http://schemas.microsoft.com/office/drawing/2017/model3d" xmlns:o="urn:schemas-microsoft-com:office:office" xmlns:oel="http://schemas.microsoft.com/office/2019/extlst" xmlns:r="http://schemas.openxmlformats.org/officeDocument/2006/relationships" xmlns:m="http://schemas.openxmlformats.org/officeDocument/2006/math" xmlns:v="urn:schemas-microsoft-com:vml" xmlns:wp14="http://schemas.microsoft.com/office/word/2010/wordprocessingDrawing" xmlns:wp="http://schemas.openxmlformats.org/drawingml/2006/wordprocessingDrawing" xmlns:w10="urn:schemas-microsoft-com:office:word" xmlns:w="http://schemas.openxmlformats.org/wordprocessingml/2006/main" xmlns:w14="http://schemas.microsoft.com/office/word/2010/wordml" xmlns:w15="http://schemas.microsoft.com/office/word/2012/wordml" xmlns:w16cex="http://schemas.microsoft.com/office/word/2018/wordml/cex" xmlns:w16cid="http://schemas.microsoft.com/office/word/2016/wordml/cid" xmlns:w16="http://schemas.microsoft.com/office/word/2018/wordml" xmlns:w16du="http://schemas.microsoft.com/office/word/2023/wordml/word16du" xmlns:w16sdtdh="http://schemas.microsoft.com/office/word/2020/wordml/sdtdatahash" xmlns:w16sdtfl="http://schemas.microsoft.com/office/word/2024/wordml/sdtformatlock" xmlns:w16se="http://schemas.microsoft.com/office/word/2015/wordml/symex" xmlns:wpg="http://schemas.microsoft.com/office/word/2010/wordprocessingGroup" xmlns:wpi="http://schemas.microsoft.com/office/word/2010/wordprocessingInk" xmlns:wne="http://schemas.microsoft.com/office/word/2006/wordml" xmlns:wps="http://schemas.microsoft.com/office/word/2010/wordprocessingShape" mc:Ignorable="w14 w15 w16se w16cid w16 w16cex w16sdtdh w16sdtfl w16du wp14">
   <w:body>
     <w:p>
       <w:pPr>
@@ -708,7 +708,6 @@
         <w:pStyle w:val="Heading1"/>
       </w:pPr>
       <w:r>
-        <w:lastRenderedPageBreak/>
         <w:t>Background</w:t>
       </w:r>
     </w:p>
@@ -1362,7 +1361,6 @@
           <w:b/>
           <w:bCs/>
         </w:rPr>
-        <w:lastRenderedPageBreak/>
         <w:t>T</w:t>
       </w:r>
       <w:r>
@@ -1579,7 +1577,7 @@
           <mc:Choice Requires="wpg">
             <w:drawing>
               <wp:inline distT="0" distB="0" distL="0" distR="0" wp14:anchorId="592BC0D5" wp14:editId="4C96A4B0">
-                <wp:extent cx="250825" cy="454057"/>
+                <wp:extent cx="250190" cy="464204"/>
                 <wp:effectExtent l="0" t="12700" r="0" b="0"/>
                 <wp:docPr id="312" name="Group 312"/>
                 <wp:cNvGraphicFramePr>
@@ -1594,9 +1592,9 @@
                       <wpg:grpSpPr>
                         <a:xfrm>
                           <a:off x="0" y="0"/>
-                          <a:ext cx="250825" cy="454057"/>
+                          <a:ext cx="250190" cy="464204"/>
                           <a:chOff x="-15836" y="0"/>
-                          <a:chExt cx="313900" cy="567877"/>
+                          <a:chExt cx="313105" cy="580568"/>
                         </a:xfrm>
                       </wpg:grpSpPr>
                       <wps:wsp>
@@ -1644,8 +1642,8 @@
                         <wps:cNvSpPr txBox="1"/>
                         <wps:spPr>
                           <a:xfrm>
-                            <a:off x="-15836" y="233528"/>
-                            <a:ext cx="313900" cy="334349"/>
+                            <a:off x="-15836" y="233512"/>
+                            <a:ext cx="313105" cy="347056"/>
                           </a:xfrm>
                           <a:prstGeom prst="rect">
                             <a:avLst/>
@@ -1692,7 +1690,7 @@
           </mc:Choice>
           <mc:Fallback>
             <w:pict>
-              <v:group w14:anchorId="592BC0D5" id="Group 312" o:spid="_x0000_s1026" style="width:19.75pt;height:35.75pt;mso-position-horizontal-relative:char;mso-position-vertical-relative:line" coordorigin="-158" coordsize="3139,5678" o:gfxdata="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">
+              <v:group w14:anchorId="592BC0D5" id="Group 312" o:spid="_x0000_s1026" style="width:19.7pt;height:36.55pt;mso-position-horizontal-relative:char;mso-position-vertical-relative:line" coordorigin="-158" coordsize="3131,5805" o:gfxdata="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">
                 <o:lock v:ext="edit" aspectratio="t"/>
                 <v:oval id="Oval 313" o:spid="_x0000_s1027" style="position:absolute;left:49;width:2519;height:2518;visibility:visible;mso-wrap-style:square;v-text-anchor:middle" o:gfxdata="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" fillcolor="#ffbc57" strokecolor="#ed7d31 [3205]" strokeweight="2.25pt">
                   <v:stroke joinstyle="miter"/>
@@ -1703,7 +1701,7 @@
                   <v:stroke joinstyle="miter"/>
                   <v:path gradientshapeok="t" o:connecttype="rect"/>
                 </v:shapetype>
-                <v:shape id="TextBox 119" o:spid="_x0000_s1028" type="#_x0000_t202" style="position:absolute;left:-158;top:2335;width:3138;height:3343;visibility:visible;mso-wrap-style:none;v-text-anchor:top" o:gfxdata="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" filled="f" stroked="f">
+                <v:shape id="TextBox 119" o:spid="_x0000_s1028" type="#_x0000_t202" style="position:absolute;left:-158;top:2335;width:3130;height:3470;visibility:visible;mso-wrap-style:none;v-text-anchor:top" o:gfxdata="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" filled="f" stroked="f">
                   <v:textbox style="mso-fit-shape-to-text:t">
                     <w:txbxContent>
                       <w:p>
@@ -1909,7 +1907,7 @@
           <mc:Choice Requires="wpg">
             <w:drawing>
               <wp:inline distT="0" distB="0" distL="0" distR="0" wp14:anchorId="699C650F" wp14:editId="6EE48762">
-                <wp:extent cx="768342" cy="431957"/>
+                <wp:extent cx="767248" cy="442057"/>
                 <wp:effectExtent l="0" t="12700" r="0" b="0"/>
                 <wp:docPr id="294" name="Group 294"/>
                 <wp:cNvGraphicFramePr>
@@ -1924,9 +1922,9 @@
                       <wpg:grpSpPr>
                         <a:xfrm>
                           <a:off x="0" y="0"/>
-                          <a:ext cx="768342" cy="431957"/>
+                          <a:ext cx="767248" cy="442057"/>
                           <a:chOff x="-12296" y="0"/>
-                          <a:chExt cx="957314" cy="537917"/>
+                          <a:chExt cx="955951" cy="550494"/>
                         </a:xfrm>
                       </wpg:grpSpPr>
                       <wpg:grpSp>
@@ -2063,8 +2061,8 @@
                         <wps:cNvSpPr txBox="1"/>
                         <wps:spPr>
                           <a:xfrm>
-                            <a:off x="-12296" y="205004"/>
-                            <a:ext cx="312561" cy="332913"/>
+                            <a:off x="-12296" y="204929"/>
+                            <a:ext cx="311724" cy="345565"/>
                           </a:xfrm>
                           <a:prstGeom prst="rect">
                             <a:avLst/>
@@ -2108,8 +2106,8 @@
                         <wps:cNvSpPr txBox="1"/>
                         <wps:spPr>
                           <a:xfrm>
-                            <a:off x="632457" y="204891"/>
-                            <a:ext cx="312561" cy="332913"/>
+                            <a:off x="631931" y="204846"/>
+                            <a:ext cx="311724" cy="345565"/>
                           </a:xfrm>
                           <a:prstGeom prst="rect">
                             <a:avLst/>
@@ -2156,7 +2154,7 @@
           </mc:Choice>
           <mc:Fallback>
             <w:pict>
-              <v:group w14:anchorId="699C650F" id="Group 294" o:spid="_x0000_s1029" style="width:60.5pt;height:34pt;mso-position-horizontal-relative:char;mso-position-vertical-relative:line" coordorigin="-122" coordsize="9573,5379" o:gfxdata="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">
+              <v:group w14:anchorId="699C650F" id="Group 294" o:spid="_x0000_s1029" style="width:60.4pt;height:34.8pt;mso-position-horizontal-relative:char;mso-position-vertical-relative:line" coordorigin="-122" coordsize="9559,5504" o:gfxdata="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">
                 <o:lock v:ext="edit" aspectratio="t"/>
                 <v:group id="Group 295" o:spid="_x0000_s1030" style="position:absolute;left:49;width:9057;height:2584" coordorigin="49" coordsize="11321,3230" o:gfxdata="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">
                   <o:lock v:ext="edit" aspectratio="t"/>
@@ -2175,7 +2173,7 @@
                     <o:lock v:ext="edit" shapetype="f"/>
                   </v:line>
                 </v:group>
-                <v:shape id="TextBox 127" o:spid="_x0000_s1034" type="#_x0000_t202" style="position:absolute;left:-122;top:2050;width:3124;height:3329;visibility:visible;mso-wrap-style:none;v-text-anchor:top" o:gfxdata="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" filled="f" stroked="f">
+                <v:shape id="TextBox 127" o:spid="_x0000_s1034" type="#_x0000_t202" style="position:absolute;left:-122;top:2049;width:3116;height:3455;visibility:visible;mso-wrap-style:none;v-text-anchor:top" o:gfxdata="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" filled="f" stroked="f">
                   <v:textbox style="mso-fit-shape-to-text:t">
                     <w:txbxContent>
                       <w:p>
@@ -2205,7 +2203,7 @@
                     </w:txbxContent>
                   </v:textbox>
                 </v:shape>
-                <v:shape id="TextBox 128" o:spid="_x0000_s1035" type="#_x0000_t202" style="position:absolute;left:6324;top:2048;width:3126;height:3330;visibility:visible;mso-wrap-style:none;v-text-anchor:top" o:gfxdata="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" filled="f" stroked="f">
+                <v:shape id="TextBox 128" o:spid="_x0000_s1035" type="#_x0000_t202" style="position:absolute;left:6319;top:2048;width:3117;height:3456;visibility:visible;mso-wrap-style:none;v-text-anchor:top" o:gfxdata="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" filled="f" stroked="f">
                   <v:textbox style="mso-fit-shape-to-text:t">
                     <w:txbxContent>
                       <w:p>
@@ -2352,7 +2350,7 @@
           <mc:Choice Requires="wpg">
             <w:drawing>
               <wp:inline distT="0" distB="0" distL="0" distR="0" wp14:anchorId="1122B3A3" wp14:editId="7296552B">
-                <wp:extent cx="986604" cy="756068"/>
+                <wp:extent cx="986604" cy="766071"/>
                 <wp:effectExtent l="12700" t="0" r="17145" b="0"/>
                 <wp:docPr id="42" name="Group 42"/>
                 <wp:cNvGraphicFramePr/>
@@ -2363,9 +2361,9 @@
                       <wpg:grpSpPr>
                         <a:xfrm>
                           <a:off x="0" y="0"/>
-                          <a:ext cx="986604" cy="756068"/>
+                          <a:ext cx="986604" cy="766071"/>
                           <a:chOff x="658840" y="89452"/>
-                          <a:chExt cx="986605" cy="755394"/>
+                          <a:chExt cx="986605" cy="765388"/>
                         </a:xfrm>
                       </wpg:grpSpPr>
                       <wpg:grpSp>
@@ -2564,8 +2562,8 @@
                         <wps:cNvSpPr txBox="1"/>
                         <wps:spPr>
                           <a:xfrm>
-                            <a:off x="756390" y="668375"/>
-                            <a:ext cx="67945" cy="175738"/>
+                            <a:off x="756346" y="668056"/>
+                            <a:ext cx="67310" cy="185889"/>
                           </a:xfrm>
                           <a:prstGeom prst="rect">
                             <a:avLst/>
@@ -2609,8 +2607,8 @@
                         <wps:cNvSpPr txBox="1"/>
                         <wps:spPr>
                           <a:xfrm>
-                            <a:off x="1399929" y="668951"/>
-                            <a:ext cx="132715" cy="175895"/>
+                            <a:off x="1399592" y="668951"/>
+                            <a:ext cx="132080" cy="185889"/>
                           </a:xfrm>
                           <a:prstGeom prst="rect">
                             <a:avLst/>
@@ -2657,7 +2655,7 @@
           </mc:Choice>
           <mc:Fallback>
             <w:pict>
-              <v:group w14:anchorId="1122B3A3" id="Group 42" o:spid="_x0000_s1036" style="width:77.7pt;height:59.55pt;mso-position-horizontal-relative:char;mso-position-vertical-relative:line" coordorigin="6588,894" coordsize="9866,7553" o:gfxdata="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">
+              <v:group w14:anchorId="1122B3A3" id="Group 42" o:spid="_x0000_s1036" style="width:77.7pt;height:60.3pt;mso-position-horizontal-relative:char;mso-position-vertical-relative:line" coordorigin="6588,894" coordsize="9866,7653" o:gfxdata="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">
                 <v:group id="Group 43" o:spid="_x0000_s1037" style="position:absolute;left:6588;top:894;width:9866;height:5795" coordorigin="8223,1118" coordsize="12332,7243" o:gfxdata="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">
                   <o:lock v:ext="edit" aspectratio="t"/>
                   <v:oval id="Oval 44" o:spid="_x0000_s1038" style="position:absolute;left:8223;top:5209;width:3148;height:3148;visibility:visible;mso-wrap-style:square;v-text-anchor:middle" o:gfxdata="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" fillcolor="#ffbc57" strokecolor="#ed7d31 [3205]" strokeweight="2.25pt">
@@ -2724,7 +2722,7 @@
                     <v:textbox inset="0,0,0,0"/>
                   </v:oval>
                 </v:group>
-                <v:shape id="TextBox 103" o:spid="_x0000_s1042" type="#_x0000_t202" style="position:absolute;left:7563;top:6683;width:680;height:1758;visibility:visible;mso-wrap-style:none;v-text-anchor:top" o:gfxdata="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" filled="f" stroked="f">
+                <v:shape id="TextBox 103" o:spid="_x0000_s1042" type="#_x0000_t202" style="position:absolute;left:7563;top:6680;width:673;height:1859;visibility:visible;mso-wrap-style:none;v-text-anchor:top" o:gfxdata="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" filled="f" stroked="f">
                   <v:textbox style="mso-fit-shape-to-text:t" inset="0,0,0,0">
                     <w:txbxContent>
                       <w:p>
@@ -2754,7 +2752,7 @@
                     </w:txbxContent>
                   </v:textbox>
                 </v:shape>
-                <v:shape id="TextBox 104" o:spid="_x0000_s1043" type="#_x0000_t202" style="position:absolute;left:13999;top:6689;width:1327;height:1759;visibility:visible;mso-wrap-style:square;v-text-anchor:top" o:gfxdata="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" filled="f" stroked="f">
+                <v:shape id="TextBox 104" o:spid="_x0000_s1043" type="#_x0000_t202" style="position:absolute;left:13995;top:6689;width:1321;height:1859;visibility:visible;mso-wrap-style:square;v-text-anchor:top" o:gfxdata="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" filled="f" stroked="f">
                   <v:textbox style="mso-fit-shape-to-text:t" inset="0,0,0,0">
                     <w:txbxContent>
                       <w:p>
@@ -2900,7 +2898,7 @@
           <mc:Choice Requires="wpg">
             <w:drawing>
               <wp:inline distT="0" distB="0" distL="0" distR="0" wp14:anchorId="28731CB4" wp14:editId="6F08721B">
-                <wp:extent cx="1648738" cy="755982"/>
+                <wp:extent cx="1648738" cy="765789"/>
                 <wp:effectExtent l="12700" t="0" r="15240" b="0"/>
                 <wp:docPr id="8" name="Group 8"/>
                 <wp:cNvGraphicFramePr/>
@@ -2911,9 +2909,9 @@
                       <wpg:grpSpPr>
                         <a:xfrm>
                           <a:off x="0" y="0"/>
-                          <a:ext cx="1648738" cy="755982"/>
+                          <a:ext cx="1648738" cy="765789"/>
                           <a:chOff x="0" y="75986"/>
-                          <a:chExt cx="1648740" cy="755982"/>
+                          <a:chExt cx="1648740" cy="765789"/>
                         </a:xfrm>
                       </wpg:grpSpPr>
                       <wpg:grpSp>
@@ -3186,8 +3184,8 @@
                         <wps:cNvSpPr txBox="1"/>
                         <wps:spPr>
                           <a:xfrm>
-                            <a:off x="0" y="649470"/>
-                            <a:ext cx="250825" cy="175895"/>
+                            <a:off x="0" y="649218"/>
+                            <a:ext cx="250190" cy="186055"/>
                           </a:xfrm>
                           <a:prstGeom prst="rect">
                             <a:avLst/>
@@ -3231,8 +3229,8 @@
                         <wps:cNvSpPr txBox="1"/>
                         <wps:spPr>
                           <a:xfrm>
-                            <a:off x="668162" y="656073"/>
-                            <a:ext cx="250825" cy="175895"/>
+                            <a:off x="668049" y="655720"/>
+                            <a:ext cx="250190" cy="186055"/>
                           </a:xfrm>
                           <a:prstGeom prst="rect">
                             <a:avLst/>
@@ -3276,8 +3274,8 @@
                         <wps:cNvSpPr txBox="1"/>
                         <wps:spPr>
                           <a:xfrm>
-                            <a:off x="1317730" y="655303"/>
-                            <a:ext cx="250825" cy="175895"/>
+                            <a:off x="1317508" y="654839"/>
+                            <a:ext cx="250190" cy="186055"/>
                           </a:xfrm>
                           <a:prstGeom prst="rect">
                             <a:avLst/>
@@ -3324,7 +3322,7 @@
           </mc:Choice>
           <mc:Fallback>
             <w:pict>
-              <v:group w14:anchorId="28731CB4" id="Group 8" o:spid="_x0000_s1044" style="width:129.8pt;height:59.55pt;mso-position-horizontal-relative:char;mso-position-vertical-relative:line" coordorigin=",759" coordsize="16487,7559" o:gfxdata="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">
+              <v:group w14:anchorId="28731CB4" id="Group 8" o:spid="_x0000_s1044" style="width:129.8pt;height:60.3pt;mso-position-horizontal-relative:char;mso-position-vertical-relative:line" coordorigin=",759" coordsize="16487,7657" o:gfxdata="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">
                 <v:group id="Group 9" o:spid="_x0000_s1045" style="position:absolute;left:49;top:759;width:16438;height:5801" coordorigin="49,949" coordsize="20547,7251" o:gfxdata="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">
                   <o:lock v:ext="edit" aspectratio="t"/>
                   <v:oval id="Oval 10" o:spid="_x0000_s1046" style="position:absolute;left:8223;top:5053;width:3147;height:3147;visibility:visible;mso-wrap-style:square;v-text-anchor:middle" o:gfxdata="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" fillcolor="#ffbc57" strokecolor="#ed7d31 [3205]" strokeweight="2.25pt">
@@ -3383,7 +3381,7 @@
                     <v:textbox inset=",0,,0"/>
                   </v:oval>
                 </v:group>
-                <v:shape id="TextBox 102" o:spid="_x0000_s1052" type="#_x0000_t202" style="position:absolute;top:6494;width:2508;height:1759;visibility:visible;mso-wrap-style:none;v-text-anchor:top" o:gfxdata="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" filled="f" stroked="f">
+                <v:shape id="TextBox 102" o:spid="_x0000_s1052" type="#_x0000_t202" style="position:absolute;top:6492;width:2501;height:1860;visibility:visible;mso-wrap-style:none;v-text-anchor:top" o:gfxdata="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" filled="f" stroked="f">
                   <v:textbox style="mso-fit-shape-to-text:t" inset=",0,,0">
                     <w:txbxContent>
                       <w:p>
@@ -3413,7 +3411,7 @@
                     </w:txbxContent>
                   </v:textbox>
                 </v:shape>
-                <v:shape id="TextBox 103" o:spid="_x0000_s1053" type="#_x0000_t202" style="position:absolute;left:6681;top:6560;width:2508;height:1759;visibility:visible;mso-wrap-style:none;v-text-anchor:top" o:gfxdata="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" filled="f" stroked="f">
+                <v:shape id="TextBox 103" o:spid="_x0000_s1053" type="#_x0000_t202" style="position:absolute;left:6680;top:6557;width:2502;height:1860;visibility:visible;mso-wrap-style:none;v-text-anchor:top" o:gfxdata="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" filled="f" stroked="f">
                   <v:textbox style="mso-fit-shape-to-text:t" inset=",0,,0">
                     <w:txbxContent>
                       <w:p>
@@ -3443,7 +3441,7 @@
                     </w:txbxContent>
                   </v:textbox>
                 </v:shape>
-                <v:shape id="TextBox 104" o:spid="_x0000_s1054" type="#_x0000_t202" style="position:absolute;left:13177;top:6553;width:2508;height:1758;visibility:visible;mso-wrap-style:none;v-text-anchor:top" o:gfxdata="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" filled="f" stroked="f">
+                <v:shape id="TextBox 104" o:spid="_x0000_s1054" type="#_x0000_t202" style="position:absolute;left:13175;top:6548;width:2501;height:1860;visibility:visible;mso-wrap-style:none;v-text-anchor:top" o:gfxdata="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" filled="f" stroked="f">
                   <v:textbox style="mso-fit-shape-to-text:t" inset=",0,,0">
                     <w:txbxContent>
                       <w:p>
@@ -3520,15 +3518,7 @@
           <w:rFonts w:ascii="Calibri" w:hAnsi="Calibri" w:cs="Calibri"/>
           <w:lang w:val="en-US"/>
         </w:rPr>
-        <w:t xml:space="preserve"> develop the new feature by making commits to the new branch. Once the feature is working </w:t>
-      </w:r>
-      <w:r>
-        <w:rPr>
-          <w:rFonts w:ascii="Calibri" w:hAnsi="Calibri" w:cs="Calibri"/>
-          <w:lang w:val="en-US"/>
-        </w:rPr>
-        <w:lastRenderedPageBreak/>
-        <w:t xml:space="preserve">and has been </w:t>
+        <w:t xml:space="preserve"> develop the new feature by making commits to the new branch. Once the feature is working and has been </w:t>
       </w:r>
       <w:r>
         <w:rPr>
@@ -5441,14 +5431,115 @@
       </w:pPr>
       <w:r>
         <w:rPr>
+          <w:rFonts w:ascii="Calibri" w:hAnsi="Calibri" w:cs="Calibri"/>
+          <w:noProof/>
+        </w:rPr>
+        <mc:AlternateContent>
+          <mc:Choice Requires="wps">
+            <w:drawing>
+              <wp:anchor distT="0" distB="0" distL="114300" distR="114300" simplePos="0" relativeHeight="251658240" behindDoc="1" locked="0" layoutInCell="1" allowOverlap="1" wp14:anchorId="50B21BD8" wp14:editId="71070125">
+                <wp:simplePos x="0" y="0"/>
+                <wp:positionH relativeFrom="column">
+                  <wp:posOffset>4087495</wp:posOffset>
+                </wp:positionH>
+                <wp:positionV relativeFrom="paragraph">
+                  <wp:posOffset>862878</wp:posOffset>
+                </wp:positionV>
+                <wp:extent cx="251999" cy="252000"/>
+                <wp:effectExtent l="19050" t="19050" r="15240" b="15240"/>
+                <wp:wrapNone/>
+                <wp:docPr id="562457637" name="Oval 5"/>
+                <wp:cNvGraphicFramePr xmlns:a="http://schemas.openxmlformats.org/drawingml/2006/main">
+                  <a:graphicFrameLocks xmlns:a="http://schemas.openxmlformats.org/drawingml/2006/main" noChangeAspect="1"/>
+                </wp:cNvGraphicFramePr>
+                <a:graphic xmlns:a="http://schemas.openxmlformats.org/drawingml/2006/main">
+                  <a:graphicData uri="http://schemas.microsoft.com/office/word/2010/wordprocessingShape">
+                    <wps:wsp>
+                      <wps:cNvSpPr>
+                        <a:spLocks noChangeAspect="1"/>
+                      </wps:cNvSpPr>
+                      <wps:spPr>
+                        <a:xfrm>
+                          <a:off x="0" y="0"/>
+                          <a:ext cx="251999" cy="252000"/>
+                        </a:xfrm>
+                        <a:prstGeom prst="ellipse">
+                          <a:avLst/>
+                        </a:prstGeom>
+                        <a:gradFill>
+                          <a:gsLst>
+                            <a:gs pos="27000">
+                              <a:schemeClr val="accent4"/>
+                            </a:gs>
+                            <a:gs pos="55000">
+                              <a:schemeClr val="accent4">
+                                <a:lumMod val="60000"/>
+                                <a:lumOff val="40000"/>
+                              </a:schemeClr>
+                            </a:gs>
+                            <a:gs pos="71000">
+                              <a:schemeClr val="accent5"/>
+                            </a:gs>
+                          </a:gsLst>
+                          <a:lin ang="10800000" scaled="1"/>
+                        </a:gradFill>
+                        <a:ln w="28575">
+                          <a:solidFill>
+                            <a:schemeClr val="accent2"/>
+                          </a:solidFill>
+                        </a:ln>
+                      </wps:spPr>
+                      <wps:style>
+                        <a:lnRef idx="2">
+                          <a:schemeClr val="accent1">
+                            <a:shade val="15000"/>
+                          </a:schemeClr>
+                        </a:lnRef>
+                        <a:fillRef idx="1">
+                          <a:schemeClr val="accent1"/>
+                        </a:fillRef>
+                        <a:effectRef idx="0">
+                          <a:schemeClr val="accent1"/>
+                        </a:effectRef>
+                        <a:fontRef idx="minor">
+                          <a:schemeClr val="lt1"/>
+                        </a:fontRef>
+                      </wps:style>
+                      <wps:bodyPr rtlCol="0" anchor="ctr"/>
+                    </wps:wsp>
+                  </a:graphicData>
+                </a:graphic>
+                <wp14:sizeRelH relativeFrom="margin">
+                  <wp14:pctWidth>0</wp14:pctWidth>
+                </wp14:sizeRelH>
+                <wp14:sizeRelV relativeFrom="margin">
+                  <wp14:pctHeight>0</wp14:pctHeight>
+                </wp14:sizeRelV>
+              </wp:anchor>
+            </w:drawing>
+          </mc:Choice>
+          <mc:Fallback>
+            <w:pict>
+              <v:oval w14:anchorId="344EA063" id="Oval 5" o:spid="_x0000_s1026" style="position:absolute;margin-left:321.85pt;margin-top:67.95pt;width:19.85pt;height:19.85pt;z-index:-251657216;visibility:visible;mso-wrap-style:square;mso-width-percent:0;mso-height-percent:0;mso-wrap-distance-left:9pt;mso-wrap-distance-top:0;mso-wrap-distance-right:9pt;mso-wrap-distance-bottom:0;mso-position-horizontal:absolute;mso-position-horizontal-relative:text;mso-position-vertical:absolute;mso-position-vertical-relative:text;mso-width-percent:0;mso-height-percent:0;mso-width-relative:margin;mso-height-relative:margin;v-text-anchor:middle" o:gfxdata="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" fillcolor="#ffc000 [3207]" strokecolor="#ed7d31 [3205]" strokeweight="2.25pt">
+                <v:fill color2="#5b9bd5 [3208]" angle="270" colors="0 #ffc000;17695f #ffc000;36045f #ffd966" focus="100%" type="gradient"/>
+                <v:stroke joinstyle="miter"/>
+                <v:path arrowok="t"/>
+                <o:lock v:ext="edit" aspectratio="t"/>
+              </v:oval>
+            </w:pict>
+          </mc:Fallback>
+        </mc:AlternateContent>
+      </w:r>
+      <w:r>
+        <w:rPr>
           <w:noProof/>
         </w:rPr>
         <mc:AlternateContent>
           <mc:Choice Requires="wpg">
             <w:drawing>
-              <wp:inline distT="0" distB="0" distL="0" distR="0" wp14:anchorId="3C79E153" wp14:editId="6288E2AF">
+              <wp:inline distT="0" distB="0" distL="0" distR="0" wp14:anchorId="3C79E153" wp14:editId="360FCF59">
                 <wp:extent cx="3137515" cy="1127842"/>
-                <wp:effectExtent l="12700" t="0" r="12700" b="15240"/>
+                <wp:effectExtent l="19050" t="0" r="25400" b="15240"/>
                 <wp:docPr id="131" name="Group 131"/>
                 <wp:cNvGraphicFramePr/>
                 <a:graphic xmlns:a="http://schemas.openxmlformats.org/drawingml/2006/main">
@@ -5735,51 +5826,10 @@
                         <wps:bodyPr/>
                       </wps:wsp>
                       <wps:wsp>
-                        <wps:cNvPr id="141" name="Oval 141"/>
-                        <wps:cNvSpPr>
-                          <a:spLocks noChangeAspect="1"/>
-                        </wps:cNvSpPr>
-                        <wps:spPr>
-                          <a:xfrm>
-                            <a:off x="3490402" y="1449415"/>
-                            <a:ext cx="314792" cy="314793"/>
-                          </a:xfrm>
-                          <a:prstGeom prst="ellipse">
-                            <a:avLst/>
-                          </a:prstGeom>
-                          <a:solidFill>
-                            <a:srgbClr val="FFBC57"/>
-                          </a:solidFill>
-                          <a:ln w="28575">
-                            <a:solidFill>
-                              <a:schemeClr val="accent2"/>
-                            </a:solidFill>
-                          </a:ln>
-                        </wps:spPr>
-                        <wps:style>
-                          <a:lnRef idx="2">
-                            <a:schemeClr val="accent1">
-                              <a:shade val="15000"/>
-                            </a:schemeClr>
-                          </a:lnRef>
-                          <a:fillRef idx="1">
-                            <a:schemeClr val="accent1"/>
-                          </a:fillRef>
-                          <a:effectRef idx="0">
-                            <a:schemeClr val="accent1"/>
-                          </a:effectRef>
-                          <a:fontRef idx="minor">
-                            <a:schemeClr val="lt1"/>
-                          </a:fontRef>
-                        </wps:style>
-                        <wps:bodyPr tIns="0" bIns="0" rtlCol="0" anchor="ctr"/>
-                      </wps:wsp>
-                      <wps:wsp>
                         <wps:cNvPr id="142" name="Straight Connector 142"/>
                         <wps:cNvCnPr>
                           <a:cxnSpLocks/>
                           <a:stCxn id="139" idx="6"/>
-                          <a:endCxn id="141" idx="2"/>
                         </wps:cNvCnPr>
                         <wps:spPr>
                           <a:xfrm flipV="1">
@@ -6030,7 +6080,6 @@
                         <wps:cNvPr id="148" name="Straight Connector 148"/>
                         <wps:cNvCnPr>
                           <a:cxnSpLocks/>
-                          <a:stCxn id="141" idx="1"/>
                           <a:endCxn id="146" idx="5"/>
                         </wps:cNvCnPr>
                         <wps:spPr>
@@ -6133,7 +6182,7 @@
           </mc:Choice>
           <mc:Fallback>
             <w:pict>
-              <v:group w14:anchorId="3C79E153" id="Group 131" o:spid="_x0000_s1089" style="width:247.05pt;height:88.8pt;mso-position-horizontal-relative:char;mso-position-vertical-relative:line" coordorigin=",3715" coordsize="39218,14098" o:gfxdata="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">
+              <v:group w14:anchorId="3C79E153" id="Group 131" o:spid="_x0000_s1089" style="width:247.05pt;height:88.8pt;mso-position-horizontal-relative:char;mso-position-vertical-relative:line" coordorigin=",3715" coordsize="39218,14098" o:gfxdata="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">
                 <v:oval id="Oval 132" o:spid="_x0000_s1090" style="position:absolute;left:8173;top:14573;width:3148;height:3147;visibility:visible;mso-wrap-style:square;v-text-anchor:middle" o:gfxdata="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" fillcolor="#ffbc57" strokecolor="#ed7d31 [3205]" strokeweight="2.25pt">
                   <v:stroke joinstyle="miter"/>
                   <v:path arrowok="t"/>
@@ -6170,41 +6219,17 @@
                   <v:stroke joinstyle="miter"/>
                   <o:lock v:ext="edit" shapetype="f"/>
                 </v:line>
-                <v:oval id="Oval 141" o:spid="_x0000_s1097" style="position:absolute;left:34904;top:14494;width:3147;height:3148;visibility:visible;mso-wrap-style:square;v-text-anchor:middle" o:gfxdata="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" fillcolor="#ffbc57" strokecolor="#ed7d31 [3205]" strokeweight="2.25pt">
+                <v:line id="Straight Connector 142" o:spid="_x0000_s1097" style="position:absolute;flip:y;visibility:visible;mso-wrap-style:square" from="29074,16068" to="34904,16101" o:connectortype="straight" o:gfxdata="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" strokecolor="#ed7d31 [3205]" strokeweight="3pt">
+                  <v:stroke joinstyle="miter"/>
+                  <o:lock v:ext="edit" shapetype="f"/>
+                </v:line>
+                <v:oval id="Oval 143" o:spid="_x0000_s1098" style="position:absolute;left:22778;top:7857;width:3148;height:3148;visibility:visible;mso-wrap-style:square;v-text-anchor:middle" o:gfxdata="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" fillcolor="#5b9bd5 [3208]" strokecolor="#2f5496 [2404]" strokeweight="2.25pt">
                   <v:stroke joinstyle="miter"/>
                   <v:path arrowok="t"/>
                   <o:lock v:ext="edit" aspectratio="t"/>
                   <v:textbox inset=",0,,0"/>
                 </v:oval>
-                <v:line id="Straight Connector 142" o:spid="_x0000_s1098" style="position:absolute;flip:y;visibility:visible;mso-wrap-style:square" from="29074,16068" to="34904,16101" o:connectortype="straight" o:gfxdata="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" strokecolor="#ed7d31 [3205]" strokeweight="3pt">
-                  <v:stroke joinstyle="miter"/>
-                  <o:lock v:ext="edit" shapetype="f"/>
-                </v:line>
-                <v:oval id="Oval 143" o:spid="_x0000_s1099" style="position:absolute;left:22778;top:7857;width:3148;height:3148;visibility:visible;mso-wrap-style:square;v-text-anchor:middle" o:gfxdata="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" fillcolor="#5b9bd5 [3208]" strokecolor="#2f5496 [2404]" strokeweight="2.25pt">
-                  <v:stroke joinstyle="miter"/>
-                  <v:path arrowok="t"/>
-                  <o:lock v:ext="edit" aspectratio="t"/>
-                  <v:textbox inset=",0,,0"/>
-                </v:oval>
-                <v:shapetype id="_x0000_t80" coordsize="21600,21600" o:spt="80" adj="14400,5400,18000,8100" path="m,l21600,,21600@0@5@0@5@2@4@2,10800,21600@1@2@3@2@3@0,0@0xe">
-                  <v:stroke joinstyle="miter"/>
-                  <v:formulas>
-                    <v:f eqn="val #0"/>
-                    <v:f eqn="val #1"/>
-                    <v:f eqn="val #2"/>
-                    <v:f eqn="val #3"/>
-                    <v:f eqn="sum 21600 0 #1"/>
-                    <v:f eqn="sum 21600 0 #3"/>
-                    <v:f eqn="prod #0 1 2"/>
-                  </v:formulas>
-                  <v:path o:connecttype="custom" o:connectlocs="10800,0;0,@6;10800,21600;21600,@6" o:connectangles="270,180,90,0" textboxrect="0,0,21600,@0"/>
-                  <v:handles>
-                    <v:h position="topLeft,#0" yrange="0,@2"/>
-                    <v:h position="#1,bottomRight" xrange="0,@3"/>
-                    <v:h position="#3,#2" xrange="@1,10800" yrange="@0,21600"/>
-                  </v:handles>
-                </v:shapetype>
-                <v:shape id="Down Arrow Callout 144" o:spid="_x0000_s1100" type="#_x0000_t80" style="position:absolute;left:25200;top:3715;width:11671;height:3603;visibility:visible;mso-wrap-style:square;v-text-anchor:middle" o:gfxdata="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" adj="14035,9133,16200,9966" fillcolor="#5b9bd5 [3208]" strokecolor="#091723 [488]" strokeweight="1pt">
+                <v:shape id="Down Arrow Callout 144" o:spid="_x0000_s1099" type="#_x0000_t80" style="position:absolute;left:25200;top:3715;width:11671;height:3603;visibility:visible;mso-wrap-style:square;v-text-anchor:middle" o:gfxdata="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" adj="14035,9133,16200,9966" fillcolor="#5b9bd5 [3208]" strokecolor="#091723 [488]" strokeweight="1pt">
                   <v:textbox inset=",0,,0">
                     <w:txbxContent>
                       <w:p>
@@ -6235,25 +6260,25 @@
                     </w:txbxContent>
                   </v:textbox>
                 </v:shape>
-                <v:line id="Straight Connector 145" o:spid="_x0000_s1101" style="position:absolute;flip:y;visibility:visible;mso-wrap-style:square" from="19133,10544" to="23239,14990" o:connectortype="straight" o:gfxdata="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" strokecolor="#2f5496 [2404]" strokeweight="3pt">
+                <v:line id="Straight Connector 145" o:spid="_x0000_s1100" style="position:absolute;flip:y;visibility:visible;mso-wrap-style:square" from="19133,10544" to="23239,14990" o:connectortype="straight" o:gfxdata="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" strokecolor="#2f5496 [2404]" strokeweight="3pt">
                   <v:stroke joinstyle="miter"/>
                   <o:lock v:ext="edit" shapetype="f"/>
                 </v:line>
-                <v:oval id="Oval 146" o:spid="_x0000_s1102" style="position:absolute;left:29360;top:7857;width:3148;height:3148;visibility:visible;mso-wrap-style:square;v-text-anchor:middle" o:gfxdata="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" fillcolor="#5b9bd5 [3208]" strokecolor="#2f5496 [2404]" strokeweight="2.25pt">
+                <v:oval id="Oval 146" o:spid="_x0000_s1101" style="position:absolute;left:29360;top:7857;width:3148;height:3148;visibility:visible;mso-wrap-style:square;v-text-anchor:middle" o:gfxdata="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" fillcolor="#5b9bd5 [3208]" strokecolor="#2f5496 [2404]" strokeweight="2.25pt">
                   <v:stroke joinstyle="miter"/>
                   <v:path arrowok="t"/>
                   <o:lock v:ext="edit" aspectratio="t"/>
                   <v:textbox inset=",0,,0"/>
                 </v:oval>
-                <v:line id="Straight Connector 147" o:spid="_x0000_s1103" style="position:absolute;flip:y;visibility:visible;mso-wrap-style:square" from="25926,9431" to="29360,9431" o:connectortype="straight" o:gfxdata="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" strokecolor="#2f5496 [2404]" strokeweight="3pt">
+                <v:line id="Straight Connector 147" o:spid="_x0000_s1102" style="position:absolute;flip:y;visibility:visible;mso-wrap-style:square" from="25926,9431" to="29360,9431" o:connectortype="straight" o:gfxdata="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" strokecolor="#2f5496 [2404]" strokeweight="3pt">
                   <v:stroke joinstyle="miter"/>
                   <o:lock v:ext="edit" shapetype="f"/>
                 </v:line>
-                <v:line id="Straight Connector 148" o:spid="_x0000_s1104" style="position:absolute;flip:x y;visibility:visible;mso-wrap-style:square" from="32047,10544" to="35365,14955" o:connectortype="straight" o:gfxdata="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" strokecolor="#2f5496 [2404]" strokeweight="3pt">
+                <v:line id="Straight Connector 148" o:spid="_x0000_s1103" style="position:absolute;flip:x y;visibility:visible;mso-wrap-style:square" from="32047,10544" to="35365,14955" o:connectortype="straight" o:gfxdata="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" strokecolor="#2f5496 [2404]" strokeweight="3pt">
                   <v:stroke joinstyle="miter"/>
                   <o:lock v:ext="edit" shapetype="f"/>
                 </v:line>
-                <v:shape id="Down Arrow Callout 137" o:spid="_x0000_s1105" type="#_x0000_t80" style="position:absolute;left:33811;top:10472;width:5407;height:3608;visibility:visible;mso-wrap-style:square;v-text-anchor:middle" o:gfxdata="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" adj="14035,7197,16200,8998" fillcolor="#ffc261" strokecolor="#181818 [486]" strokeweight="1pt">
+                <v:shape id="Down Arrow Callout 137" o:spid="_x0000_s1104" type="#_x0000_t80" style="position:absolute;left:33811;top:10472;width:5407;height:3608;visibility:visible;mso-wrap-style:square;v-text-anchor:middle" o:gfxdata="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" adj="14035,7197,16200,8998" fillcolor="#ffc261" strokecolor="#181818 [486]" strokeweight="1pt">
                   <v:textbox inset="0,0,0,0">
                     <w:txbxContent>
                       <w:p>
@@ -6369,879 +6394,162 @@
           <w:sz w:val="22"/>
           <w:szCs w:val="22"/>
         </w:rPr>
-        <w:t xml:space="preserve"> Once a branch has been merged, all the commits will be contained in the destination branch, so the merged branch can be deleted.</w:t>
-      </w:r>
-    </w:p>
-    <w:p>
-      <w:pPr>
-        <w:pStyle w:val="NormalWeb"/>
-        <w:spacing w:before="0" w:beforeAutospacing="0" w:after="0" w:afterAutospacing="0"/>
+        <w:t xml:space="preserve"> Once a branch has been merged, </w:t>
+      </w:r>
+      <w:r>
         <w:rPr>
           <w:rFonts w:ascii="Calibri" w:hAnsi="Calibri" w:cs="Calibri"/>
           <w:sz w:val="22"/>
           <w:szCs w:val="22"/>
         </w:rPr>
-      </w:pPr>
-    </w:p>
-    <w:p>
-      <w:pPr>
-        <w:pStyle w:val="NormalWeb"/>
-        <w:spacing w:before="0" w:beforeAutospacing="0" w:after="0" w:afterAutospacing="0"/>
-        <w:jc w:val="center"/>
+        <w:t>it can be deleted</w:t>
+      </w:r>
+      <w:r>
         <w:rPr>
           <w:rFonts w:ascii="Calibri" w:hAnsi="Calibri" w:cs="Calibri"/>
           <w:sz w:val="22"/>
           <w:szCs w:val="22"/>
         </w:rPr>
-      </w:pPr>
-      <w:r>
-        <w:rPr>
-          <w:noProof/>
-        </w:rPr>
-        <mc:AlternateContent>
-          <mc:Choice Requires="wps">
-            <w:drawing>
-              <wp:anchor distT="0" distB="0" distL="114300" distR="114300" simplePos="0" relativeHeight="251659264" behindDoc="0" locked="0" layoutInCell="1" allowOverlap="1" wp14:anchorId="1D58A207" wp14:editId="471CB559">
-                <wp:simplePos x="0" y="0"/>
-                <wp:positionH relativeFrom="column">
-                  <wp:posOffset>1617980</wp:posOffset>
-                </wp:positionH>
-                <wp:positionV relativeFrom="paragraph">
-                  <wp:posOffset>445770</wp:posOffset>
-                </wp:positionV>
-                <wp:extent cx="190034" cy="0"/>
-                <wp:effectExtent l="0" t="12700" r="26035" b="25400"/>
-                <wp:wrapNone/>
-                <wp:docPr id="78" name="Straight Connector 78"/>
-                <wp:cNvGraphicFramePr/>
-                <a:graphic xmlns:a="http://schemas.openxmlformats.org/drawingml/2006/main">
-                  <a:graphicData uri="http://schemas.microsoft.com/office/word/2010/wordprocessingShape">
-                    <wps:wsp>
-                      <wps:cNvCnPr/>
-                      <wps:spPr>
-                        <a:xfrm>
-                          <a:off x="0" y="0"/>
-                          <a:ext cx="190034" cy="0"/>
-                        </a:xfrm>
-                        <a:prstGeom prst="line">
-                          <a:avLst/>
-                        </a:prstGeom>
-                        <a:ln w="38100"/>
-                      </wps:spPr>
-                      <wps:style>
-                        <a:lnRef idx="1">
-                          <a:schemeClr val="accent2"/>
-                        </a:lnRef>
-                        <a:fillRef idx="0">
-                          <a:schemeClr val="accent2"/>
-                        </a:fillRef>
-                        <a:effectRef idx="0">
-                          <a:schemeClr val="accent2"/>
-                        </a:effectRef>
-                        <a:fontRef idx="minor">
-                          <a:schemeClr val="tx1"/>
-                        </a:fontRef>
-                      </wps:style>
-                      <wps:bodyPr/>
-                    </wps:wsp>
-                  </a:graphicData>
-                </a:graphic>
-                <wp14:sizeRelH relativeFrom="margin">
-                  <wp14:pctWidth>0</wp14:pctWidth>
-                </wp14:sizeRelH>
-              </wp:anchor>
-            </w:drawing>
-          </mc:Choice>
-          <mc:Fallback>
-            <w:pict>
-              <v:line w14:anchorId="66B473DD" id="Straight Connector 78" o:spid="_x0000_s1026" style="position:absolute;z-index:251659264;visibility:visible;mso-wrap-style:square;mso-width-percent:0;mso-wrap-distance-left:9pt;mso-wrap-distance-top:0;mso-wrap-distance-right:9pt;mso-wrap-distance-bottom:0;mso-position-horizontal:absolute;mso-position-horizontal-relative:text;mso-position-vertical:absolute;mso-position-vertical-relative:text;mso-width-percent:0;mso-width-relative:margin" from="127.4pt,35.1pt" to="142.35pt,35.1pt" o:gfxdata="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" strokecolor="#ed7d31 [3205]" strokeweight="3pt">
-                <v:stroke joinstyle="miter"/>
-              </v:line>
-            </w:pict>
-          </mc:Fallback>
-        </mc:AlternateContent>
-      </w:r>
-      <w:r>
-        <w:rPr>
-          <w:noProof/>
-        </w:rPr>
-        <mc:AlternateContent>
-          <mc:Choice Requires="wps">
-            <w:drawing>
-              <wp:anchor distT="0" distB="0" distL="114300" distR="114300" simplePos="0" relativeHeight="251661312" behindDoc="0" locked="0" layoutInCell="1" allowOverlap="1" wp14:anchorId="0C4A504B" wp14:editId="21DC48CE">
-                <wp:simplePos x="0" y="0"/>
-                <wp:positionH relativeFrom="column">
-                  <wp:posOffset>3822699</wp:posOffset>
-                </wp:positionH>
-                <wp:positionV relativeFrom="paragraph">
-                  <wp:posOffset>445770</wp:posOffset>
-                </wp:positionV>
-                <wp:extent cx="192057" cy="0"/>
-                <wp:effectExtent l="0" t="12700" r="36830" b="25400"/>
-                <wp:wrapNone/>
-                <wp:docPr id="80" name="Straight Connector 80"/>
-                <wp:cNvGraphicFramePr/>
-                <a:graphic xmlns:a="http://schemas.openxmlformats.org/drawingml/2006/main">
-                  <a:graphicData uri="http://schemas.microsoft.com/office/word/2010/wordprocessingShape">
-                    <wps:wsp>
-                      <wps:cNvCnPr/>
-                      <wps:spPr>
-                        <a:xfrm>
-                          <a:off x="0" y="0"/>
-                          <a:ext cx="192057" cy="0"/>
-                        </a:xfrm>
-                        <a:prstGeom prst="line">
-                          <a:avLst/>
-                        </a:prstGeom>
-                        <a:ln w="38100"/>
-                      </wps:spPr>
-                      <wps:style>
-                        <a:lnRef idx="1">
-                          <a:schemeClr val="accent2"/>
-                        </a:lnRef>
-                        <a:fillRef idx="0">
-                          <a:schemeClr val="accent2"/>
-                        </a:fillRef>
-                        <a:effectRef idx="0">
-                          <a:schemeClr val="accent2"/>
-                        </a:effectRef>
-                        <a:fontRef idx="minor">
-                          <a:schemeClr val="tx1"/>
-                        </a:fontRef>
-                      </wps:style>
-                      <wps:bodyPr/>
-                    </wps:wsp>
-                  </a:graphicData>
-                </a:graphic>
-                <wp14:sizeRelH relativeFrom="margin">
-                  <wp14:pctWidth>0</wp14:pctWidth>
-                </wp14:sizeRelH>
-              </wp:anchor>
-            </w:drawing>
-          </mc:Choice>
-          <mc:Fallback>
-            <w:pict>
-              <v:line w14:anchorId="770750BB" id="Straight Connector 80" o:spid="_x0000_s1026" style="position:absolute;z-index:251661312;visibility:visible;mso-wrap-style:square;mso-width-percent:0;mso-wrap-distance-left:9pt;mso-wrap-distance-top:0;mso-wrap-distance-right:9pt;mso-wrap-distance-bottom:0;mso-position-horizontal:absolute;mso-position-horizontal-relative:text;mso-position-vertical:absolute;mso-position-vertical-relative:text;mso-width-percent:0;mso-width-relative:margin" from="301pt,35.1pt" to="316.1pt,35.1pt" o:gfxdata="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" strokecolor="#ed7d31 [3205]" strokeweight="3pt">
-                <v:stroke joinstyle="miter"/>
-              </v:line>
-            </w:pict>
-          </mc:Fallback>
-        </mc:AlternateContent>
-      </w:r>
-      <w:r>
-        <w:rPr>
-          <w:noProof/>
-        </w:rPr>
-        <mc:AlternateContent>
-          <mc:Choice Requires="wps">
-            <w:drawing>
-              <wp:anchor distT="0" distB="0" distL="114300" distR="114300" simplePos="0" relativeHeight="251660288" behindDoc="0" locked="0" layoutInCell="1" allowOverlap="1" wp14:anchorId="38B5D64C" wp14:editId="720DF52F">
-                <wp:simplePos x="0" y="0"/>
-                <wp:positionH relativeFrom="column">
-                  <wp:posOffset>3352800</wp:posOffset>
-                </wp:positionH>
-                <wp:positionV relativeFrom="paragraph">
-                  <wp:posOffset>443230</wp:posOffset>
-                </wp:positionV>
-                <wp:extent cx="193910" cy="0"/>
-                <wp:effectExtent l="0" t="12700" r="34925" b="25400"/>
-                <wp:wrapNone/>
-                <wp:docPr id="79" name="Straight Connector 79"/>
-                <wp:cNvGraphicFramePr/>
-                <a:graphic xmlns:a="http://schemas.openxmlformats.org/drawingml/2006/main">
-                  <a:graphicData uri="http://schemas.microsoft.com/office/word/2010/wordprocessingShape">
-                    <wps:wsp>
-                      <wps:cNvCnPr/>
-                      <wps:spPr>
-                        <a:xfrm>
-                          <a:off x="0" y="0"/>
-                          <a:ext cx="193910" cy="0"/>
-                        </a:xfrm>
-                        <a:prstGeom prst="line">
-                          <a:avLst/>
-                        </a:prstGeom>
-                        <a:ln w="38100"/>
-                      </wps:spPr>
-                      <wps:style>
-                        <a:lnRef idx="1">
-                          <a:schemeClr val="accent2"/>
-                        </a:lnRef>
-                        <a:fillRef idx="0">
-                          <a:schemeClr val="accent2"/>
-                        </a:fillRef>
-                        <a:effectRef idx="0">
-                          <a:schemeClr val="accent2"/>
-                        </a:effectRef>
-                        <a:fontRef idx="minor">
-                          <a:schemeClr val="tx1"/>
-                        </a:fontRef>
-                      </wps:style>
-                      <wps:bodyPr/>
-                    </wps:wsp>
-                  </a:graphicData>
-                </a:graphic>
-                <wp14:sizeRelH relativeFrom="margin">
-                  <wp14:pctWidth>0</wp14:pctWidth>
-                </wp14:sizeRelH>
-              </wp:anchor>
-            </w:drawing>
-          </mc:Choice>
-          <mc:Fallback>
-            <w:pict>
-              <v:line w14:anchorId="78F43CB5" id="Straight Connector 79" o:spid="_x0000_s1026" style="position:absolute;z-index:251660288;visibility:visible;mso-wrap-style:square;mso-width-percent:0;mso-wrap-distance-left:9pt;mso-wrap-distance-top:0;mso-wrap-distance-right:9pt;mso-wrap-distance-bottom:0;mso-position-horizontal:absolute;mso-position-horizontal-relative:text;mso-position-vertical:absolute;mso-position-vertical-relative:text;mso-width-percent:0;mso-width-relative:margin" from="264pt,34.9pt" to="279.25pt,34.9pt" o:gfxdata="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" strokecolor="#ed7d31 [3205]" strokeweight="3pt">
-                <v:stroke joinstyle="miter"/>
-              </v:line>
-            </w:pict>
-          </mc:Fallback>
-        </mc:AlternateContent>
-      </w:r>
-      <w:r>
-        <w:rPr>
-          <w:noProof/>
-        </w:rPr>
-        <mc:AlternateContent>
-          <mc:Choice Requires="wpg">
-            <w:drawing>
-              <wp:inline distT="0" distB="0" distL="0" distR="0" wp14:anchorId="504EC4C4" wp14:editId="55C5C97F">
-                <wp:extent cx="2995930" cy="575310"/>
-                <wp:effectExtent l="12700" t="0" r="13970" b="8890"/>
-                <wp:docPr id="1" name="Group 1"/>
-                <wp:cNvGraphicFramePr/>
-                <a:graphic xmlns:a="http://schemas.openxmlformats.org/drawingml/2006/main">
-                  <a:graphicData uri="http://schemas.microsoft.com/office/word/2010/wordprocessingGroup">
-                    <wpg:wgp>
-                      <wpg:cNvGrpSpPr/>
-                      <wpg:grpSpPr>
-                        <a:xfrm>
-                          <a:off x="0" y="0"/>
-                          <a:ext cx="2995930" cy="575310"/>
-                          <a:chOff x="0" y="1047258"/>
-                          <a:chExt cx="3744913" cy="719499"/>
-                        </a:xfrm>
-                      </wpg:grpSpPr>
-                      <wps:wsp>
-                        <wps:cNvPr id="2" name="Oval 2"/>
-                        <wps:cNvSpPr>
-                          <a:spLocks noChangeAspect="1"/>
-                        </wps:cNvSpPr>
-                        <wps:spPr>
-                          <a:xfrm>
-                            <a:off x="551867" y="1444797"/>
-                            <a:ext cx="314792" cy="314793"/>
-                          </a:xfrm>
-                          <a:prstGeom prst="ellipse">
-                            <a:avLst/>
-                          </a:prstGeom>
-                          <a:solidFill>
-                            <a:srgbClr val="FFBC57"/>
-                          </a:solidFill>
-                          <a:ln w="28575">
-                            <a:solidFill>
-                              <a:schemeClr val="accent2"/>
-                            </a:solidFill>
-                          </a:ln>
-                        </wps:spPr>
-                        <wps:style>
-                          <a:lnRef idx="2">
-                            <a:schemeClr val="accent1">
-                              <a:shade val="15000"/>
-                            </a:schemeClr>
-                          </a:lnRef>
-                          <a:fillRef idx="1">
-                            <a:schemeClr val="accent1"/>
-                          </a:fillRef>
-                          <a:effectRef idx="0">
-                            <a:schemeClr val="accent1"/>
-                          </a:effectRef>
-                          <a:fontRef idx="minor">
-                            <a:schemeClr val="lt1"/>
-                          </a:fontRef>
-                        </wps:style>
-                        <wps:bodyPr tIns="0" bIns="0" rtlCol="0" anchor="ctr"/>
-                      </wps:wsp>
-                      <wps:wsp>
-                        <wps:cNvPr id="3" name="Straight Connector 3"/>
-                        <wps:cNvCnPr>
-                          <a:cxnSpLocks/>
-                          <a:stCxn id="2" idx="6"/>
-                          <a:endCxn id="6" idx="2"/>
-                        </wps:cNvCnPr>
-                        <wps:spPr>
-                          <a:xfrm flipV="1">
-                            <a:off x="866660" y="1601259"/>
-                            <a:ext cx="188099" cy="934"/>
-                          </a:xfrm>
-                          <a:prstGeom prst="line">
-                            <a:avLst/>
-                          </a:prstGeom>
-                          <a:ln w="38100">
-                            <a:solidFill>
-                              <a:schemeClr val="accent2"/>
-                            </a:solidFill>
-                          </a:ln>
-                        </wps:spPr>
-                        <wps:style>
-                          <a:lnRef idx="1">
-                            <a:schemeClr val="accent1"/>
-                          </a:lnRef>
-                          <a:fillRef idx="0">
-                            <a:schemeClr val="accent1"/>
-                          </a:fillRef>
-                          <a:effectRef idx="0">
-                            <a:schemeClr val="accent1"/>
-                          </a:effectRef>
-                          <a:fontRef idx="minor">
-                            <a:schemeClr val="tx1"/>
-                          </a:fontRef>
-                        </wps:style>
-                        <wps:bodyPr/>
-                      </wps:wsp>
-                      <wps:wsp>
-                        <wps:cNvPr id="4" name="Oval 4"/>
-                        <wps:cNvSpPr>
-                          <a:spLocks noChangeAspect="1"/>
-                        </wps:cNvSpPr>
-                        <wps:spPr>
-                          <a:xfrm>
-                            <a:off x="0" y="1449417"/>
-                            <a:ext cx="314792" cy="314792"/>
-                          </a:xfrm>
-                          <a:prstGeom prst="ellipse">
-                            <a:avLst/>
-                          </a:prstGeom>
-                          <a:solidFill>
-                            <a:srgbClr val="FFBC57"/>
-                          </a:solidFill>
-                          <a:ln w="28575">
-                            <a:solidFill>
-                              <a:schemeClr val="accent2"/>
-                            </a:solidFill>
-                          </a:ln>
-                        </wps:spPr>
-                        <wps:style>
-                          <a:lnRef idx="2">
-                            <a:schemeClr val="accent1">
-                              <a:shade val="15000"/>
-                            </a:schemeClr>
-                          </a:lnRef>
-                          <a:fillRef idx="1">
-                            <a:schemeClr val="accent1"/>
-                          </a:fillRef>
-                          <a:effectRef idx="0">
-                            <a:schemeClr val="accent1"/>
-                          </a:effectRef>
-                          <a:fontRef idx="minor">
-                            <a:schemeClr val="lt1"/>
-                          </a:fontRef>
-                        </wps:style>
-                        <wps:bodyPr tIns="0" bIns="0" rtlCol="0" anchor="ctr"/>
-                      </wps:wsp>
-                      <wps:wsp>
-                        <wps:cNvPr id="5" name="Straight Connector 5"/>
-                        <wps:cNvCnPr>
-                          <a:cxnSpLocks/>
-                          <a:stCxn id="7" idx="6"/>
-                        </wps:cNvCnPr>
-                        <wps:spPr>
-                          <a:xfrm flipV="1">
-                            <a:off x="1922744" y="1601914"/>
-                            <a:ext cx="247995" cy="1299"/>
-                          </a:xfrm>
-                          <a:prstGeom prst="line">
-                            <a:avLst/>
-                          </a:prstGeom>
-                          <a:ln w="38100">
-                            <a:solidFill>
-                              <a:schemeClr val="accent2"/>
-                            </a:solidFill>
-                          </a:ln>
-                        </wps:spPr>
-                        <wps:style>
-                          <a:lnRef idx="1">
-                            <a:schemeClr val="accent1"/>
-                          </a:lnRef>
-                          <a:fillRef idx="0">
-                            <a:schemeClr val="accent1"/>
-                          </a:fillRef>
-                          <a:effectRef idx="0">
-                            <a:schemeClr val="accent1"/>
-                          </a:effectRef>
-                          <a:fontRef idx="minor">
-                            <a:schemeClr val="tx1"/>
-                          </a:fontRef>
-                        </wps:style>
-                        <wps:bodyPr/>
-                      </wps:wsp>
-                      <wps:wsp>
-                        <wps:cNvPr id="6" name="Oval 6"/>
-                        <wps:cNvSpPr>
-                          <a:spLocks noChangeAspect="1"/>
-                        </wps:cNvSpPr>
-                        <wps:spPr>
-                          <a:xfrm>
-                            <a:off x="1054759" y="1435892"/>
-                            <a:ext cx="314792" cy="330732"/>
-                          </a:xfrm>
-                          <a:prstGeom prst="ellipse">
-                            <a:avLst/>
-                          </a:prstGeom>
-                          <a:solidFill>
-                            <a:srgbClr val="FFBC57"/>
-                          </a:solidFill>
-                          <a:ln w="28575">
-                            <a:solidFill>
-                              <a:schemeClr val="accent2"/>
-                            </a:solidFill>
-                          </a:ln>
-                        </wps:spPr>
-                        <wps:style>
-                          <a:lnRef idx="2">
-                            <a:schemeClr val="accent1">
-                              <a:shade val="15000"/>
-                            </a:schemeClr>
-                          </a:lnRef>
-                          <a:fillRef idx="1">
-                            <a:schemeClr val="accent1"/>
-                          </a:fillRef>
-                          <a:effectRef idx="0">
-                            <a:schemeClr val="accent1"/>
-                          </a:effectRef>
-                          <a:fontRef idx="minor">
-                            <a:schemeClr val="lt1"/>
-                          </a:fontRef>
-                        </wps:style>
-                        <wps:bodyPr tIns="0" bIns="0" rtlCol="0" anchor="ctr"/>
-                      </wps:wsp>
-                      <wps:wsp>
-                        <wps:cNvPr id="7" name="Oval 7"/>
-                        <wps:cNvSpPr>
-                          <a:spLocks noChangeAspect="1"/>
-                        </wps:cNvSpPr>
-                        <wps:spPr>
-                          <a:xfrm>
-                            <a:off x="1607951" y="1448128"/>
-                            <a:ext cx="314792" cy="310171"/>
-                          </a:xfrm>
-                          <a:prstGeom prst="ellipse">
-                            <a:avLst/>
-                          </a:prstGeom>
-                          <a:solidFill>
-                            <a:srgbClr val="FFBC57"/>
-                          </a:solidFill>
-                          <a:ln w="28575">
-                            <a:solidFill>
-                              <a:schemeClr val="accent2"/>
-                            </a:solidFill>
-                          </a:ln>
-                        </wps:spPr>
-                        <wps:style>
-                          <a:lnRef idx="2">
-                            <a:schemeClr val="accent1">
-                              <a:shade val="15000"/>
-                            </a:schemeClr>
-                          </a:lnRef>
-                          <a:fillRef idx="1">
-                            <a:schemeClr val="accent1"/>
-                          </a:fillRef>
-                          <a:effectRef idx="0">
-                            <a:schemeClr val="accent1"/>
-                          </a:effectRef>
-                          <a:fontRef idx="minor">
-                            <a:schemeClr val="lt1"/>
-                          </a:fontRef>
-                        </wps:style>
-                        <wps:bodyPr tIns="0" bIns="0" rtlCol="0" anchor="ctr"/>
-                      </wps:wsp>
-                      <wps:wsp>
-                        <wps:cNvPr id="47" name="Oval 47"/>
-                        <wps:cNvSpPr>
-                          <a:spLocks noChangeAspect="1"/>
-                        </wps:cNvSpPr>
-                        <wps:spPr>
-                          <a:xfrm>
-                            <a:off x="3310297" y="1451958"/>
-                            <a:ext cx="314792" cy="314793"/>
-                          </a:xfrm>
-                          <a:prstGeom prst="ellipse">
-                            <a:avLst/>
-                          </a:prstGeom>
-                          <a:solidFill>
-                            <a:srgbClr val="FFBC57"/>
-                          </a:solidFill>
-                          <a:ln w="28575">
-                            <a:solidFill>
-                              <a:schemeClr val="accent2"/>
-                            </a:solidFill>
-                          </a:ln>
-                        </wps:spPr>
-                        <wps:style>
-                          <a:lnRef idx="2">
-                            <a:schemeClr val="accent1">
-                              <a:shade val="15000"/>
-                            </a:schemeClr>
-                          </a:lnRef>
-                          <a:fillRef idx="1">
-                            <a:schemeClr val="accent1"/>
-                          </a:fillRef>
-                          <a:effectRef idx="0">
-                            <a:schemeClr val="accent1"/>
-                          </a:effectRef>
-                          <a:fontRef idx="minor">
-                            <a:schemeClr val="lt1"/>
-                          </a:fontRef>
-                        </wps:style>
-                        <wps:bodyPr tIns="0" bIns="0" rtlCol="0" anchor="ctr"/>
-                      </wps:wsp>
-                      <wps:wsp>
-                        <wps:cNvPr id="53" name="Oval 53"/>
-                        <wps:cNvSpPr>
-                          <a:spLocks noChangeAspect="1"/>
-                        </wps:cNvSpPr>
-                        <wps:spPr>
-                          <a:xfrm>
-                            <a:off x="2159736" y="1451964"/>
-                            <a:ext cx="314792" cy="314793"/>
-                          </a:xfrm>
-                          <a:prstGeom prst="ellipse">
-                            <a:avLst/>
-                          </a:prstGeom>
-                          <a:ln w="28575">
-                            <a:solidFill>
-                              <a:schemeClr val="accent1">
-                                <a:lumMod val="75000"/>
-                              </a:schemeClr>
-                            </a:solidFill>
-                          </a:ln>
-                        </wps:spPr>
-                        <wps:style>
-                          <a:lnRef idx="2">
-                            <a:schemeClr val="accent5">
-                              <a:shade val="15000"/>
-                            </a:schemeClr>
-                          </a:lnRef>
-                          <a:fillRef idx="1">
-                            <a:schemeClr val="accent5"/>
-                          </a:fillRef>
-                          <a:effectRef idx="0">
-                            <a:schemeClr val="accent5"/>
-                          </a:effectRef>
-                          <a:fontRef idx="minor">
-                            <a:schemeClr val="lt1"/>
-                          </a:fontRef>
-                        </wps:style>
-                        <wps:bodyPr tIns="0" bIns="0" rtlCol="0" anchor="ctr"/>
-                      </wps:wsp>
-                      <wps:wsp>
-                        <wps:cNvPr id="56" name="Oval 56"/>
-                        <wps:cNvSpPr>
-                          <a:spLocks noChangeAspect="1"/>
-                        </wps:cNvSpPr>
-                        <wps:spPr>
-                          <a:xfrm>
-                            <a:off x="2739675" y="1451964"/>
-                            <a:ext cx="314793" cy="314793"/>
-                          </a:xfrm>
-                          <a:prstGeom prst="ellipse">
-                            <a:avLst/>
-                          </a:prstGeom>
-                          <a:ln w="28575">
-                            <a:solidFill>
-                              <a:schemeClr val="accent1">
-                                <a:lumMod val="75000"/>
-                              </a:schemeClr>
-                            </a:solidFill>
-                          </a:ln>
-                        </wps:spPr>
-                        <wps:style>
-                          <a:lnRef idx="2">
-                            <a:schemeClr val="accent5">
-                              <a:shade val="15000"/>
-                            </a:schemeClr>
-                          </a:lnRef>
-                          <a:fillRef idx="1">
-                            <a:schemeClr val="accent5"/>
-                          </a:fillRef>
-                          <a:effectRef idx="0">
-                            <a:schemeClr val="accent5"/>
-                          </a:effectRef>
-                          <a:fontRef idx="minor">
-                            <a:schemeClr val="lt1"/>
-                          </a:fontRef>
-                        </wps:style>
-                        <wps:bodyPr tIns="0" bIns="0" rtlCol="0" anchor="ctr"/>
-                      </wps:wsp>
-                      <wps:wsp>
-                        <wps:cNvPr id="57" name="Straight Connector 57"/>
-                        <wps:cNvCnPr>
-                          <a:cxnSpLocks/>
-                          <a:stCxn id="6" idx="6"/>
-                          <a:endCxn id="7" idx="2"/>
-                        </wps:cNvCnPr>
-                        <wps:spPr>
-                          <a:xfrm>
-                            <a:off x="1369551" y="1601259"/>
-                            <a:ext cx="238400" cy="1955"/>
-                          </a:xfrm>
-                          <a:prstGeom prst="line">
-                            <a:avLst/>
-                          </a:prstGeom>
-                          <a:ln w="38100">
-                            <a:solidFill>
-                              <a:schemeClr val="accent2"/>
-                            </a:solidFill>
-                          </a:ln>
-                        </wps:spPr>
-                        <wps:style>
-                          <a:lnRef idx="1">
-                            <a:schemeClr val="accent2"/>
-                          </a:lnRef>
-                          <a:fillRef idx="0">
-                            <a:schemeClr val="accent2"/>
-                          </a:fillRef>
-                          <a:effectRef idx="0">
-                            <a:schemeClr val="accent2"/>
-                          </a:effectRef>
-                          <a:fontRef idx="minor">
-                            <a:schemeClr val="tx1"/>
-                          </a:fontRef>
-                        </wps:style>
-                        <wps:bodyPr/>
-                      </wps:wsp>
-                      <wps:wsp>
-                        <wps:cNvPr id="59" name="Down Arrow Callout 59"/>
-                        <wps:cNvSpPr/>
-                        <wps:spPr>
-                          <a:xfrm>
-                            <a:off x="3204137" y="1047258"/>
-                            <a:ext cx="540776" cy="360831"/>
-                          </a:xfrm>
-                          <a:prstGeom prst="downArrowCallout">
-                            <a:avLst/>
-                          </a:prstGeom>
-                          <a:solidFill>
-                            <a:srgbClr val="FFC261"/>
-                          </a:solidFill>
-                        </wps:spPr>
-                        <wps:style>
-                          <a:lnRef idx="2">
-                            <a:schemeClr val="accent3">
-                              <a:shade val="15000"/>
-                            </a:schemeClr>
-                          </a:lnRef>
-                          <a:fillRef idx="1">
-                            <a:schemeClr val="accent3"/>
-                          </a:fillRef>
-                          <a:effectRef idx="0">
-                            <a:schemeClr val="accent3"/>
-                          </a:effectRef>
-                          <a:fontRef idx="minor">
-                            <a:schemeClr val="lt1"/>
-                          </a:fontRef>
-                        </wps:style>
-                        <wps:txbx>
-                          <w:txbxContent>
-                            <w:p>
-                              <w:pPr>
-                                <w:spacing w:after="0"/>
-                                <w:jc w:val="center"/>
-                                <w:rPr>
-                                  <w:rFonts w:hAnsi="Calibri"/>
-                                  <w:color w:val="000000" w:themeColor="text1"/>
-                                  <w:kern w:val="24"/>
-                                  <w:sz w:val="24"/>
-                                  <w:szCs w:val="24"/>
-                                  <w:lang w:val="en-US"/>
-                                </w:rPr>
-                              </w:pPr>
-                              <w:r>
-                                <w:rPr>
-                                  <w:rFonts w:hAnsi="Calibri"/>
-                                  <w:color w:val="000000" w:themeColor="text1"/>
-                                  <w:kern w:val="24"/>
-                                  <w:lang w:val="en-US"/>
-                                </w:rPr>
-                                <w:t>main</w:t>
-                              </w:r>
-                            </w:p>
-                          </w:txbxContent>
-                        </wps:txbx>
-                        <wps:bodyPr lIns="0" tIns="0" rIns="0" bIns="0" rtlCol="0" anchor="ctr"/>
-                      </wps:wsp>
-                    </wpg:wgp>
-                  </a:graphicData>
-                </a:graphic>
-              </wp:inline>
-            </w:drawing>
-          </mc:Choice>
-          <mc:Fallback>
-            <w:pict>
-              <v:group w14:anchorId="504EC4C4" id="Group 1" o:spid="_x0000_s1106" style="width:235.9pt;height:45.3pt;mso-position-horizontal-relative:char;mso-position-vertical-relative:line" coordorigin=",10472" coordsize="37449,7194" o:gfxdata="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">
-                <v:oval id="Oval 2" o:spid="_x0000_s1107" style="position:absolute;left:5518;top:14447;width:3148;height:3148;visibility:visible;mso-wrap-style:square;v-text-anchor:middle" o:gfxdata="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" fillcolor="#ffbc57" strokecolor="#ed7d31 [3205]" strokeweight="2.25pt">
-                  <v:stroke joinstyle="miter"/>
-                  <v:path arrowok="t"/>
-                  <o:lock v:ext="edit" aspectratio="t"/>
-                  <v:textbox inset=",0,,0"/>
-                </v:oval>
-                <v:line id="Straight Connector 3" o:spid="_x0000_s1108" style="position:absolute;flip:y;visibility:visible;mso-wrap-style:square" from="8666,16012" to="10547,16021" o:connectortype="straight" o:gfxdata="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" strokecolor="#ed7d31 [3205]" strokeweight="3pt">
-                  <v:stroke joinstyle="miter"/>
-                  <o:lock v:ext="edit" shapetype="f"/>
-                </v:line>
-                <v:oval id="Oval 4" o:spid="_x0000_s1109" style="position:absolute;top:14494;width:3147;height:3148;visibility:visible;mso-wrap-style:square;v-text-anchor:middle" o:gfxdata="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" fillcolor="#ffbc57" strokecolor="#ed7d31 [3205]" strokeweight="2.25pt">
-                  <v:stroke joinstyle="miter"/>
-                  <v:path arrowok="t"/>
-                  <o:lock v:ext="edit" aspectratio="t"/>
-                  <v:textbox inset=",0,,0"/>
-                </v:oval>
-                <v:line id="Straight Connector 5" o:spid="_x0000_s1110" style="position:absolute;flip:y;visibility:visible;mso-wrap-style:square" from="19227,16019" to="21707,16032" o:connectortype="straight" o:gfxdata="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" strokecolor="#ed7d31 [3205]" strokeweight="3pt">
-                  <v:stroke joinstyle="miter"/>
-                  <o:lock v:ext="edit" shapetype="f"/>
-                </v:line>
-                <v:oval id="Oval 6" o:spid="_x0000_s1111" style="position:absolute;left:10547;top:14358;width:3148;height:3308;visibility:visible;mso-wrap-style:square;v-text-anchor:middle" o:gfxdata="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" fillcolor="#ffbc57" strokecolor="#ed7d31 [3205]" strokeweight="2.25pt">
-                  <v:stroke joinstyle="miter"/>
-                  <v:path arrowok="t"/>
-                  <o:lock v:ext="edit" aspectratio="t"/>
-                  <v:textbox inset=",0,,0"/>
-                </v:oval>
-                <v:oval id="Oval 7" o:spid="_x0000_s1112" style="position:absolute;left:16079;top:14481;width:3148;height:3101;visibility:visible;mso-wrap-style:square;v-text-anchor:middle" o:gfxdata="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" fillcolor="#ffbc57" strokecolor="#ed7d31 [3205]" strokeweight="2.25pt">
-                  <v:stroke joinstyle="miter"/>
-                  <v:path arrowok="t"/>
-                  <o:lock v:ext="edit" aspectratio="t"/>
-                  <v:textbox inset=",0,,0"/>
-                </v:oval>
-                <v:oval id="Oval 47" o:spid="_x0000_s1113" style="position:absolute;left:33102;top:14519;width:3148;height:3148;visibility:visible;mso-wrap-style:square;v-text-anchor:middle" o:gfxdata="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" fillcolor="#ffbc57" strokecolor="#ed7d31 [3205]" strokeweight="2.25pt">
-                  <v:stroke joinstyle="miter"/>
-                  <v:path arrowok="t"/>
-                  <o:lock v:ext="edit" aspectratio="t"/>
-                  <v:textbox inset=",0,,0"/>
-                </v:oval>
-                <v:oval id="Oval 53" o:spid="_x0000_s1114" style="position:absolute;left:21597;top:14519;width:3148;height:3148;visibility:visible;mso-wrap-style:square;v-text-anchor:middle" o:gfxdata="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" fillcolor="#5b9bd5 [3208]" strokecolor="#2f5496 [2404]" strokeweight="2.25pt">
-                  <v:stroke joinstyle="miter"/>
-                  <v:path arrowok="t"/>
-                  <o:lock v:ext="edit" aspectratio="t"/>
-                  <v:textbox inset=",0,,0"/>
-                </v:oval>
-                <v:oval id="Oval 56" o:spid="_x0000_s1115" style="position:absolute;left:27396;top:14519;width:3148;height:3148;visibility:visible;mso-wrap-style:square;v-text-anchor:middle" o:gfxdata="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" fillcolor="#5b9bd5 [3208]" strokecolor="#2f5496 [2404]" strokeweight="2.25pt">
-                  <v:stroke joinstyle="miter"/>
-                  <v:path arrowok="t"/>
-                  <o:lock v:ext="edit" aspectratio="t"/>
-                  <v:textbox inset=",0,,0"/>
-                </v:oval>
-                <v:line id="Straight Connector 57" o:spid="_x0000_s1116" style="position:absolute;visibility:visible;mso-wrap-style:square" from="13695,16012" to="16079,16032" o:connectortype="straight" o:gfxdata="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" strokecolor="#ed7d31 [3205]" strokeweight="3pt">
-                  <v:stroke joinstyle="miter"/>
-                  <o:lock v:ext="edit" shapetype="f"/>
-                </v:line>
-                <v:shape id="Down Arrow Callout 59" o:spid="_x0000_s1117" type="#_x0000_t80" style="position:absolute;left:32041;top:10472;width:5408;height:3608;visibility:visible;mso-wrap-style:square;v-text-anchor:middle" o:gfxdata="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" adj="14035,7197,16200,8998" fillcolor="#ffc261" strokecolor="#181818 [486]" strokeweight="1pt">
-                  <v:textbox inset="0,0,0,0">
-                    <w:txbxContent>
-                      <w:p>
-                        <w:pPr>
-                          <w:spacing w:after="0"/>
-                          <w:jc w:val="center"/>
-                          <w:rPr>
-                            <w:rFonts w:hAnsi="Calibri"/>
-                            <w:color w:val="000000" w:themeColor="text1"/>
-                            <w:kern w:val="24"/>
-                            <w:sz w:val="24"/>
-                            <w:szCs w:val="24"/>
-                            <w:lang w:val="en-US"/>
-                          </w:rPr>
-                        </w:pPr>
-                        <w:r>
-                          <w:rPr>
-                            <w:rFonts w:hAnsi="Calibri"/>
-                            <w:color w:val="000000" w:themeColor="text1"/>
-                            <w:kern w:val="24"/>
-                            <w:lang w:val="en-US"/>
-                          </w:rPr>
-                          <w:t>main</w:t>
-                        </w:r>
-                      </w:p>
-                    </w:txbxContent>
-                  </v:textbox>
-                </v:shape>
-                <w10:anchorlock/>
-              </v:group>
-            </w:pict>
-          </mc:Fallback>
-        </mc:AlternateContent>
+        <w:t>.</w:t>
+      </w:r>
+      <w:r>
+        <w:rPr>
+          <w:rFonts w:ascii="Calibri" w:hAnsi="Calibri" w:cs="Calibri"/>
+          <w:sz w:val="22"/>
+          <w:szCs w:val="22"/>
+        </w:rPr>
+        <w:t xml:space="preserve"> </w:t>
+      </w:r>
+      <w:r>
+        <w:rPr>
+          <w:rFonts w:ascii="Calibri" w:hAnsi="Calibri" w:cs="Calibri"/>
+          <w:sz w:val="22"/>
+          <w:szCs w:val="22"/>
+        </w:rPr>
+        <w:t xml:space="preserve">This just </w:t>
+      </w:r>
+      <w:r>
+        <w:rPr>
+          <w:rFonts w:ascii="Calibri" w:hAnsi="Calibri" w:cs="Calibri"/>
+          <w:sz w:val="22"/>
+          <w:szCs w:val="22"/>
+        </w:rPr>
+        <w:t xml:space="preserve">deletes the </w:t>
+      </w:r>
+      <w:r>
+        <w:rPr>
+          <w:rFonts w:ascii="Calibri" w:hAnsi="Calibri" w:cs="Calibri"/>
+          <w:sz w:val="22"/>
+          <w:szCs w:val="22"/>
+        </w:rPr>
+        <w:t xml:space="preserve">pointer </w:t>
+      </w:r>
+      <w:r>
+        <w:rPr>
+          <w:rFonts w:ascii="Calibri" w:hAnsi="Calibri" w:cs="Calibri"/>
+          <w:sz w:val="22"/>
+          <w:szCs w:val="22"/>
+        </w:rPr>
+        <w:t>to the branch.</w:t>
+      </w:r>
+      <w:r>
+        <w:rPr>
+          <w:rFonts w:ascii="Calibri" w:hAnsi="Calibri" w:cs="Calibri"/>
+          <w:sz w:val="22"/>
+          <w:szCs w:val="22"/>
+        </w:rPr>
+        <w:t xml:space="preserve"> All the commits are </w:t>
+      </w:r>
+      <w:r>
+        <w:rPr>
+          <w:rFonts w:ascii="Calibri" w:hAnsi="Calibri" w:cs="Calibri"/>
+          <w:sz w:val="22"/>
+          <w:szCs w:val="22"/>
+        </w:rPr>
+        <w:t>now part of main.</w:t>
       </w:r>
     </w:p>
     <w:p>
       <w:pPr>
-        <w:pStyle w:val="Heading2"/>
-      </w:pPr>
-      <w:r>
-        <w:lastRenderedPageBreak/>
-        <w:t>GitHub: collaborati</w:t>
-      </w:r>
-      <w:r>
-        <w:t>ng</w:t>
-      </w:r>
-      <w:r>
-        <w:t xml:space="preserve"> using branches and pull requests</w:t>
-      </w:r>
+        <w:pStyle w:val="NormalWeb"/>
+        <w:spacing w:before="0" w:beforeAutospacing="0" w:after="0" w:afterAutospacing="0"/>
+        <w:rPr>
+          <w:rFonts w:ascii="Calibri" w:hAnsi="Calibri" w:cs="Calibri"/>
+          <w:sz w:val="22"/>
+          <w:szCs w:val="22"/>
+        </w:rPr>
+      </w:pPr>
     </w:p>
     <w:p>
-      <w:r>
-        <w:t>The course PowerPoint presentation contains a series of animated slides illustrating how colleagues can use GitHub to work simultaneously o</w:t>
-      </w:r>
-      <w:r>
-        <w:t xml:space="preserve">n a project and synchronise their work. If you are working through the course on your own, </w:t>
-      </w:r>
-      <w:r>
-        <w:t>see</w:t>
-      </w:r>
-      <w:r>
-        <w:t xml:space="preserve"> the</w:t>
-      </w:r>
-      <w:r>
-        <w:t xml:space="preserve"> </w:t>
-      </w:r>
-      <w:r>
-        <w:t>presenter notes</w:t>
-      </w:r>
-      <w:r>
-        <w:t xml:space="preserve"> </w:t>
-      </w:r>
-      <w:r>
-        <w:t>below the slides</w:t>
-      </w:r>
-      <w:r>
-        <w:t xml:space="preserve"> for a</w:t>
-      </w:r>
-      <w:r>
-        <w:t xml:space="preserve"> full description</w:t>
-      </w:r>
-      <w:r>
-        <w:t>.</w:t>
-      </w:r>
+      <w:pPr>
+        <w:pStyle w:val="NormalWeb"/>
+        <w:spacing w:before="0" w:beforeAutospacing="0" w:after="0" w:afterAutospacing="0"/>
+        <w:rPr>
+          <w:rFonts w:ascii="Calibri" w:hAnsi="Calibri" w:cs="Calibri"/>
+          <w:sz w:val="22"/>
+          <w:szCs w:val="22"/>
+        </w:rPr>
+      </w:pPr>
     </w:p>
     <w:p>
       <w:pPr>
-        <w:pStyle w:val="NormalWeb"/>
-        <w:spacing w:before="0" w:beforeAutospacing="0" w:after="160" w:afterAutospacing="0"/>
-        <w:rPr>
-          <w:rFonts w:ascii="Calibri" w:hAnsi="Calibri" w:cs="Calibri"/>
-          <w:b/>
-          <w:bCs/>
-          <w:sz w:val="28"/>
-          <w:szCs w:val="28"/>
-        </w:rPr>
-      </w:pPr>
-      <w:r>
-        <w:rPr>
-          <w:rFonts w:ascii="Calibri" w:hAnsi="Calibri" w:cs="Calibri"/>
-          <w:b/>
-          <w:bCs/>
+        <w:pStyle w:val="Heading2"/>
+      </w:pPr>
+      <w:r>
+        <w:t>GitHub: collaborati</w:t>
+      </w:r>
+      <w:r>
+        <w:t>ng</w:t>
+      </w:r>
+      <w:r>
+        <w:t xml:space="preserve"> using branches and pull requests</w:t>
+      </w:r>
+    </w:p>
+    <w:p>
+      <w:r>
+        <w:t>The course PowerPoint presentation contains a series of animated slides illustrating how colleagues can use GitHub to work simultaneously o</w:t>
+      </w:r>
+      <w:r>
+        <w:t xml:space="preserve">n a project and synchronise their work. If you are working through the course on your own, </w:t>
+      </w:r>
+      <w:r>
+        <w:t>see</w:t>
+      </w:r>
+      <w:r>
+        <w:t xml:space="preserve"> the</w:t>
+      </w:r>
+      <w:r>
+        <w:t xml:space="preserve"> </w:t>
+      </w:r>
+      <w:r>
+        <w:t>presenter notes</w:t>
+      </w:r>
+      <w:r>
+        <w:t xml:space="preserve"> </w:t>
+      </w:r>
+      <w:r>
+        <w:t>below the slides</w:t>
+      </w:r>
+      <w:r>
+        <w:t xml:space="preserve"> for a</w:t>
+      </w:r>
+      <w:r>
+        <w:t xml:space="preserve"> full description</w:t>
+      </w:r>
+      <w:r>
+        <w:t>.</w:t>
+      </w:r>
+    </w:p>
+    <w:p>
+      <w:r>
+        <w:rPr>
           <w:noProof/>
-          <w:sz w:val="28"/>
-          <w:szCs w:val="28"/>
         </w:rPr>
         <w:drawing>
-          <wp:inline distT="0" distB="0" distL="0" distR="0" wp14:anchorId="6BA95B0B" wp14:editId="641CEA49">
-            <wp:extent cx="5731510" cy="2821305"/>
-            <wp:effectExtent l="0" t="0" r="0" b="0"/>
-            <wp:docPr id="26" name="Picture 26" descr="A diagram of a network&#10;&#10;Description automatically generated"/>
+          <wp:inline distT="0" distB="0" distL="0" distR="0" wp14:anchorId="6277254C" wp14:editId="4698EB4E">
+            <wp:extent cx="5731510" cy="2811780"/>
+            <wp:effectExtent l="0" t="0" r="2540" b="7620"/>
+            <wp:docPr id="1697703305" name="Picture 1" descr="A diagram of a network&#10;&#10;AI-generated content may be incorrect."/>
             <wp:cNvGraphicFramePr>
               <a:graphicFrameLocks xmlns:a="http://schemas.openxmlformats.org/drawingml/2006/main" noChangeAspect="1"/>
             </wp:cNvGraphicFramePr>
@@ -7249,7 +6557,7 @@
               <a:graphicData uri="http://schemas.openxmlformats.org/drawingml/2006/picture">
                 <pic:pic xmlns:pic="http://schemas.openxmlformats.org/drawingml/2006/picture">
                   <pic:nvPicPr>
-                    <pic:cNvPr id="26" name="Picture 26" descr="A diagram of a network&#10;&#10;Description automatically generated"/>
+                    <pic:cNvPr id="1697703305" name="Picture 1" descr="A diagram of a network&#10;&#10;AI-generated content may be incorrect."/>
                     <pic:cNvPicPr/>
                   </pic:nvPicPr>
                   <pic:blipFill>
@@ -7267,7 +6575,7 @@
                   <pic:spPr>
                     <a:xfrm>
                       <a:off x="0" y="0"/>
-                      <a:ext cx="5731510" cy="2821305"/>
+                      <a:ext cx="5731510" cy="2811780"/>
                     </a:xfrm>
                     <a:prstGeom prst="rect">
                       <a:avLst/>
@@ -7434,15 +6742,7 @@
         </w:numPr>
       </w:pPr>
       <w:r>
-        <w:t xml:space="preserve">Create a new branch, edit some </w:t>
-      </w:r>
-      <w:proofErr w:type="gramStart"/>
-      <w:r>
-        <w:t>files</w:t>
-      </w:r>
-      <w:proofErr w:type="gramEnd"/>
-      <w:r>
-        <w:t xml:space="preserve"> and make some commits</w:t>
+        <w:t>Create a new branch, edit some files and make some commits</w:t>
       </w:r>
       <w:r>
         <w:t>.</w:t>
@@ -7492,11 +6792,7 @@
         <w:t>we will give some time for</w:t>
       </w:r>
       <w:r>
-        <w:t xml:space="preserve"> an </w:t>
-      </w:r>
-      <w:r>
-        <w:lastRenderedPageBreak/>
-        <w:t>exercise asking you to follow through the steps on your own to contribute some changes to t</w:t>
+        <w:t xml:space="preserve"> an exercise asking you to follow through the steps on your own to contribute some changes to t</w:t>
       </w:r>
       <w:r>
         <w:t>he practice folder in the course repo.</w:t>
@@ -7859,15 +7155,7 @@
         <w:t xml:space="preserve"> in your repository.</w:t>
       </w:r>
       <w:r>
-        <w:t xml:space="preserve"> You can create, </w:t>
-      </w:r>
-      <w:proofErr w:type="gramStart"/>
-      <w:r>
-        <w:t>modify</w:t>
-      </w:r>
-      <w:proofErr w:type="gramEnd"/>
-      <w:r>
-        <w:t xml:space="preserve"> or delete files – any changes you make to the files in the project folder will be captured by Git.</w:t>
+        <w:t xml:space="preserve"> You can create, modify or delete files – any changes you make to the files in the project folder will be captured by Git.</w:t>
       </w:r>
       <w:r>
         <w:t xml:space="preserve"> For example, you could</w:t>
@@ -8236,7 +7524,6 @@
         <w:pStyle w:val="Heading2"/>
       </w:pPr>
       <w:r>
-        <w:lastRenderedPageBreak/>
         <w:t>Push the branch to GitHub, open a pull request, and merge</w:t>
       </w:r>
     </w:p>
@@ -8676,13 +7963,8 @@
       <w:r>
         <w:t xml:space="preserve"> (</w:t>
       </w:r>
-      <w:proofErr w:type="gramStart"/>
-      <w:r>
-        <w:t>e.g.</w:t>
-      </w:r>
-      <w:proofErr w:type="gramEnd"/>
-      <w:r>
-        <w:t xml:space="preserve"> main)</w:t>
+      <w:r>
+        <w:t>e.g. main)</w:t>
       </w:r>
       <w:r>
         <w:t xml:space="preserve"> and comparison branch</w:t>
@@ -8913,11 +8195,7 @@
         <w:t>repo</w:t>
       </w:r>
       <w:r>
-        <w:t xml:space="preserve">, make sure you are on the branch </w:t>
-      </w:r>
-      <w:r>
-        <w:lastRenderedPageBreak/>
-        <w:t xml:space="preserve">you want to update, in our example the main branch. Then use the pull command to update the local branch. Once </w:t>
+        <w:t xml:space="preserve">, make sure you are on the branch you want to update, in our example the main branch. Then use the pull command to update the local branch. Once </w:t>
       </w:r>
       <w:r>
         <w:t>the</w:t>
@@ -9580,7 +8858,6 @@
         <w:pStyle w:val="Heading1"/>
       </w:pPr>
       <w:r>
-        <w:lastRenderedPageBreak/>
         <w:t>Advanced topics</w:t>
       </w:r>
     </w:p>
@@ -9632,81 +8909,171 @@
         <w:t xml:space="preserve"> your most recent commit – provided you haven’t pushed it to GitHub.</w:t>
       </w:r>
       <w:r>
-        <w:t xml:space="preserve"> It is easiest to not edit an earlier commit than that, or a commit you have already pushed to GitHub.</w:t>
+        <w:t xml:space="preserve"> </w:t>
+      </w:r>
+      <w:r>
+        <w:t>There are more advanced options for editing</w:t>
+      </w:r>
+      <w:r>
+        <w:t xml:space="preserve"> </w:t>
+      </w:r>
+      <w:r>
+        <w:t xml:space="preserve">commits further </w:t>
+      </w:r>
+      <w:proofErr w:type="gramStart"/>
+      <w:r>
+        <w:t>back</w:t>
+      </w:r>
+      <w:r>
+        <w:t>, but</w:t>
+      </w:r>
+      <w:proofErr w:type="gramEnd"/>
+      <w:r>
+        <w:t xml:space="preserve"> shouldn’t generally be necessary.</w:t>
+      </w:r>
+      <w:r>
+        <w:t xml:space="preserve"> </w:t>
       </w:r>
     </w:p>
     <w:p>
-      <w:r>
-        <w:t xml:space="preserve">To </w:t>
-      </w:r>
-      <w:proofErr w:type="spellStart"/>
-      <w:r>
-        <w:t>unstage</w:t>
-      </w:r>
-      <w:proofErr w:type="spellEnd"/>
-      <w:r>
-        <w:t xml:space="preserve"> a file that you have staged but not yet committed, un</w:t>
-      </w:r>
-      <w:r>
-        <w:t xml:space="preserve">tick the checkbox </w:t>
-      </w:r>
-      <w:r>
-        <w:t>by the</w:t>
-      </w:r>
-      <w:r>
-        <w:t xml:space="preserve"> file</w:t>
-      </w:r>
-      <w:r>
-        <w:t>name</w:t>
-      </w:r>
-      <w:r>
-        <w:t xml:space="preserve"> in the RStudio Git pane.</w:t>
+      <w:pPr>
+        <w:rPr>
+          <w:b/>
+          <w:bCs/>
+        </w:rPr>
+      </w:pPr>
+      <w:r>
+        <w:rPr>
+          <w:b/>
+          <w:bCs/>
+        </w:rPr>
+        <w:t xml:space="preserve">Undoing changes </w:t>
+      </w:r>
+      <w:r>
+        <w:rPr>
+          <w:b/>
+          <w:bCs/>
+        </w:rPr>
+        <w:t>using</w:t>
+      </w:r>
+      <w:r>
+        <w:rPr>
+          <w:b/>
+          <w:bCs/>
+        </w:rPr>
+        <w:t xml:space="preserve"> the </w:t>
+      </w:r>
+      <w:r>
+        <w:rPr>
+          <w:b/>
+          <w:bCs/>
+        </w:rPr>
+        <w:t xml:space="preserve">RStudio graphical </w:t>
+      </w:r>
+      <w:r>
+        <w:rPr>
+          <w:b/>
+          <w:bCs/>
+        </w:rPr>
+        <w:t>user interface</w:t>
       </w:r>
     </w:p>
     <w:p>
       <w:r>
-        <w:t>I</w:t>
-      </w:r>
-      <w:r>
-        <w:t xml:space="preserve">f you want to </w:t>
-      </w:r>
-      <w:r>
-        <w:t>edit your most recent commit,</w:t>
-      </w:r>
-      <w:r>
-        <w:t xml:space="preserve"> you can </w:t>
-      </w:r>
-      <w:r>
-        <w:t>amend it</w:t>
-      </w:r>
-      <w:r>
-        <w:t xml:space="preserve"> using the RStudio interface.</w:t>
-      </w:r>
-      <w:r>
-        <w:t xml:space="preserve"> </w:t>
-      </w:r>
-      <w:r>
-        <w:t>Make the changes you want</w:t>
-      </w:r>
-      <w:r>
-        <w:t>, stage them, and click on “commit”</w:t>
-      </w:r>
-      <w:r>
-        <w:t xml:space="preserve">, </w:t>
-      </w:r>
-      <w:r>
-        <w:t>but before typing a commit message, tick the “Amend previous commit” checkbox.</w:t>
+        <w:t xml:space="preserve">To </w:t>
+      </w:r>
+      <w:proofErr w:type="spellStart"/>
+      <w:r>
+        <w:t>unstage</w:t>
+      </w:r>
+      <w:proofErr w:type="spellEnd"/>
+      <w:r>
+        <w:t xml:space="preserve"> a file that you have staged but not yet committed, un</w:t>
+      </w:r>
+      <w:r>
+        <w:t xml:space="preserve">tick the checkbox </w:t>
+      </w:r>
+      <w:r>
+        <w:t>by the</w:t>
+      </w:r>
+      <w:r>
+        <w:t xml:space="preserve"> file</w:t>
+      </w:r>
+      <w:r>
+        <w:t>name</w:t>
+      </w:r>
+      <w:r>
+        <w:t xml:space="preserve"> in the RStudio Git pane.</w:t>
       </w:r>
     </w:p>
     <w:p>
       <w:r>
-        <w:t xml:space="preserve">The terminal commands for </w:t>
-      </w:r>
-      <w:r>
-        <w:t>resetting changes include</w:t>
-      </w:r>
-      <w:r>
-        <w:t>:</w:t>
+        <w:t>To</w:t>
+      </w:r>
+      <w:r>
+        <w:t xml:space="preserve"> </w:t>
+      </w:r>
+      <w:r>
+        <w:t xml:space="preserve">amend </w:t>
+      </w:r>
+      <w:r>
+        <w:t xml:space="preserve">the </w:t>
+      </w:r>
+      <w:r>
+        <w:t>previous</w:t>
+      </w:r>
+      <w:r>
+        <w:t xml:space="preserve"> commit</w:t>
+      </w:r>
+      <w:r>
+        <w:t xml:space="preserve">, </w:t>
+      </w:r>
+      <w:r>
+        <w:t xml:space="preserve">stage </w:t>
+      </w:r>
+      <w:r>
+        <w:t>the changes you want</w:t>
+      </w:r>
+      <w:r>
+        <w:t xml:space="preserve"> to make</w:t>
+      </w:r>
+      <w:r>
+        <w:t xml:space="preserve"> and click on “commit”</w:t>
+      </w:r>
+      <w:r>
+        <w:t xml:space="preserve">, </w:t>
+      </w:r>
+      <w:r>
+        <w:t>but before typing a commit message, tick the “Amend previous commit” checkbox.</w:t>
+      </w:r>
+    </w:p>
+    <w:p>
+      <w:pPr>
+        <w:rPr>
+          <w:b/>
+          <w:bCs/>
+        </w:rPr>
+      </w:pPr>
+      <w:r>
+        <w:rPr>
+          <w:b/>
+          <w:bCs/>
+        </w:rPr>
+        <w:t xml:space="preserve">Undoing changes </w:t>
+      </w:r>
+      <w:r>
+        <w:rPr>
+          <w:b/>
+          <w:bCs/>
+        </w:rPr>
+        <w:t>using</w:t>
+      </w:r>
+      <w:r>
+        <w:rPr>
+          <w:b/>
+          <w:bCs/>
+        </w:rPr>
+        <w:t xml:space="preserve"> terminal commands</w:t>
       </w:r>
     </w:p>
     <w:p>
@@ -9714,50 +9081,39 @@
         <w:pStyle w:val="ListParagraph"/>
         <w:numPr>
           <w:ilvl w:val="0"/>
-          <w:numId w:val="4"/>
+          <w:numId w:val="116"/>
         </w:numPr>
       </w:pPr>
-      <w:r>
-        <w:rPr>
-          <w:rStyle w:val="CodeChar"/>
-        </w:rPr>
-        <w:t>g</w:t>
-      </w:r>
-      <w:r>
-        <w:rPr>
-          <w:rStyle w:val="CodeChar"/>
-        </w:rPr>
-        <w:t xml:space="preserve">it </w:t>
-      </w:r>
-      <w:r>
-        <w:rPr>
-          <w:rStyle w:val="CodeChar"/>
-        </w:rPr>
-        <w:t>reset</w:t>
-      </w:r>
-      <w:r>
-        <w:t>, which</w:t>
-      </w:r>
-      <w:r>
-        <w:t xml:space="preserve"> can be used to </w:t>
-      </w:r>
-      <w:r>
-        <w:t>reset the staging area</w:t>
-      </w:r>
-      <w:r>
-        <w:t xml:space="preserve"> (</w:t>
-      </w:r>
-      <w:r>
-        <w:t xml:space="preserve">but </w:t>
-      </w:r>
-      <w:r>
-        <w:t xml:space="preserve">can also be used to undo </w:t>
-      </w:r>
-      <w:r>
-        <w:t>commits</w:t>
-      </w:r>
-      <w:r>
-        <w:t>)</w:t>
+      <w:proofErr w:type="spellStart"/>
+      <w:r>
+        <w:t>Unstage</w:t>
+      </w:r>
+      <w:proofErr w:type="spellEnd"/>
+      <w:r>
+        <w:t xml:space="preserve"> everything (keeps your files as they are, just clears the staging area):</w:t>
+      </w:r>
+    </w:p>
+    <w:p>
+      <w:pPr>
+        <w:rPr>
+          <w:rFonts w:ascii="Consolas" w:hAnsi="Consolas"/>
+        </w:rPr>
+      </w:pPr>
+      <w:r>
+        <w:tab/>
+      </w:r>
+      <w:r>
+        <w:rPr>
+          <w:rFonts w:ascii="Consolas" w:hAnsi="Consolas"/>
+          <w:highlight w:val="lightGray"/>
+        </w:rPr>
+        <w:t>git reset</w:t>
+      </w:r>
+      <w:r>
+        <w:rPr>
+          <w:rFonts w:ascii="Consolas" w:hAnsi="Consolas"/>
+        </w:rPr>
+        <w:t xml:space="preserve"> </w:t>
       </w:r>
     </w:p>
     <w:p>
@@ -9765,65 +9121,34 @@
         <w:pStyle w:val="ListParagraph"/>
         <w:numPr>
           <w:ilvl w:val="0"/>
-          <w:numId w:val="4"/>
+          <w:numId w:val="116"/>
         </w:numPr>
       </w:pPr>
       <w:r>
-        <w:rPr>
-          <w:rStyle w:val="CodeChar"/>
-        </w:rPr>
-        <w:t>g</w:t>
-      </w:r>
-      <w:r>
-        <w:rPr>
-          <w:rStyle w:val="CodeChar"/>
-        </w:rPr>
-        <w:t xml:space="preserve">it commit </w:t>
-      </w:r>
-      <w:r>
-        <w:rPr>
-          <w:rStyle w:val="CodeChar"/>
-        </w:rPr>
-        <w:t>--</w:t>
-      </w:r>
-      <w:r>
-        <w:rPr>
-          <w:rStyle w:val="CodeChar"/>
-        </w:rPr>
-        <w:t>ame</w:t>
-      </w:r>
-      <w:r>
-        <w:rPr>
-          <w:rStyle w:val="CodeChar"/>
-        </w:rPr>
-        <w:t>nd</w:t>
-      </w:r>
-      <w:r>
-        <w:t xml:space="preserve"> allows you to</w:t>
-      </w:r>
-      <w:r>
-        <w:t xml:space="preserve"> amend the </w:t>
-      </w:r>
-      <w:r>
-        <w:t>previous commit by</w:t>
-      </w:r>
-      <w:r>
-        <w:t xml:space="preserve"> add</w:t>
-      </w:r>
-      <w:r>
-        <w:t>ing</w:t>
-      </w:r>
-      <w:r>
+        <w:t>Amend the previous commit (add the staged changes to the previous commit – only do this if not pushed)</w:t>
+      </w:r>
+    </w:p>
+    <w:p>
+      <w:pPr>
+        <w:rPr>
+          <w:rFonts w:ascii="Consolas" w:hAnsi="Consolas"/>
+        </w:rPr>
+      </w:pPr>
+      <w:r>
+        <w:tab/>
+      </w:r>
+      <w:r>
+        <w:rPr>
+          <w:rFonts w:ascii="Consolas" w:hAnsi="Consolas"/>
+          <w:highlight w:val="lightGray"/>
+        </w:rPr>
+        <w:t>git commit --amend</w:t>
+      </w:r>
+      <w:r>
+        <w:rPr>
+          <w:rFonts w:ascii="Consolas" w:hAnsi="Consolas"/>
+        </w:rPr>
         <w:t xml:space="preserve"> </w:t>
-      </w:r>
-      <w:r>
-        <w:t>new</w:t>
-      </w:r>
-      <w:r>
-        <w:t xml:space="preserve"> staged changes</w:t>
-      </w:r>
-      <w:r>
-        <w:t>.</w:t>
       </w:r>
     </w:p>
     <w:p>
@@ -9831,127 +9156,68 @@
         <w:pStyle w:val="ListParagraph"/>
         <w:numPr>
           <w:ilvl w:val="0"/>
-          <w:numId w:val="4"/>
+          <w:numId w:val="116"/>
         </w:numPr>
       </w:pPr>
-      <w:proofErr w:type="gramStart"/>
-      <w:r>
-        <w:rPr>
-          <w:rStyle w:val="CodeChar"/>
-        </w:rPr>
-        <w:t>g</w:t>
-      </w:r>
-      <w:r>
-        <w:rPr>
-          <w:rStyle w:val="CodeChar"/>
-        </w:rPr>
-        <w:t>it</w:t>
-      </w:r>
-      <w:proofErr w:type="gramEnd"/>
-      <w:r>
-        <w:rPr>
-          <w:rStyle w:val="CodeChar"/>
-        </w:rPr>
-        <w:t xml:space="preserve"> revert</w:t>
-      </w:r>
-      <w:r>
-        <w:t>, to</w:t>
-      </w:r>
-      <w:r>
-        <w:t xml:space="preserve"> make a commit that reverses a previous commit</w:t>
+      <w:r>
+        <w:t>Revert the previous commit (creates a new commit that undoes it - safe if you already pushed)</w:t>
       </w:r>
     </w:p>
     <w:p>
-      <w:r>
-        <w:t>The details of using those</w:t>
-      </w:r>
-      <w:r>
-        <w:t xml:space="preserve"> commands </w:t>
-      </w:r>
-      <w:r>
-        <w:t>are</w:t>
-      </w:r>
-      <w:r>
-        <w:t xml:space="preserve"> </w:t>
-      </w:r>
-      <w:r>
-        <w:t>beyond the scope of this course</w:t>
-      </w:r>
-      <w:r>
-        <w:t xml:space="preserve">. </w:t>
-      </w:r>
-      <w:r>
-        <w:t>There are links to s</w:t>
-      </w:r>
-      <w:r>
-        <w:t>ome resources</w:t>
-      </w:r>
-      <w:r>
-        <w:t xml:space="preserve"> in section </w:t>
-      </w:r>
-      <w:r>
-        <w:t>7</w:t>
-      </w:r>
-      <w:r>
-        <w:t>.</w:t>
+      <w:pPr>
+        <w:rPr>
+          <w:rFonts w:ascii="Consolas" w:hAnsi="Consolas"/>
+        </w:rPr>
+      </w:pPr>
+      <w:r>
+        <w:tab/>
+      </w:r>
+      <w:proofErr w:type="gramStart"/>
+      <w:r>
+        <w:rPr>
+          <w:rFonts w:ascii="Consolas" w:hAnsi="Consolas"/>
+          <w:highlight w:val="lightGray"/>
+        </w:rPr>
+        <w:t>git</w:t>
+      </w:r>
+      <w:proofErr w:type="gramEnd"/>
+      <w:r>
+        <w:rPr>
+          <w:rFonts w:ascii="Consolas" w:hAnsi="Consolas"/>
+          <w:highlight w:val="lightGray"/>
+        </w:rPr>
+        <w:t xml:space="preserve"> revert HEAD</w:t>
       </w:r>
     </w:p>
     <w:p>
-      <w:pPr>
-        <w:pStyle w:val="Heading2"/>
-      </w:pPr>
-      <w:r>
-        <w:t xml:space="preserve">Merge conflicts </w:t>
+      <w:r>
+        <w:t>There are links to s</w:t>
+      </w:r>
+      <w:r>
+        <w:t>ome resources</w:t>
+      </w:r>
+      <w:r>
+        <w:t xml:space="preserve"> </w:t>
+      </w:r>
+      <w:r>
+        <w:t>describing more advanced options</w:t>
+      </w:r>
+      <w:r>
+        <w:t xml:space="preserve"> in section </w:t>
+      </w:r>
+      <w:r>
+        <w:t>7</w:t>
+      </w:r>
+      <w:r>
+        <w:t>.</w:t>
       </w:r>
     </w:p>
     <w:p>
       <w:pPr>
-        <w:spacing w:after="158"/>
-        <w:rPr>
-          <w:rFonts w:eastAsiaTheme="minorEastAsia"/>
-        </w:rPr>
-      </w:pPr>
-      <w:r>
-        <w:rPr>
-          <w:rFonts w:eastAsiaTheme="minorEastAsia"/>
-        </w:rPr>
-        <w:t xml:space="preserve">Git </w:t>
-      </w:r>
-      <w:r>
-        <w:rPr>
-          <w:rFonts w:eastAsiaTheme="minorEastAsia"/>
-        </w:rPr>
-        <w:t>can normally</w:t>
-      </w:r>
-      <w:r>
-        <w:rPr>
-          <w:rFonts w:eastAsiaTheme="minorEastAsia"/>
-        </w:rPr>
-        <w:t xml:space="preserve"> </w:t>
-      </w:r>
-      <w:r>
-        <w:rPr>
-          <w:rFonts w:eastAsiaTheme="minorEastAsia"/>
-        </w:rPr>
-        <w:t>handle the process of merging changes made in different branches</w:t>
-      </w:r>
-      <w:r>
-        <w:rPr>
-          <w:rFonts w:eastAsiaTheme="minorEastAsia"/>
-        </w:rPr>
-        <w:t xml:space="preserve"> automatically. However, if two branches have made changes to the same lines of code, Git does not know which change to accept, and will</w:t>
-      </w:r>
-      <w:r>
-        <w:rPr>
-          <w:rFonts w:eastAsiaTheme="minorEastAsia"/>
-        </w:rPr>
-        <w:t xml:space="preserve"> inform the </w:t>
-      </w:r>
-      <w:r>
-        <w:rPr>
-          <w:rFonts w:eastAsiaTheme="minorEastAsia"/>
-        </w:rPr>
-        <w:t>user that there is a merge conflict that must be resolved manually before the merge can complete.</w:t>
+        <w:pStyle w:val="Heading2"/>
+      </w:pPr>
+      <w:r>
+        <w:t xml:space="preserve">Merge conflicts </w:t>
       </w:r>
     </w:p>
     <w:p>
@@ -9965,36 +9231,86 @@
         <w:rPr>
           <w:rFonts w:eastAsiaTheme="minorEastAsia"/>
         </w:rPr>
-        <w:t xml:space="preserve">Git will </w:t>
+        <w:t xml:space="preserve">Git </w:t>
       </w:r>
       <w:r>
         <w:rPr>
           <w:rFonts w:eastAsiaTheme="minorEastAsia"/>
         </w:rPr>
-        <w:t>add the changes from both branches to the file containing the conflict</w:t>
+        <w:t>can normally</w:t>
       </w:r>
       <w:r>
         <w:rPr>
           <w:rFonts w:eastAsiaTheme="minorEastAsia"/>
         </w:rPr>
-        <w:t>, surrounded by</w:t>
+        <w:t xml:space="preserve"> </w:t>
       </w:r>
       <w:r>
         <w:rPr>
           <w:rFonts w:eastAsiaTheme="minorEastAsia"/>
         </w:rPr>
-        <w:t xml:space="preserve"> conflict markers</w:t>
+        <w:t>handle the process of merging changes made in different branches</w:t>
       </w:r>
       <w:r>
         <w:rPr>
           <w:rFonts w:eastAsiaTheme="minorEastAsia"/>
         </w:rPr>
-        <w:t xml:space="preserve"> as shown below.</w:t>
+        <w:t xml:space="preserve"> automatically. However, if two branches have made changes to the same lines of code, Git does not know which change to accept, and will</w:t>
+      </w:r>
+      <w:r>
+        <w:rPr>
+          <w:rFonts w:eastAsiaTheme="minorEastAsia"/>
+        </w:rPr>
+        <w:t xml:space="preserve"> inform the </w:t>
+      </w:r>
+      <w:r>
+        <w:rPr>
+          <w:rFonts w:eastAsiaTheme="minorEastAsia"/>
+        </w:rPr>
+        <w:t>user that there is a merge conflict that must be resolved manually before the merge can complete.</w:t>
       </w:r>
     </w:p>
     <w:p>
       <w:pPr>
         <w:spacing w:after="158"/>
+        <w:rPr>
+          <w:rFonts w:eastAsiaTheme="minorEastAsia"/>
+        </w:rPr>
+      </w:pPr>
+      <w:r>
+        <w:rPr>
+          <w:rFonts w:eastAsiaTheme="minorEastAsia"/>
+        </w:rPr>
+        <w:t xml:space="preserve">Git will </w:t>
+      </w:r>
+      <w:r>
+        <w:rPr>
+          <w:rFonts w:eastAsiaTheme="minorEastAsia"/>
+        </w:rPr>
+        <w:t>add the changes from both branches to the file containing the conflict</w:t>
+      </w:r>
+      <w:r>
+        <w:rPr>
+          <w:rFonts w:eastAsiaTheme="minorEastAsia"/>
+        </w:rPr>
+        <w:t>, surrounded by</w:t>
+      </w:r>
+      <w:r>
+        <w:rPr>
+          <w:rFonts w:eastAsiaTheme="minorEastAsia"/>
+        </w:rPr>
+        <w:t xml:space="preserve"> conflict markers</w:t>
+      </w:r>
+      <w:r>
+        <w:rPr>
+          <w:rFonts w:eastAsiaTheme="minorEastAsia"/>
+        </w:rPr>
+        <w:t xml:space="preserve"> as shown below.</w:t>
+      </w:r>
+    </w:p>
+    <w:p>
+      <w:pPr>
+        <w:spacing w:after="158"/>
         <w:jc w:val="center"/>
         <w:rPr>
           <w:rFonts w:eastAsiaTheme="minorEastAsia"/>
@@ -10006,10 +9322,10 @@
           <w:noProof/>
         </w:rPr>
         <w:drawing>
-          <wp:inline distT="0" distB="0" distL="0" distR="0" wp14:anchorId="28D1486E" wp14:editId="2748D187">
-            <wp:extent cx="2786400" cy="936000"/>
-            <wp:effectExtent l="12700" t="12700" r="7620" b="16510"/>
-            <wp:docPr id="19" name="Picture 19" descr="A screenshot of a computer code&#10;&#10;Description automatically generated"/>
+          <wp:inline distT="0" distB="0" distL="0" distR="0" wp14:anchorId="72CD2C71" wp14:editId="06E930BF">
+            <wp:extent cx="4212000" cy="1008903"/>
+            <wp:effectExtent l="0" t="0" r="0" b="1270"/>
+            <wp:docPr id="563852228" name="Picture 1" descr="A white rectangular sign with green text&#10;&#10;AI-generated content may be incorrect."/>
             <wp:cNvGraphicFramePr>
               <a:graphicFrameLocks xmlns:a="http://schemas.openxmlformats.org/drawingml/2006/main" noChangeAspect="1"/>
             </wp:cNvGraphicFramePr>
@@ -10017,7 +9333,7 @@
               <a:graphicData uri="http://schemas.openxmlformats.org/drawingml/2006/picture">
                 <pic:pic xmlns:pic="http://schemas.openxmlformats.org/drawingml/2006/picture">
                   <pic:nvPicPr>
-                    <pic:cNvPr id="19" name="Picture 19" descr="A screenshot of a computer code&#10;&#10;Description automatically generated"/>
+                    <pic:cNvPr id="563852228" name="Picture 1" descr="A white rectangular sign with green text&#10;&#10;AI-generated content may be incorrect."/>
                     <pic:cNvPicPr/>
                   </pic:nvPicPr>
                   <pic:blipFill>
@@ -10035,16 +9351,11 @@
                   <pic:spPr>
                     <a:xfrm>
                       <a:off x="0" y="0"/>
-                      <a:ext cx="2786400" cy="936000"/>
+                      <a:ext cx="4212000" cy="1008903"/>
                     </a:xfrm>
                     <a:prstGeom prst="rect">
                       <a:avLst/>
                     </a:prstGeom>
-                    <a:ln>
-                      <a:solidFill>
-                        <a:schemeClr val="tx1"/>
-                      </a:solidFill>
-                    </a:ln>
                   </pic:spPr>
                 </pic:pic>
               </a:graphicData>
@@ -10230,11 +9541,15 @@
         <w:pStyle w:val="Heading2"/>
       </w:pPr>
       <w:r>
-        <w:lastRenderedPageBreak/>
         <w:t>Stashing changes</w:t>
       </w:r>
     </w:p>
     <w:p>
+      <w:pPr>
+        <w:rPr>
+          <w:rFonts w:cstheme="minorHAnsi"/>
+        </w:rPr>
+      </w:pPr>
       <w:r>
         <w:rPr>
           <w:rStyle w:val="CodeChar"/>
@@ -10248,7 +9563,164 @@
         <w:t>it stash</w:t>
       </w:r>
       <w:r>
-        <w:t xml:space="preserve"> is a command that temporarily stores your work without making a commit, allowing you to re-apply it later. An example where this can be useful is if you need to temporarily switch branches but aren’t ready to commit yet.</w:t>
+        <w:t xml:space="preserve"> temporarily stores your </w:t>
+      </w:r>
+      <w:r>
+        <w:t>uncommitted changes</w:t>
+      </w:r>
+      <w:r>
+        <w:t xml:space="preserve"> without making a commit, allowing you to re-apply it later. </w:t>
+      </w:r>
+      <w:r>
+        <w:t>T</w:t>
+      </w:r>
+      <w:r>
+        <w:t xml:space="preserve">his </w:t>
+      </w:r>
+      <w:r>
+        <w:t>is</w:t>
+      </w:r>
+      <w:r>
+        <w:t xml:space="preserve"> useful is if you need to switch branches but aren’t ready to commit yet.</w:t>
+      </w:r>
+      <w:r>
+        <w:t xml:space="preserve"> </w:t>
+      </w:r>
+      <w:r>
+        <w:t xml:space="preserve">Sometimes </w:t>
+      </w:r>
+      <w:r>
+        <w:t xml:space="preserve">Git won’t let you </w:t>
+      </w:r>
+      <w:r>
+        <w:t xml:space="preserve">switch branches </w:t>
+      </w:r>
+      <w:r>
+        <w:t>if</w:t>
+      </w:r>
+      <w:r>
+        <w:t xml:space="preserve"> you have </w:t>
+      </w:r>
+      <w:r>
+        <w:t>current uncommitted changes</w:t>
+      </w:r>
+      <w:r>
+        <w:t>, because switching could replace the files you have been editing</w:t>
+      </w:r>
+      <w:r>
+        <w:t xml:space="preserve">. </w:t>
+      </w:r>
+      <w:r>
+        <w:t xml:space="preserve">If you </w:t>
+      </w:r>
+      <w:r>
+        <w:t xml:space="preserve">run </w:t>
+      </w:r>
+      <w:r>
+        <w:rPr>
+          <w:rFonts w:ascii="Consolas" w:hAnsi="Consolas" w:cs="Consolas"/>
+          <w:shd w:val="clear" w:color="auto" w:fill="E7E6E6" w:themeFill="background2"/>
+        </w:rPr>
+        <w:t xml:space="preserve">git </w:t>
+      </w:r>
+      <w:r>
+        <w:rPr>
+          <w:rFonts w:ascii="Consolas" w:hAnsi="Consolas" w:cs="Consolas"/>
+          <w:shd w:val="clear" w:color="auto" w:fill="E7E6E6" w:themeFill="background2"/>
+        </w:rPr>
+        <w:t>stash</w:t>
+      </w:r>
+      <w:r>
+        <w:rPr>
+          <w:rFonts w:cstheme="minorHAnsi"/>
+        </w:rPr>
+        <w:t>, Git saves those changes</w:t>
+      </w:r>
+      <w:r>
+        <w:rPr>
+          <w:rFonts w:cstheme="minorHAnsi"/>
+        </w:rPr>
+        <w:t xml:space="preserve"> and resets your files to match the last commit,</w:t>
+      </w:r>
+      <w:r>
+        <w:rPr>
+          <w:rFonts w:cstheme="minorHAnsi"/>
+        </w:rPr>
+        <w:t xml:space="preserve"> </w:t>
+      </w:r>
+      <w:r>
+        <w:rPr>
+          <w:rFonts w:cstheme="minorHAnsi"/>
+        </w:rPr>
+        <w:t>so</w:t>
+      </w:r>
+      <w:r>
+        <w:rPr>
+          <w:rFonts w:cstheme="minorHAnsi"/>
+        </w:rPr>
+        <w:t xml:space="preserve"> you </w:t>
+      </w:r>
+      <w:r>
+        <w:rPr>
+          <w:rFonts w:cstheme="minorHAnsi"/>
+        </w:rPr>
+        <w:t>can</w:t>
+      </w:r>
+      <w:r>
+        <w:rPr>
+          <w:rFonts w:cstheme="minorHAnsi"/>
+        </w:rPr>
+        <w:t xml:space="preserve"> switch</w:t>
+      </w:r>
+      <w:r>
+        <w:rPr>
+          <w:rFonts w:cstheme="minorHAnsi"/>
+        </w:rPr>
+        <w:t xml:space="preserve"> branches</w:t>
+      </w:r>
+      <w:r>
+        <w:rPr>
+          <w:rFonts w:cstheme="minorHAnsi"/>
+        </w:rPr>
+        <w:t>. To re-ap</w:t>
+      </w:r>
+      <w:r>
+        <w:t xml:space="preserve">ply the stashed </w:t>
+      </w:r>
+      <w:r>
+        <w:t xml:space="preserve">changes, use </w:t>
+      </w:r>
+      <w:r>
+        <w:rPr>
+          <w:rFonts w:ascii="Consolas" w:hAnsi="Consolas" w:cs="Consolas"/>
+          <w:shd w:val="clear" w:color="auto" w:fill="E7E6E6" w:themeFill="background2"/>
+        </w:rPr>
+        <w:t>git stash apply</w:t>
+      </w:r>
+      <w:r>
+        <w:rPr>
+          <w:rFonts w:cstheme="minorHAnsi"/>
+        </w:rPr>
+        <w:t xml:space="preserve">. (Alternatively, </w:t>
+      </w:r>
+      <w:r>
+        <w:rPr>
+          <w:rFonts w:ascii="Consolas" w:hAnsi="Consolas" w:cs="Consolas"/>
+          <w:shd w:val="clear" w:color="auto" w:fill="E7E6E6" w:themeFill="background2"/>
+        </w:rPr>
+        <w:t>git stash pop</w:t>
+      </w:r>
+      <w:r>
+        <w:rPr>
+          <w:rFonts w:cstheme="minorHAnsi"/>
+        </w:rPr>
+        <w:t xml:space="preserve"> </w:t>
+      </w:r>
+      <w:r>
+        <w:rPr>
+          <w:rFonts w:cstheme="minorHAnsi"/>
+        </w:rPr>
+        <w:t>is like apply but also removes the stash entry.)</w:t>
       </w:r>
     </w:p>
     <w:p>
@@ -10728,7 +10200,6 @@
         <w:pStyle w:val="Heading2"/>
       </w:pPr>
       <w:r>
-        <w:lastRenderedPageBreak/>
         <w:t>Storing data</w:t>
       </w:r>
     </w:p>
@@ -11523,7 +10994,7 @@
 </file>
 
 <file path=word/endnotes.xml><?xml version="1.0" encoding="utf-8"?>
-<w:endnotes xmlns:wpc="http://schemas.microsoft.com/office/word/2010/wordprocessingCanvas" xmlns:cx="http://schemas.microsoft.com/office/drawing/2014/chartex" xmlns:cx1="http://schemas.microsoft.com/office/drawing/2015/9/8/chartex" xmlns:cx2="http://schemas.microsoft.com/office/drawing/2015/10/21/chartex" xmlns:cx3="http://schemas.microsoft.com/office/drawing/2016/5/9/chartex" xmlns:cx4="http://schemas.microsoft.com/office/drawing/2016/5/10/chartex" xmlns:cx5="http://schemas.microsoft.com/office/drawing/2016/5/11/chartex" xmlns:cx6="http://schemas.microsoft.com/office/drawing/2016/5/12/chartex" xmlns:cx7="http://schemas.microsoft.com/office/drawing/2016/5/13/chartex" xmlns:cx8="http://schemas.microsoft.com/office/drawing/2016/5/14/chartex" xmlns:mc="http://schemas.openxmlformats.org/markup-compatibility/2006" xmlns:aink="http://schemas.microsoft.com/office/drawing/2016/ink" xmlns:am3d="http://schemas.microsoft.com/office/drawing/2017/model3d" xmlns:o="urn:schemas-microsoft-com:office:office" xmlns:oel="http://schemas.microsoft.com/office/2019/extlst" xmlns:r="http://schemas.openxmlformats.org/officeDocument/2006/relationships" xmlns:m="http://schemas.openxmlformats.org/officeDocument/2006/math" xmlns:v="urn:schemas-microsoft-com:vml" xmlns:wp14="http://schemas.microsoft.com/office/word/2010/wordprocessingDrawing" xmlns:wp="http://schemas.openxmlformats.org/drawingml/2006/wordprocessingDrawing" xmlns:w10="urn:schemas-microsoft-com:office:word" xmlns:w="http://schemas.openxmlformats.org/wordprocessingml/2006/main" xmlns:w14="http://schemas.microsoft.com/office/word/2010/wordml" xmlns:w15="http://schemas.microsoft.com/office/word/2012/wordml" xmlns:w16cex="http://schemas.microsoft.com/office/word/2018/wordml/cex" xmlns:w16cid="http://schemas.microsoft.com/office/word/2016/wordml/cid" xmlns:w16="http://schemas.microsoft.com/office/word/2018/wordml" xmlns:w16sdtdh="http://schemas.microsoft.com/office/word/2020/wordml/sdtdatahash" xmlns:w16se="http://schemas.microsoft.com/office/word/2015/wordml/symex" xmlns:wpg="http://schemas.microsoft.com/office/word/2010/wordprocessingGroup" xmlns:wpi="http://schemas.microsoft.com/office/word/2010/wordprocessingInk" xmlns:wne="http://schemas.microsoft.com/office/word/2006/wordml" xmlns:wps="http://schemas.microsoft.com/office/word/2010/wordprocessingShape" mc:Ignorable="w14 w15 w16se w16cid w16 w16cex w16sdtdh wp14">
+<w:endnotes xmlns:wpc="http://schemas.microsoft.com/office/word/2010/wordprocessingCanvas" xmlns:cx="http://schemas.microsoft.com/office/drawing/2014/chartex" xmlns:cx1="http://schemas.microsoft.com/office/drawing/2015/9/8/chartex" xmlns:cx2="http://schemas.microsoft.com/office/drawing/2015/10/21/chartex" xmlns:cx3="http://schemas.microsoft.com/office/drawing/2016/5/9/chartex" xmlns:cx4="http://schemas.microsoft.com/office/drawing/2016/5/10/chartex" xmlns:cx5="http://schemas.microsoft.com/office/drawing/2016/5/11/chartex" xmlns:cx6="http://schemas.microsoft.com/office/drawing/2016/5/12/chartex" xmlns:cx7="http://schemas.microsoft.com/office/drawing/2016/5/13/chartex" xmlns:cx8="http://schemas.microsoft.com/office/drawing/2016/5/14/chartex" xmlns:mc="http://schemas.openxmlformats.org/markup-compatibility/2006" xmlns:aink="http://schemas.microsoft.com/office/drawing/2016/ink" xmlns:am3d="http://schemas.microsoft.com/office/drawing/2017/model3d" xmlns:o="urn:schemas-microsoft-com:office:office" xmlns:oel="http://schemas.microsoft.com/office/2019/extlst" xmlns:r="http://schemas.openxmlformats.org/officeDocument/2006/relationships" xmlns:m="http://schemas.openxmlformats.org/officeDocument/2006/math" xmlns:v="urn:schemas-microsoft-com:vml" xmlns:wp14="http://schemas.microsoft.com/office/word/2010/wordprocessingDrawing" xmlns:wp="http://schemas.openxmlformats.org/drawingml/2006/wordprocessingDrawing" xmlns:w10="urn:schemas-microsoft-com:office:word" xmlns:w="http://schemas.openxmlformats.org/wordprocessingml/2006/main" xmlns:w14="http://schemas.microsoft.com/office/word/2010/wordml" xmlns:w15="http://schemas.microsoft.com/office/word/2012/wordml" xmlns:w16cex="http://schemas.microsoft.com/office/word/2018/wordml/cex" xmlns:w16cid="http://schemas.microsoft.com/office/word/2016/wordml/cid" xmlns:w16="http://schemas.microsoft.com/office/word/2018/wordml" xmlns:w16du="http://schemas.microsoft.com/office/word/2023/wordml/word16du" xmlns:w16sdtdh="http://schemas.microsoft.com/office/word/2020/wordml/sdtdatahash" xmlns:w16sdtfl="http://schemas.microsoft.com/office/word/2024/wordml/sdtformatlock" xmlns:w16se="http://schemas.microsoft.com/office/word/2015/wordml/symex" xmlns:wpg="http://schemas.microsoft.com/office/word/2010/wordprocessingGroup" xmlns:wpi="http://schemas.microsoft.com/office/word/2010/wordprocessingInk" xmlns:wne="http://schemas.microsoft.com/office/word/2006/wordml" xmlns:wps="http://schemas.microsoft.com/office/word/2010/wordprocessingShape" mc:Ignorable="w14 w15 w16se w16cid w16 w16cex w16sdtdh w16sdtfl w16du wp14">
   <w:endnote w:type="separator" w:id="-1">
     <w:p>
       <w:pPr>
@@ -11555,7 +11026,7 @@
 </file>
 
 <file path=word/footer1.xml><?xml version="1.0" encoding="utf-8"?>
-<w:ftr xmlns:wpc="http://schemas.microsoft.com/office/word/2010/wordprocessingCanvas" xmlns:cx="http://schemas.microsoft.com/office/drawing/2014/chartex" xmlns:cx1="http://schemas.microsoft.com/office/drawing/2015/9/8/chartex" xmlns:cx2="http://schemas.microsoft.com/office/drawing/2015/10/21/chartex" xmlns:cx3="http://schemas.microsoft.com/office/drawing/2016/5/9/chartex" xmlns:cx4="http://schemas.microsoft.com/office/drawing/2016/5/10/chartex" xmlns:cx5="http://schemas.microsoft.com/office/drawing/2016/5/11/chartex" xmlns:cx6="http://schemas.microsoft.com/office/drawing/2016/5/12/chartex" xmlns:cx7="http://schemas.microsoft.com/office/drawing/2016/5/13/chartex" xmlns:cx8="http://schemas.microsoft.com/office/drawing/2016/5/14/chartex" xmlns:mc="http://schemas.openxmlformats.org/markup-compatibility/2006" xmlns:aink="http://schemas.microsoft.com/office/drawing/2016/ink" xmlns:am3d="http://schemas.microsoft.com/office/drawing/2017/model3d" xmlns:o="urn:schemas-microsoft-com:office:office" xmlns:oel="http://schemas.microsoft.com/office/2019/extlst" xmlns:r="http://schemas.openxmlformats.org/officeDocument/2006/relationships" xmlns:m="http://schemas.openxmlformats.org/officeDocument/2006/math" xmlns:v="urn:schemas-microsoft-com:vml" xmlns:wp14="http://schemas.microsoft.com/office/word/2010/wordprocessingDrawing" xmlns:wp="http://schemas.openxmlformats.org/drawingml/2006/wordprocessingDrawing" xmlns:w10="urn:schemas-microsoft-com:office:word" xmlns:w="http://schemas.openxmlformats.org/wordprocessingml/2006/main" xmlns:w14="http://schemas.microsoft.com/office/word/2010/wordml" xmlns:w15="http://schemas.microsoft.com/office/word/2012/wordml" xmlns:w16cex="http://schemas.microsoft.com/office/word/2018/wordml/cex" xmlns:w16cid="http://schemas.microsoft.com/office/word/2016/wordml/cid" xmlns:w16="http://schemas.microsoft.com/office/word/2018/wordml" xmlns:w16sdtdh="http://schemas.microsoft.com/office/word/2020/wordml/sdtdatahash" xmlns:w16se="http://schemas.microsoft.com/office/word/2015/wordml/symex" xmlns:wpg="http://schemas.microsoft.com/office/word/2010/wordprocessingGroup" xmlns:wpi="http://schemas.microsoft.com/office/word/2010/wordprocessingInk" xmlns:wne="http://schemas.microsoft.com/office/word/2006/wordml" xmlns:wps="http://schemas.microsoft.com/office/word/2010/wordprocessingShape" mc:Ignorable="w14 w15 w16se w16cid w16 w16cex w16sdtdh wp14">
+<w:ftr xmlns:wpc="http://schemas.microsoft.com/office/word/2010/wordprocessingCanvas" xmlns:cx="http://schemas.microsoft.com/office/drawing/2014/chartex" xmlns:cx1="http://schemas.microsoft.com/office/drawing/2015/9/8/chartex" xmlns:cx2="http://schemas.microsoft.com/office/drawing/2015/10/21/chartex" xmlns:cx3="http://schemas.microsoft.com/office/drawing/2016/5/9/chartex" xmlns:cx4="http://schemas.microsoft.com/office/drawing/2016/5/10/chartex" xmlns:cx5="http://schemas.microsoft.com/office/drawing/2016/5/11/chartex" xmlns:cx6="http://schemas.microsoft.com/office/drawing/2016/5/12/chartex" xmlns:cx7="http://schemas.microsoft.com/office/drawing/2016/5/13/chartex" xmlns:cx8="http://schemas.microsoft.com/office/drawing/2016/5/14/chartex" xmlns:mc="http://schemas.openxmlformats.org/markup-compatibility/2006" xmlns:aink="http://schemas.microsoft.com/office/drawing/2016/ink" xmlns:am3d="http://schemas.microsoft.com/office/drawing/2017/model3d" xmlns:o="urn:schemas-microsoft-com:office:office" xmlns:oel="http://schemas.microsoft.com/office/2019/extlst" xmlns:r="http://schemas.openxmlformats.org/officeDocument/2006/relationships" xmlns:m="http://schemas.openxmlformats.org/officeDocument/2006/math" xmlns:v="urn:schemas-microsoft-com:vml" xmlns:wp14="http://schemas.microsoft.com/office/word/2010/wordprocessingDrawing" xmlns:wp="http://schemas.openxmlformats.org/drawingml/2006/wordprocessingDrawing" xmlns:w10="urn:schemas-microsoft-com:office:word" xmlns:w="http://schemas.openxmlformats.org/wordprocessingml/2006/main" xmlns:w14="http://schemas.microsoft.com/office/word/2010/wordml" xmlns:w15="http://schemas.microsoft.com/office/word/2012/wordml" xmlns:w16cex="http://schemas.microsoft.com/office/word/2018/wordml/cex" xmlns:w16cid="http://schemas.microsoft.com/office/word/2016/wordml/cid" xmlns:w16="http://schemas.microsoft.com/office/word/2018/wordml" xmlns:w16du="http://schemas.microsoft.com/office/word/2023/wordml/word16du" xmlns:w16sdtdh="http://schemas.microsoft.com/office/word/2020/wordml/sdtdatahash" xmlns:w16sdtfl="http://schemas.microsoft.com/office/word/2024/wordml/sdtformatlock" xmlns:w16se="http://schemas.microsoft.com/office/word/2015/wordml/symex" xmlns:wpg="http://schemas.microsoft.com/office/word/2010/wordprocessingGroup" xmlns:wpi="http://schemas.microsoft.com/office/word/2010/wordprocessingInk" xmlns:wne="http://schemas.microsoft.com/office/word/2006/wordml" xmlns:wps="http://schemas.microsoft.com/office/word/2010/wordprocessingShape" mc:Ignorable="w14 w15 w16se w16cid w16 w16cex w16sdtdh w16sdtfl w16du wp14">
   <w:p>
     <w:pPr>
       <w:pStyle w:val="Footer"/>
@@ -11605,7 +11076,7 @@
 </file>
 
 <file path=word/footer2.xml><?xml version="1.0" encoding="utf-8"?>
-<w:ftr xmlns:wpc="http://schemas.microsoft.com/office/word/2010/wordprocessingCanvas" xmlns:cx="http://schemas.microsoft.com/office/drawing/2014/chartex" xmlns:cx1="http://schemas.microsoft.com/office/drawing/2015/9/8/chartex" xmlns:cx2="http://schemas.microsoft.com/office/drawing/2015/10/21/chartex" xmlns:cx3="http://schemas.microsoft.com/office/drawing/2016/5/9/chartex" xmlns:cx4="http://schemas.microsoft.com/office/drawing/2016/5/10/chartex" xmlns:cx5="http://schemas.microsoft.com/office/drawing/2016/5/11/chartex" xmlns:cx6="http://schemas.microsoft.com/office/drawing/2016/5/12/chartex" xmlns:cx7="http://schemas.microsoft.com/office/drawing/2016/5/13/chartex" xmlns:cx8="http://schemas.microsoft.com/office/drawing/2016/5/14/chartex" xmlns:mc="http://schemas.openxmlformats.org/markup-compatibility/2006" xmlns:aink="http://schemas.microsoft.com/office/drawing/2016/ink" xmlns:am3d="http://schemas.microsoft.com/office/drawing/2017/model3d" xmlns:o="urn:schemas-microsoft-com:office:office" xmlns:oel="http://schemas.microsoft.com/office/2019/extlst" xmlns:r="http://schemas.openxmlformats.org/officeDocument/2006/relationships" xmlns:m="http://schemas.openxmlformats.org/officeDocument/2006/math" xmlns:v="urn:schemas-microsoft-com:vml" xmlns:wp14="http://schemas.microsoft.com/office/word/2010/wordprocessingDrawing" xmlns:wp="http://schemas.openxmlformats.org/drawingml/2006/wordprocessingDrawing" xmlns:w10="urn:schemas-microsoft-com:office:word" xmlns:w="http://schemas.openxmlformats.org/wordprocessingml/2006/main" xmlns:w14="http://schemas.microsoft.com/office/word/2010/wordml" xmlns:w15="http://schemas.microsoft.com/office/word/2012/wordml" xmlns:w16cex="http://schemas.microsoft.com/office/word/2018/wordml/cex" xmlns:w16cid="http://schemas.microsoft.com/office/word/2016/wordml/cid" xmlns:w16="http://schemas.microsoft.com/office/word/2018/wordml" xmlns:w16sdtdh="http://schemas.microsoft.com/office/word/2020/wordml/sdtdatahash" xmlns:w16se="http://schemas.microsoft.com/office/word/2015/wordml/symex" xmlns:wpg="http://schemas.microsoft.com/office/word/2010/wordprocessingGroup" xmlns:wpi="http://schemas.microsoft.com/office/word/2010/wordprocessingInk" xmlns:wne="http://schemas.microsoft.com/office/word/2006/wordml" xmlns:wps="http://schemas.microsoft.com/office/word/2010/wordprocessingShape" mc:Ignorable="w14 w15 w16se w16cid w16 w16cex w16sdtdh wp14">
+<w:ftr xmlns:wpc="http://schemas.microsoft.com/office/word/2010/wordprocessingCanvas" xmlns:cx="http://schemas.microsoft.com/office/drawing/2014/chartex" xmlns:cx1="http://schemas.microsoft.com/office/drawing/2015/9/8/chartex" xmlns:cx2="http://schemas.microsoft.com/office/drawing/2015/10/21/chartex" xmlns:cx3="http://schemas.microsoft.com/office/drawing/2016/5/9/chartex" xmlns:cx4="http://schemas.microsoft.com/office/drawing/2016/5/10/chartex" xmlns:cx5="http://schemas.microsoft.com/office/drawing/2016/5/11/chartex" xmlns:cx6="http://schemas.microsoft.com/office/drawing/2016/5/12/chartex" xmlns:cx7="http://schemas.microsoft.com/office/drawing/2016/5/13/chartex" xmlns:cx8="http://schemas.microsoft.com/office/drawing/2016/5/14/chartex" xmlns:mc="http://schemas.openxmlformats.org/markup-compatibility/2006" xmlns:aink="http://schemas.microsoft.com/office/drawing/2016/ink" xmlns:am3d="http://schemas.microsoft.com/office/drawing/2017/model3d" xmlns:o="urn:schemas-microsoft-com:office:office" xmlns:oel="http://schemas.microsoft.com/office/2019/extlst" xmlns:r="http://schemas.openxmlformats.org/officeDocument/2006/relationships" xmlns:m="http://schemas.openxmlformats.org/officeDocument/2006/math" xmlns:v="urn:schemas-microsoft-com:vml" xmlns:wp14="http://schemas.microsoft.com/office/word/2010/wordprocessingDrawing" xmlns:wp="http://schemas.openxmlformats.org/drawingml/2006/wordprocessingDrawing" xmlns:w10="urn:schemas-microsoft-com:office:word" xmlns:w="http://schemas.openxmlformats.org/wordprocessingml/2006/main" xmlns:w14="http://schemas.microsoft.com/office/word/2010/wordml" xmlns:w15="http://schemas.microsoft.com/office/word/2012/wordml" xmlns:w16cex="http://schemas.microsoft.com/office/word/2018/wordml/cex" xmlns:w16cid="http://schemas.microsoft.com/office/word/2016/wordml/cid" xmlns:w16="http://schemas.microsoft.com/office/word/2018/wordml" xmlns:w16du="http://schemas.microsoft.com/office/word/2023/wordml/word16du" xmlns:w16sdtdh="http://schemas.microsoft.com/office/word/2020/wordml/sdtdatahash" xmlns:w16sdtfl="http://schemas.microsoft.com/office/word/2024/wordml/sdtformatlock" xmlns:w16se="http://schemas.microsoft.com/office/word/2015/wordml/symex" xmlns:wpg="http://schemas.microsoft.com/office/word/2010/wordprocessingGroup" xmlns:wpi="http://schemas.microsoft.com/office/word/2010/wordprocessingInk" xmlns:wne="http://schemas.microsoft.com/office/word/2006/wordml" xmlns:wps="http://schemas.microsoft.com/office/word/2010/wordprocessingShape" mc:Ignorable="w14 w15 w16se w16cid w16 w16cex w16sdtdh w16sdtfl w16du wp14">
   <w:sdt>
     <w:sdtPr>
       <w:rPr>
@@ -11669,7 +11140,7 @@
 </file>
 
 <file path=word/footnotes.xml><?xml version="1.0" encoding="utf-8"?>
-<w:footnotes xmlns:wpc="http://schemas.microsoft.com/office/word/2010/wordprocessingCanvas" xmlns:cx="http://schemas.microsoft.com/office/drawing/2014/chartex" xmlns:cx1="http://schemas.microsoft.com/office/drawing/2015/9/8/chartex" xmlns:cx2="http://schemas.microsoft.com/office/drawing/2015/10/21/chartex" xmlns:cx3="http://schemas.microsoft.com/office/drawing/2016/5/9/chartex" xmlns:cx4="http://schemas.microsoft.com/office/drawing/2016/5/10/chartex" xmlns:cx5="http://schemas.microsoft.com/office/drawing/2016/5/11/chartex" xmlns:cx6="http://schemas.microsoft.com/office/drawing/2016/5/12/chartex" xmlns:cx7="http://schemas.microsoft.com/office/drawing/2016/5/13/chartex" xmlns:cx8="http://schemas.microsoft.com/office/drawing/2016/5/14/chartex" xmlns:mc="http://schemas.openxmlformats.org/markup-compatibility/2006" xmlns:aink="http://schemas.microsoft.com/office/drawing/2016/ink" xmlns:am3d="http://schemas.microsoft.com/office/drawing/2017/model3d" xmlns:o="urn:schemas-microsoft-com:office:office" xmlns:oel="http://schemas.microsoft.com/office/2019/extlst" xmlns:r="http://schemas.openxmlformats.org/officeDocument/2006/relationships" xmlns:m="http://schemas.openxmlformats.org/officeDocument/2006/math" xmlns:v="urn:schemas-microsoft-com:vml" xmlns:wp14="http://schemas.microsoft.com/office/word/2010/wordprocessingDrawing" xmlns:wp="http://schemas.openxmlformats.org/drawingml/2006/wordprocessingDrawing" xmlns:w10="urn:schemas-microsoft-com:office:word" xmlns:w="http://schemas.openxmlformats.org/wordprocessingml/2006/main" xmlns:w14="http://schemas.microsoft.com/office/word/2010/wordml" xmlns:w15="http://schemas.microsoft.com/office/word/2012/wordml" xmlns:w16cex="http://schemas.microsoft.com/office/word/2018/wordml/cex" xmlns:w16cid="http://schemas.microsoft.com/office/word/2016/wordml/cid" xmlns:w16="http://schemas.microsoft.com/office/word/2018/wordml" xmlns:w16sdtdh="http://schemas.microsoft.com/office/word/2020/wordml/sdtdatahash" xmlns:w16se="http://schemas.microsoft.com/office/word/2015/wordml/symex" xmlns:wpg="http://schemas.microsoft.com/office/word/2010/wordprocessingGroup" xmlns:wpi="http://schemas.microsoft.com/office/word/2010/wordprocessingInk" xmlns:wne="http://schemas.microsoft.com/office/word/2006/wordml" xmlns:wps="http://schemas.microsoft.com/office/word/2010/wordprocessingShape" mc:Ignorable="w14 w15 w16se w16cid w16 w16cex w16sdtdh wp14">
+<w:footnotes xmlns:wpc="http://schemas.microsoft.com/office/word/2010/wordprocessingCanvas" xmlns:cx="http://schemas.microsoft.com/office/drawing/2014/chartex" xmlns:cx1="http://schemas.microsoft.com/office/drawing/2015/9/8/chartex" xmlns:cx2="http://schemas.microsoft.com/office/drawing/2015/10/21/chartex" xmlns:cx3="http://schemas.microsoft.com/office/drawing/2016/5/9/chartex" xmlns:cx4="http://schemas.microsoft.com/office/drawing/2016/5/10/chartex" xmlns:cx5="http://schemas.microsoft.com/office/drawing/2016/5/11/chartex" xmlns:cx6="http://schemas.microsoft.com/office/drawing/2016/5/12/chartex" xmlns:cx7="http://schemas.microsoft.com/office/drawing/2016/5/13/chartex" xmlns:cx8="http://schemas.microsoft.com/office/drawing/2016/5/14/chartex" xmlns:mc="http://schemas.openxmlformats.org/markup-compatibility/2006" xmlns:aink="http://schemas.microsoft.com/office/drawing/2016/ink" xmlns:am3d="http://schemas.microsoft.com/office/drawing/2017/model3d" xmlns:o="urn:schemas-microsoft-com:office:office" xmlns:oel="http://schemas.microsoft.com/office/2019/extlst" xmlns:r="http://schemas.openxmlformats.org/officeDocument/2006/relationships" xmlns:m="http://schemas.openxmlformats.org/officeDocument/2006/math" xmlns:v="urn:schemas-microsoft-com:vml" xmlns:wp14="http://schemas.microsoft.com/office/word/2010/wordprocessingDrawing" xmlns:wp="http://schemas.openxmlformats.org/drawingml/2006/wordprocessingDrawing" xmlns:w10="urn:schemas-microsoft-com:office:word" xmlns:w="http://schemas.openxmlformats.org/wordprocessingml/2006/main" xmlns:w14="http://schemas.microsoft.com/office/word/2010/wordml" xmlns:w15="http://schemas.microsoft.com/office/word/2012/wordml" xmlns:w16cex="http://schemas.microsoft.com/office/word/2018/wordml/cex" xmlns:w16cid="http://schemas.microsoft.com/office/word/2016/wordml/cid" xmlns:w16="http://schemas.microsoft.com/office/word/2018/wordml" xmlns:w16du="http://schemas.microsoft.com/office/word/2023/wordml/word16du" xmlns:w16sdtdh="http://schemas.microsoft.com/office/word/2020/wordml/sdtdatahash" xmlns:w16sdtfl="http://schemas.microsoft.com/office/word/2024/wordml/sdtformatlock" xmlns:w16se="http://schemas.microsoft.com/office/word/2015/wordml/symex" xmlns:wpg="http://schemas.microsoft.com/office/word/2010/wordprocessingGroup" xmlns:wpi="http://schemas.microsoft.com/office/word/2010/wordprocessingInk" xmlns:wne="http://schemas.microsoft.com/office/word/2006/wordml" xmlns:wps="http://schemas.microsoft.com/office/word/2010/wordprocessingShape" mc:Ignorable="w14 w15 w16se w16cid w16 w16cex w16sdtdh w16sdtfl w16du wp14">
   <w:footnote w:type="separator" w:id="-1">
     <w:p>
       <w:pPr>
@@ -11719,7 +11190,7 @@
 </file>
 
 <file path=word/numbering.xml><?xml version="1.0" encoding="utf-8"?>
-<w:numbering xmlns:wpc="http://schemas.microsoft.com/office/word/2010/wordprocessingCanvas" xmlns:cx="http://schemas.microsoft.com/office/drawing/2014/chartex" xmlns:cx1="http://schemas.microsoft.com/office/drawing/2015/9/8/chartex" xmlns:cx2="http://schemas.microsoft.com/office/drawing/2015/10/21/chartex" xmlns:cx3="http://schemas.microsoft.com/office/drawing/2016/5/9/chartex" xmlns:cx4="http://schemas.microsoft.com/office/drawing/2016/5/10/chartex" xmlns:cx5="http://schemas.microsoft.com/office/drawing/2016/5/11/chartex" xmlns:cx6="http://schemas.microsoft.com/office/drawing/2016/5/12/chartex" xmlns:cx7="http://schemas.microsoft.com/office/drawing/2016/5/13/chartex" xmlns:cx8="http://schemas.microsoft.com/office/drawing/2016/5/14/chartex" xmlns:mc="http://schemas.openxmlformats.org/markup-compatibility/2006" xmlns:aink="http://schemas.microsoft.com/office/drawing/2016/ink" xmlns:am3d="http://schemas.microsoft.com/office/drawing/2017/model3d" xmlns:o="urn:schemas-microsoft-com:office:office" xmlns:oel="http://schemas.microsoft.com/office/2019/extlst" xmlns:r="http://schemas.openxmlformats.org/officeDocument/2006/relationships" xmlns:m="http://schemas.openxmlformats.org/officeDocument/2006/math" xmlns:v="urn:schemas-microsoft-com:vml" xmlns:wp14="http://schemas.microsoft.com/office/word/2010/wordprocessingDrawing" xmlns:wp="http://schemas.openxmlformats.org/drawingml/2006/wordprocessingDrawing" xmlns:w10="urn:schemas-microsoft-com:office:word" xmlns:w="http://schemas.openxmlformats.org/wordprocessingml/2006/main" xmlns:w14="http://schemas.microsoft.com/office/word/2010/wordml" xmlns:w15="http://schemas.microsoft.com/office/word/2012/wordml" xmlns:w16cex="http://schemas.microsoft.com/office/word/2018/wordml/cex" xmlns:w16cid="http://schemas.microsoft.com/office/word/2016/wordml/cid" xmlns:w16="http://schemas.microsoft.com/office/word/2018/wordml" xmlns:w16sdtdh="http://schemas.microsoft.com/office/word/2020/wordml/sdtdatahash" xmlns:w16se="http://schemas.microsoft.com/office/word/2015/wordml/symex" xmlns:wpg="http://schemas.microsoft.com/office/word/2010/wordprocessingGroup" xmlns:wpi="http://schemas.microsoft.com/office/word/2010/wordprocessingInk" xmlns:wne="http://schemas.microsoft.com/office/word/2006/wordml" xmlns:wps="http://schemas.microsoft.com/office/word/2010/wordprocessingShape" mc:Ignorable="w14 w15 w16se w16cid w16 w16cex w16sdtdh wp14">
+<w:numbering xmlns:wpc="http://schemas.microsoft.com/office/word/2010/wordprocessingCanvas" xmlns:cx="http://schemas.microsoft.com/office/drawing/2014/chartex" xmlns:cx1="http://schemas.microsoft.com/office/drawing/2015/9/8/chartex" xmlns:cx2="http://schemas.microsoft.com/office/drawing/2015/10/21/chartex" xmlns:cx3="http://schemas.microsoft.com/office/drawing/2016/5/9/chartex" xmlns:cx4="http://schemas.microsoft.com/office/drawing/2016/5/10/chartex" xmlns:cx5="http://schemas.microsoft.com/office/drawing/2016/5/11/chartex" xmlns:cx6="http://schemas.microsoft.com/office/drawing/2016/5/12/chartex" xmlns:cx7="http://schemas.microsoft.com/office/drawing/2016/5/13/chartex" xmlns:cx8="http://schemas.microsoft.com/office/drawing/2016/5/14/chartex" xmlns:mc="http://schemas.openxmlformats.org/markup-compatibility/2006" xmlns:aink="http://schemas.microsoft.com/office/drawing/2016/ink" xmlns:am3d="http://schemas.microsoft.com/office/drawing/2017/model3d" xmlns:o="urn:schemas-microsoft-com:office:office" xmlns:oel="http://schemas.microsoft.com/office/2019/extlst" xmlns:r="http://schemas.openxmlformats.org/officeDocument/2006/relationships" xmlns:m="http://schemas.openxmlformats.org/officeDocument/2006/math" xmlns:v="urn:schemas-microsoft-com:vml" xmlns:wp14="http://schemas.microsoft.com/office/word/2010/wordprocessingDrawing" xmlns:wp="http://schemas.openxmlformats.org/drawingml/2006/wordprocessingDrawing" xmlns:w10="urn:schemas-microsoft-com:office:word" xmlns:w="http://schemas.openxmlformats.org/wordprocessingml/2006/main" xmlns:w14="http://schemas.microsoft.com/office/word/2010/wordml" xmlns:w15="http://schemas.microsoft.com/office/word/2012/wordml" xmlns:w16cex="http://schemas.microsoft.com/office/word/2018/wordml/cex" xmlns:w16cid="http://schemas.microsoft.com/office/word/2016/wordml/cid" xmlns:w16="http://schemas.microsoft.com/office/word/2018/wordml" xmlns:w16du="http://schemas.microsoft.com/office/word/2023/wordml/word16du" xmlns:w16sdtdh="http://schemas.microsoft.com/office/word/2020/wordml/sdtdatahash" xmlns:w16sdtfl="http://schemas.microsoft.com/office/word/2024/wordml/sdtformatlock" xmlns:w16se="http://schemas.microsoft.com/office/word/2015/wordml/symex" xmlns:wpg="http://schemas.microsoft.com/office/word/2010/wordprocessingGroup" xmlns:wpi="http://schemas.microsoft.com/office/word/2010/wordprocessingInk" xmlns:wne="http://schemas.microsoft.com/office/word/2006/wordml" xmlns:wps="http://schemas.microsoft.com/office/word/2010/wordprocessingShape" mc:Ignorable="w14 w15 w16se w16cid w16 w16cex w16sdtdh w16sdtfl w16du wp14">
   <w:abstractNum w:abstractNumId="0" w15:restartNumberingAfterBreak="0">
     <w:nsid w:val="FFFFFF7C"/>
     <w:multiLevelType w:val="singleLevel"/>
@@ -12932,6 +12403,119 @@
     </w:lvl>
   </w:abstractNum>
   <w:abstractNum w:abstractNumId="19" w15:restartNumberingAfterBreak="0">
+    <w:nsid w:val="08251CDF"/>
+    <w:multiLevelType w:val="hybridMultilevel"/>
+    <w:tmpl w:val="F80C8BFE"/>
+    <w:lvl w:ilvl="0" w:tplc="08090001">
+      <w:start w:val="1"/>
+      <w:numFmt w:val="bullet"/>
+      <w:lvlText w:val=""/>
+      <w:lvlJc w:val="left"/>
+      <w:pPr>
+        <w:ind w:left="360" w:hanging="360"/>
+      </w:pPr>
+      <w:rPr>
+        <w:rFonts w:ascii="Symbol" w:hAnsi="Symbol" w:hint="default"/>
+      </w:rPr>
+    </w:lvl>
+    <w:lvl w:ilvl="1" w:tplc="08090003" w:tentative="1">
+      <w:start w:val="1"/>
+      <w:numFmt w:val="bullet"/>
+      <w:lvlText w:val="o"/>
+      <w:lvlJc w:val="left"/>
+      <w:pPr>
+        <w:ind w:left="1080" w:hanging="360"/>
+      </w:pPr>
+      <w:rPr>
+        <w:rFonts w:ascii="Courier New" w:hAnsi="Courier New" w:cs="Courier New" w:hint="default"/>
+      </w:rPr>
+    </w:lvl>
+    <w:lvl w:ilvl="2" w:tplc="08090005" w:tentative="1">
+      <w:start w:val="1"/>
+      <w:numFmt w:val="bullet"/>
+      <w:lvlText w:val=""/>
+      <w:lvlJc w:val="left"/>
+      <w:pPr>
+        <w:ind w:left="1800" w:hanging="360"/>
+      </w:pPr>
+      <w:rPr>
+        <w:rFonts w:ascii="Wingdings" w:hAnsi="Wingdings" w:hint="default"/>
+      </w:rPr>
+    </w:lvl>
+    <w:lvl w:ilvl="3" w:tplc="08090001" w:tentative="1">
+      <w:start w:val="1"/>
+      <w:numFmt w:val="bullet"/>
+      <w:lvlText w:val=""/>
+      <w:lvlJc w:val="left"/>
+      <w:pPr>
+        <w:ind w:left="2520" w:hanging="360"/>
+      </w:pPr>
+      <w:rPr>
+        <w:rFonts w:ascii="Symbol" w:hAnsi="Symbol" w:hint="default"/>
+      </w:rPr>
+    </w:lvl>
+    <w:lvl w:ilvl="4" w:tplc="08090003" w:tentative="1">
+      <w:start w:val="1"/>
+      <w:numFmt w:val="bullet"/>
+      <w:lvlText w:val="o"/>
+      <w:lvlJc w:val="left"/>
+      <w:pPr>
+        <w:ind w:left="3240" w:hanging="360"/>
+      </w:pPr>
+      <w:rPr>
+        <w:rFonts w:ascii="Courier New" w:hAnsi="Courier New" w:cs="Courier New" w:hint="default"/>
+      </w:rPr>
+    </w:lvl>
+    <w:lvl w:ilvl="5" w:tplc="08090005" w:tentative="1">
+      <w:start w:val="1"/>
+      <w:numFmt w:val="bullet"/>
+      <w:lvlText w:val=""/>
+      <w:lvlJc w:val="left"/>
+      <w:pPr>
+        <w:ind w:left="3960" w:hanging="360"/>
+      </w:pPr>
+      <w:rPr>
+        <w:rFonts w:ascii="Wingdings" w:hAnsi="Wingdings" w:hint="default"/>
+      </w:rPr>
+    </w:lvl>
+    <w:lvl w:ilvl="6" w:tplc="08090001" w:tentative="1">
+      <w:start w:val="1"/>
+      <w:numFmt w:val="bullet"/>
+      <w:lvlText w:val=""/>
+      <w:lvlJc w:val="left"/>
+      <w:pPr>
+        <w:ind w:left="4680" w:hanging="360"/>
+      </w:pPr>
+      <w:rPr>
+        <w:rFonts w:ascii="Symbol" w:hAnsi="Symbol" w:hint="default"/>
+      </w:rPr>
+    </w:lvl>
+    <w:lvl w:ilvl="7" w:tplc="08090003" w:tentative="1">
+      <w:start w:val="1"/>
+      <w:numFmt w:val="bullet"/>
+      <w:lvlText w:val="o"/>
+      <w:lvlJc w:val="left"/>
+      <w:pPr>
+        <w:ind w:left="5400" w:hanging="360"/>
+      </w:pPr>
+      <w:rPr>
+        <w:rFonts w:ascii="Courier New" w:hAnsi="Courier New" w:cs="Courier New" w:hint="default"/>
+      </w:rPr>
+    </w:lvl>
+    <w:lvl w:ilvl="8" w:tplc="08090005" w:tentative="1">
+      <w:start w:val="1"/>
+      <w:numFmt w:val="bullet"/>
+      <w:lvlText w:val=""/>
+      <w:lvlJc w:val="left"/>
+      <w:pPr>
+        <w:ind w:left="6120" w:hanging="360"/>
+      </w:pPr>
+      <w:rPr>
+        <w:rFonts w:ascii="Wingdings" w:hAnsi="Wingdings" w:hint="default"/>
+      </w:rPr>
+    </w:lvl>
+  </w:abstractNum>
+  <w:abstractNum w:abstractNumId="20" w15:restartNumberingAfterBreak="0">
     <w:nsid w:val="08510C0E"/>
     <w:multiLevelType w:val="hybridMultilevel"/>
     <w:tmpl w:val="FFFFFFFF"/>
@@ -13017,7 +12601,7 @@
       </w:pPr>
     </w:lvl>
   </w:abstractNum>
-  <w:abstractNum w:abstractNumId="20" w15:restartNumberingAfterBreak="0">
+  <w:abstractNum w:abstractNumId="21" w15:restartNumberingAfterBreak="0">
     <w:nsid w:val="086A0C73"/>
     <w:multiLevelType w:val="multilevel"/>
     <w:tmpl w:val="84F403B2"/>
@@ -13131,7 +12715,7 @@
       </w:rPr>
     </w:lvl>
   </w:abstractNum>
-  <w:abstractNum w:abstractNumId="21" w15:restartNumberingAfterBreak="0">
+  <w:abstractNum w:abstractNumId="22" w15:restartNumberingAfterBreak="0">
     <w:nsid w:val="0E56C3BD"/>
     <w:multiLevelType w:val="hybridMultilevel"/>
     <w:tmpl w:val="FFFFFFFF"/>
@@ -13217,7 +12801,7 @@
       </w:pPr>
     </w:lvl>
   </w:abstractNum>
-  <w:abstractNum w:abstractNumId="22" w15:restartNumberingAfterBreak="0">
+  <w:abstractNum w:abstractNumId="23" w15:restartNumberingAfterBreak="0">
     <w:nsid w:val="11214995"/>
     <w:multiLevelType w:val="multilevel"/>
     <w:tmpl w:val="49B4DFA6"/>
@@ -13330,7 +12914,7 @@
       </w:rPr>
     </w:lvl>
   </w:abstractNum>
-  <w:abstractNum w:abstractNumId="23" w15:restartNumberingAfterBreak="0">
+  <w:abstractNum w:abstractNumId="24" w15:restartNumberingAfterBreak="0">
     <w:nsid w:val="11563BB4"/>
     <w:multiLevelType w:val="multilevel"/>
     <w:tmpl w:val="72465CDA"/>
@@ -13444,7 +13028,7 @@
       </w:rPr>
     </w:lvl>
   </w:abstractNum>
-  <w:abstractNum w:abstractNumId="24" w15:restartNumberingAfterBreak="0">
+  <w:abstractNum w:abstractNumId="25" w15:restartNumberingAfterBreak="0">
     <w:nsid w:val="11A233FC"/>
     <w:multiLevelType w:val="multilevel"/>
     <w:tmpl w:val="2B7EC5A0"/>
@@ -13534,7 +13118,7 @@
       </w:pPr>
     </w:lvl>
   </w:abstractNum>
-  <w:abstractNum w:abstractNumId="25" w15:restartNumberingAfterBreak="0">
+  <w:abstractNum w:abstractNumId="26" w15:restartNumberingAfterBreak="0">
     <w:nsid w:val="1237844C"/>
     <w:multiLevelType w:val="hybridMultilevel"/>
     <w:tmpl w:val="FFFFFFFF"/>
@@ -13620,7 +13204,7 @@
       </w:pPr>
     </w:lvl>
   </w:abstractNum>
-  <w:abstractNum w:abstractNumId="26" w15:restartNumberingAfterBreak="0">
+  <w:abstractNum w:abstractNumId="27" w15:restartNumberingAfterBreak="0">
     <w:nsid w:val="134B6618"/>
     <w:multiLevelType w:val="multilevel"/>
     <w:tmpl w:val="2D7426A2"/>
@@ -13734,7 +13318,7 @@
       </w:rPr>
     </w:lvl>
   </w:abstractNum>
-  <w:abstractNum w:abstractNumId="27" w15:restartNumberingAfterBreak="0">
+  <w:abstractNum w:abstractNumId="28" w15:restartNumberingAfterBreak="0">
     <w:nsid w:val="15998C11"/>
     <w:multiLevelType w:val="hybridMultilevel"/>
     <w:tmpl w:val="FFFFFFFF"/>
@@ -13820,7 +13404,7 @@
       </w:pPr>
     </w:lvl>
   </w:abstractNum>
-  <w:abstractNum w:abstractNumId="28" w15:restartNumberingAfterBreak="0">
+  <w:abstractNum w:abstractNumId="29" w15:restartNumberingAfterBreak="0">
     <w:nsid w:val="16CB0BAB"/>
     <w:multiLevelType w:val="multilevel"/>
     <w:tmpl w:val="84F403B2"/>
@@ -13934,7 +13518,7 @@
       </w:rPr>
     </w:lvl>
   </w:abstractNum>
-  <w:abstractNum w:abstractNumId="29" w15:restartNumberingAfterBreak="0">
+  <w:abstractNum w:abstractNumId="30" w15:restartNumberingAfterBreak="0">
     <w:nsid w:val="17348D36"/>
     <w:multiLevelType w:val="hybridMultilevel"/>
     <w:tmpl w:val="FFFFFFFF"/>
@@ -14047,7 +13631,7 @@
       </w:rPr>
     </w:lvl>
   </w:abstractNum>
-  <w:abstractNum w:abstractNumId="30" w15:restartNumberingAfterBreak="0">
+  <w:abstractNum w:abstractNumId="31" w15:restartNumberingAfterBreak="0">
     <w:nsid w:val="17956454"/>
     <w:multiLevelType w:val="multilevel"/>
     <w:tmpl w:val="6C46185C"/>
@@ -14169,7 +13753,7 @@
       </w:rPr>
     </w:lvl>
   </w:abstractNum>
-  <w:abstractNum w:abstractNumId="31" w15:restartNumberingAfterBreak="0">
+  <w:abstractNum w:abstractNumId="32" w15:restartNumberingAfterBreak="0">
     <w:nsid w:val="1A392A20"/>
     <w:multiLevelType w:val="multilevel"/>
     <w:tmpl w:val="0A9C48B2"/>
@@ -14255,7 +13839,7 @@
       </w:pPr>
     </w:lvl>
   </w:abstractNum>
-  <w:abstractNum w:abstractNumId="32" w15:restartNumberingAfterBreak="0">
+  <w:abstractNum w:abstractNumId="33" w15:restartNumberingAfterBreak="0">
     <w:nsid w:val="1A9DF5B3"/>
     <w:multiLevelType w:val="multilevel"/>
     <w:tmpl w:val="FFFFFFFF"/>
@@ -14341,7 +13925,7 @@
       </w:pPr>
     </w:lvl>
   </w:abstractNum>
-  <w:abstractNum w:abstractNumId="33" w15:restartNumberingAfterBreak="0">
+  <w:abstractNum w:abstractNumId="34" w15:restartNumberingAfterBreak="0">
     <w:nsid w:val="1B872D5D"/>
     <w:multiLevelType w:val="multilevel"/>
     <w:tmpl w:val="593E2830"/>
@@ -14455,7 +14039,7 @@
       </w:rPr>
     </w:lvl>
   </w:abstractNum>
-  <w:abstractNum w:abstractNumId="34" w15:restartNumberingAfterBreak="0">
+  <w:abstractNum w:abstractNumId="35" w15:restartNumberingAfterBreak="0">
     <w:nsid w:val="1BB5230A"/>
     <w:multiLevelType w:val="multilevel"/>
     <w:tmpl w:val="84F403B2"/>
@@ -14568,13 +14152,13 @@
       </w:rPr>
     </w:lvl>
   </w:abstractNum>
-  <w:abstractNum w:abstractNumId="35" w15:restartNumberingAfterBreak="0">
+  <w:abstractNum w:abstractNumId="36" w15:restartNumberingAfterBreak="0">
     <w:nsid w:val="1D602075"/>
     <w:multiLevelType w:val="multilevel"/>
     <w:tmpl w:val="84F403B2"/>
     <w:numStyleLink w:val="CurrentList10"/>
   </w:abstractNum>
-  <w:abstractNum w:abstractNumId="36" w15:restartNumberingAfterBreak="0">
+  <w:abstractNum w:abstractNumId="37" w15:restartNumberingAfterBreak="0">
     <w:nsid w:val="1E362499"/>
     <w:multiLevelType w:val="multilevel"/>
     <w:tmpl w:val="49B89F18"/>
@@ -14663,7 +14247,7 @@
       </w:pPr>
     </w:lvl>
   </w:abstractNum>
-  <w:abstractNum w:abstractNumId="37" w15:restartNumberingAfterBreak="0">
+  <w:abstractNum w:abstractNumId="38" w15:restartNumberingAfterBreak="0">
     <w:nsid w:val="225F5B73"/>
     <w:multiLevelType w:val="hybridMultilevel"/>
     <w:tmpl w:val="987E9604"/>
@@ -14776,7 +14360,7 @@
       </w:rPr>
     </w:lvl>
   </w:abstractNum>
-  <w:abstractNum w:abstractNumId="38" w15:restartNumberingAfterBreak="0">
+  <w:abstractNum w:abstractNumId="39" w15:restartNumberingAfterBreak="0">
     <w:nsid w:val="24CB3050"/>
     <w:multiLevelType w:val="multilevel"/>
     <w:tmpl w:val="6C46185C"/>
@@ -14897,13 +14481,13 @@
       </w:rPr>
     </w:lvl>
   </w:abstractNum>
-  <w:abstractNum w:abstractNumId="39" w15:restartNumberingAfterBreak="0">
+  <w:abstractNum w:abstractNumId="40" w15:restartNumberingAfterBreak="0">
     <w:nsid w:val="259E66B0"/>
     <w:multiLevelType w:val="multilevel"/>
     <w:tmpl w:val="F6084292"/>
     <w:numStyleLink w:val="CurrentList11"/>
   </w:abstractNum>
-  <w:abstractNum w:abstractNumId="40" w15:restartNumberingAfterBreak="0">
+  <w:abstractNum w:abstractNumId="41" w15:restartNumberingAfterBreak="0">
     <w:nsid w:val="268B6EC6"/>
     <w:multiLevelType w:val="multilevel"/>
     <w:tmpl w:val="ED9617C0"/>
@@ -15016,7 +14600,7 @@
       </w:rPr>
     </w:lvl>
   </w:abstractNum>
-  <w:abstractNum w:abstractNumId="41" w15:restartNumberingAfterBreak="0">
+  <w:abstractNum w:abstractNumId="42" w15:restartNumberingAfterBreak="0">
     <w:nsid w:val="278717AA"/>
     <w:multiLevelType w:val="multilevel"/>
     <w:tmpl w:val="08E81C8A"/>
@@ -15129,7 +14713,7 @@
       </w:rPr>
     </w:lvl>
   </w:abstractNum>
-  <w:abstractNum w:abstractNumId="42" w15:restartNumberingAfterBreak="0">
+  <w:abstractNum w:abstractNumId="43" w15:restartNumberingAfterBreak="0">
     <w:nsid w:val="28749D45"/>
     <w:multiLevelType w:val="hybridMultilevel"/>
     <w:tmpl w:val="0DF4A582"/>
@@ -15242,7 +14826,7 @@
       </w:rPr>
     </w:lvl>
   </w:abstractNum>
-  <w:abstractNum w:abstractNumId="43" w15:restartNumberingAfterBreak="0">
+  <w:abstractNum w:abstractNumId="44" w15:restartNumberingAfterBreak="0">
     <w:nsid w:val="297B85AA"/>
     <w:multiLevelType w:val="hybridMultilevel"/>
     <w:tmpl w:val="FFFFFFFF"/>
@@ -15328,7 +14912,7 @@
       </w:pPr>
     </w:lvl>
   </w:abstractNum>
-  <w:abstractNum w:abstractNumId="44" w15:restartNumberingAfterBreak="0">
+  <w:abstractNum w:abstractNumId="45" w15:restartNumberingAfterBreak="0">
     <w:nsid w:val="29FB8813"/>
     <w:multiLevelType w:val="hybridMultilevel"/>
     <w:tmpl w:val="FFFFFFFF"/>
@@ -15441,7 +15025,7 @@
       </w:rPr>
     </w:lvl>
   </w:abstractNum>
-  <w:abstractNum w:abstractNumId="45" w15:restartNumberingAfterBreak="0">
+  <w:abstractNum w:abstractNumId="46" w15:restartNumberingAfterBreak="0">
     <w:nsid w:val="2AD324F6"/>
     <w:multiLevelType w:val="hybridMultilevel"/>
     <w:tmpl w:val="6D4EDF56"/>
@@ -15554,7 +15138,7 @@
       </w:rPr>
     </w:lvl>
   </w:abstractNum>
-  <w:abstractNum w:abstractNumId="46" w15:restartNumberingAfterBreak="0">
+  <w:abstractNum w:abstractNumId="47" w15:restartNumberingAfterBreak="0">
     <w:nsid w:val="2B1338DA"/>
     <w:multiLevelType w:val="multilevel"/>
     <w:tmpl w:val="DC3ED810"/>
@@ -15676,7 +15260,7 @@
       </w:rPr>
     </w:lvl>
   </w:abstractNum>
-  <w:abstractNum w:abstractNumId="47" w15:restartNumberingAfterBreak="0">
+  <w:abstractNum w:abstractNumId="48" w15:restartNumberingAfterBreak="0">
     <w:nsid w:val="2C147B22"/>
     <w:multiLevelType w:val="hybridMultilevel"/>
     <w:tmpl w:val="FFFFFFFF"/>
@@ -15762,7 +15346,7 @@
       </w:pPr>
     </w:lvl>
   </w:abstractNum>
-  <w:abstractNum w:abstractNumId="48" w15:restartNumberingAfterBreak="0">
+  <w:abstractNum w:abstractNumId="49" w15:restartNumberingAfterBreak="0">
     <w:nsid w:val="3147349D"/>
     <w:multiLevelType w:val="multilevel"/>
     <w:tmpl w:val="79F06B4A"/>
@@ -15875,7 +15459,7 @@
       </w:rPr>
     </w:lvl>
   </w:abstractNum>
-  <w:abstractNum w:abstractNumId="49" w15:restartNumberingAfterBreak="0">
+  <w:abstractNum w:abstractNumId="50" w15:restartNumberingAfterBreak="0">
     <w:nsid w:val="31500A2D"/>
     <w:multiLevelType w:val="multilevel"/>
     <w:tmpl w:val="79F06B4A"/>
@@ -15989,7 +15573,7 @@
       </w:rPr>
     </w:lvl>
   </w:abstractNum>
-  <w:abstractNum w:abstractNumId="50" w15:restartNumberingAfterBreak="0">
+  <w:abstractNum w:abstractNumId="51" w15:restartNumberingAfterBreak="0">
     <w:nsid w:val="325B1C33"/>
     <w:multiLevelType w:val="hybridMultilevel"/>
     <w:tmpl w:val="DE503424"/>
@@ -16079,7 +15663,7 @@
       </w:pPr>
     </w:lvl>
   </w:abstractNum>
-  <w:abstractNum w:abstractNumId="51" w15:restartNumberingAfterBreak="0">
+  <w:abstractNum w:abstractNumId="52" w15:restartNumberingAfterBreak="0">
     <w:nsid w:val="33894E64"/>
     <w:multiLevelType w:val="multilevel"/>
     <w:tmpl w:val="45623E02"/>
@@ -16193,7 +15777,7 @@
       </w:rPr>
     </w:lvl>
   </w:abstractNum>
-  <w:abstractNum w:abstractNumId="52" w15:restartNumberingAfterBreak="0">
+  <w:abstractNum w:abstractNumId="53" w15:restartNumberingAfterBreak="0">
     <w:nsid w:val="33E10E2A"/>
     <w:multiLevelType w:val="multilevel"/>
     <w:tmpl w:val="2D7426A2"/>
@@ -16307,7 +15891,7 @@
       </w:rPr>
     </w:lvl>
   </w:abstractNum>
-  <w:abstractNum w:abstractNumId="53" w15:restartNumberingAfterBreak="0">
+  <w:abstractNum w:abstractNumId="54" w15:restartNumberingAfterBreak="0">
     <w:nsid w:val="3508197A"/>
     <w:multiLevelType w:val="hybridMultilevel"/>
     <w:tmpl w:val="FFFFFFFF"/>
@@ -16420,7 +16004,7 @@
       </w:rPr>
     </w:lvl>
   </w:abstractNum>
-  <w:abstractNum w:abstractNumId="54" w15:restartNumberingAfterBreak="0">
+  <w:abstractNum w:abstractNumId="55" w15:restartNumberingAfterBreak="0">
     <w:nsid w:val="35A42002"/>
     <w:multiLevelType w:val="multilevel"/>
     <w:tmpl w:val="2B7EC5A0"/>
@@ -16509,7 +16093,7 @@
       </w:pPr>
     </w:lvl>
   </w:abstractNum>
-  <w:abstractNum w:abstractNumId="55" w15:restartNumberingAfterBreak="0">
+  <w:abstractNum w:abstractNumId="56" w15:restartNumberingAfterBreak="0">
     <w:nsid w:val="37417A43"/>
     <w:multiLevelType w:val="hybridMultilevel"/>
     <w:tmpl w:val="5CA0E5A6"/>
@@ -16595,7 +16179,7 @@
       </w:pPr>
     </w:lvl>
   </w:abstractNum>
-  <w:abstractNum w:abstractNumId="56" w15:restartNumberingAfterBreak="0">
+  <w:abstractNum w:abstractNumId="57" w15:restartNumberingAfterBreak="0">
     <w:nsid w:val="37A0259F"/>
     <w:multiLevelType w:val="multilevel"/>
     <w:tmpl w:val="DFD6A4E6"/>
@@ -16708,7 +16292,7 @@
       </w:rPr>
     </w:lvl>
   </w:abstractNum>
-  <w:abstractNum w:abstractNumId="57" w15:restartNumberingAfterBreak="0">
+  <w:abstractNum w:abstractNumId="58" w15:restartNumberingAfterBreak="0">
     <w:nsid w:val="38E8DAAD"/>
     <w:multiLevelType w:val="hybridMultilevel"/>
     <w:tmpl w:val="FFFFFFFF"/>
@@ -16794,7 +16378,7 @@
       </w:pPr>
     </w:lvl>
   </w:abstractNum>
-  <w:abstractNum w:abstractNumId="58" w15:restartNumberingAfterBreak="0">
+  <w:abstractNum w:abstractNumId="59" w15:restartNumberingAfterBreak="0">
     <w:nsid w:val="39FF3ABE"/>
     <w:multiLevelType w:val="hybridMultilevel"/>
     <w:tmpl w:val="652CD4B4"/>
@@ -16907,7 +16491,7 @@
       </w:rPr>
     </w:lvl>
   </w:abstractNum>
-  <w:abstractNum w:abstractNumId="59" w15:restartNumberingAfterBreak="0">
+  <w:abstractNum w:abstractNumId="60" w15:restartNumberingAfterBreak="0">
     <w:nsid w:val="3BBB68B2"/>
     <w:multiLevelType w:val="hybridMultilevel"/>
     <w:tmpl w:val="FFFFFFFF"/>
@@ -17020,7 +16604,7 @@
       </w:rPr>
     </w:lvl>
   </w:abstractNum>
-  <w:abstractNum w:abstractNumId="60" w15:restartNumberingAfterBreak="0">
+  <w:abstractNum w:abstractNumId="61" w15:restartNumberingAfterBreak="0">
     <w:nsid w:val="3BCC0F54"/>
     <w:multiLevelType w:val="hybridMultilevel"/>
     <w:tmpl w:val="FFFFFFFF"/>
@@ -17133,7 +16717,7 @@
       </w:rPr>
     </w:lvl>
   </w:abstractNum>
-  <w:abstractNum w:abstractNumId="61" w15:restartNumberingAfterBreak="0">
+  <w:abstractNum w:abstractNumId="62" w15:restartNumberingAfterBreak="0">
     <w:nsid w:val="3C19422B"/>
     <w:multiLevelType w:val="multilevel"/>
     <w:tmpl w:val="84F403B2"/>
@@ -17246,7 +16830,7 @@
       </w:rPr>
     </w:lvl>
   </w:abstractNum>
-  <w:abstractNum w:abstractNumId="62" w15:restartNumberingAfterBreak="0">
+  <w:abstractNum w:abstractNumId="63" w15:restartNumberingAfterBreak="0">
     <w:nsid w:val="3C9C7A18"/>
     <w:multiLevelType w:val="multilevel"/>
     <w:tmpl w:val="0809001F"/>
@@ -17332,7 +16916,7 @@
       </w:pPr>
     </w:lvl>
   </w:abstractNum>
-  <w:abstractNum w:abstractNumId="63" w15:restartNumberingAfterBreak="0">
+  <w:abstractNum w:abstractNumId="64" w15:restartNumberingAfterBreak="0">
     <w:nsid w:val="3CAA5526"/>
     <w:multiLevelType w:val="hybridMultilevel"/>
     <w:tmpl w:val="FFFFFFFF"/>
@@ -17445,7 +17029,7 @@
       </w:rPr>
     </w:lvl>
   </w:abstractNum>
-  <w:abstractNum w:abstractNumId="64" w15:restartNumberingAfterBreak="0">
+  <w:abstractNum w:abstractNumId="65" w15:restartNumberingAfterBreak="0">
     <w:nsid w:val="43E32B19"/>
     <w:multiLevelType w:val="hybridMultilevel"/>
     <w:tmpl w:val="FFFFFFFF"/>
@@ -17558,7 +17142,7 @@
       </w:rPr>
     </w:lvl>
   </w:abstractNum>
-  <w:abstractNum w:abstractNumId="65" w15:restartNumberingAfterBreak="0">
+  <w:abstractNum w:abstractNumId="66" w15:restartNumberingAfterBreak="0">
     <w:nsid w:val="445000F6"/>
     <w:multiLevelType w:val="hybridMultilevel"/>
     <w:tmpl w:val="2B7EC5A0"/>
@@ -17644,7 +17228,7 @@
       </w:pPr>
     </w:lvl>
   </w:abstractNum>
-  <w:abstractNum w:abstractNumId="66" w15:restartNumberingAfterBreak="0">
+  <w:abstractNum w:abstractNumId="67" w15:restartNumberingAfterBreak="0">
     <w:nsid w:val="44711435"/>
     <w:multiLevelType w:val="hybridMultilevel"/>
     <w:tmpl w:val="FFFFFFFF"/>
@@ -17757,7 +17341,7 @@
       </w:rPr>
     </w:lvl>
   </w:abstractNum>
-  <w:abstractNum w:abstractNumId="67" w15:restartNumberingAfterBreak="0">
+  <w:abstractNum w:abstractNumId="68" w15:restartNumberingAfterBreak="0">
     <w:nsid w:val="455B6A7D"/>
     <w:multiLevelType w:val="multilevel"/>
     <w:tmpl w:val="79F06B4A"/>
@@ -17870,7 +17454,7 @@
       </w:rPr>
     </w:lvl>
   </w:abstractNum>
-  <w:abstractNum w:abstractNumId="68" w15:restartNumberingAfterBreak="0">
+  <w:abstractNum w:abstractNumId="69" w15:restartNumberingAfterBreak="0">
     <w:nsid w:val="464803E0"/>
     <w:multiLevelType w:val="hybridMultilevel"/>
     <w:tmpl w:val="FFFFFFFF"/>
@@ -17983,7 +17567,7 @@
       </w:rPr>
     </w:lvl>
   </w:abstractNum>
-  <w:abstractNum w:abstractNumId="69" w15:restartNumberingAfterBreak="0">
+  <w:abstractNum w:abstractNumId="70" w15:restartNumberingAfterBreak="0">
     <w:nsid w:val="46E74D9C"/>
     <w:multiLevelType w:val="multilevel"/>
     <w:tmpl w:val="79F06B4A"/>
@@ -18096,7 +17680,7 @@
       </w:rPr>
     </w:lvl>
   </w:abstractNum>
-  <w:abstractNum w:abstractNumId="70" w15:restartNumberingAfterBreak="0">
+  <w:abstractNum w:abstractNumId="71" w15:restartNumberingAfterBreak="0">
     <w:nsid w:val="46F509B2"/>
     <w:multiLevelType w:val="hybridMultilevel"/>
     <w:tmpl w:val="FFFFFFFF"/>
@@ -18182,7 +17766,7 @@
       </w:pPr>
     </w:lvl>
   </w:abstractNum>
-  <w:abstractNum w:abstractNumId="71" w15:restartNumberingAfterBreak="0">
+  <w:abstractNum w:abstractNumId="72" w15:restartNumberingAfterBreak="0">
     <w:nsid w:val="49F6AFE5"/>
     <w:multiLevelType w:val="hybridMultilevel"/>
     <w:tmpl w:val="2F06877E"/>
@@ -18268,13 +17852,13 @@
       </w:pPr>
     </w:lvl>
   </w:abstractNum>
-  <w:abstractNum w:abstractNumId="72" w15:restartNumberingAfterBreak="0">
+  <w:abstractNum w:abstractNumId="73" w15:restartNumberingAfterBreak="0">
     <w:nsid w:val="4B083437"/>
     <w:multiLevelType w:val="multilevel"/>
     <w:tmpl w:val="84F403B2"/>
     <w:numStyleLink w:val="CurrentList10"/>
   </w:abstractNum>
-  <w:abstractNum w:abstractNumId="73" w15:restartNumberingAfterBreak="0">
+  <w:abstractNum w:abstractNumId="74" w15:restartNumberingAfterBreak="0">
     <w:nsid w:val="4BC63C51"/>
     <w:multiLevelType w:val="multilevel"/>
     <w:tmpl w:val="84F403B2"/>
@@ -18388,7 +17972,7 @@
       </w:rPr>
     </w:lvl>
   </w:abstractNum>
-  <w:abstractNum w:abstractNumId="74" w15:restartNumberingAfterBreak="0">
+  <w:abstractNum w:abstractNumId="75" w15:restartNumberingAfterBreak="0">
     <w:nsid w:val="4D7C5187"/>
     <w:multiLevelType w:val="multilevel"/>
     <w:tmpl w:val="14707834"/>
@@ -18474,7 +18058,7 @@
       </w:pPr>
     </w:lvl>
   </w:abstractNum>
-  <w:abstractNum w:abstractNumId="75" w15:restartNumberingAfterBreak="0">
+  <w:abstractNum w:abstractNumId="76" w15:restartNumberingAfterBreak="0">
     <w:nsid w:val="50C2619E"/>
     <w:multiLevelType w:val="multilevel"/>
     <w:tmpl w:val="6C46185C"/>
@@ -18595,7 +18179,7 @@
       </w:rPr>
     </w:lvl>
   </w:abstractNum>
-  <w:abstractNum w:abstractNumId="76" w15:restartNumberingAfterBreak="0">
+  <w:abstractNum w:abstractNumId="77" w15:restartNumberingAfterBreak="0">
     <w:nsid w:val="51601C16"/>
     <w:multiLevelType w:val="multilevel"/>
     <w:tmpl w:val="2D7426A2"/>
@@ -18708,7 +18292,7 @@
       </w:rPr>
     </w:lvl>
   </w:abstractNum>
-  <w:abstractNum w:abstractNumId="77" w15:restartNumberingAfterBreak="0">
+  <w:abstractNum w:abstractNumId="78" w15:restartNumberingAfterBreak="0">
     <w:nsid w:val="539C4D4A"/>
     <w:multiLevelType w:val="multilevel"/>
     <w:tmpl w:val="0809001F"/>
@@ -18794,7 +18378,7 @@
       </w:pPr>
     </w:lvl>
   </w:abstractNum>
-  <w:abstractNum w:abstractNumId="78" w15:restartNumberingAfterBreak="0">
+  <w:abstractNum w:abstractNumId="79" w15:restartNumberingAfterBreak="0">
     <w:nsid w:val="53CA2D4D"/>
     <w:multiLevelType w:val="multilevel"/>
     <w:tmpl w:val="2B7EC5A0"/>
@@ -18883,7 +18467,7 @@
       </w:pPr>
     </w:lvl>
   </w:abstractNum>
-  <w:abstractNum w:abstractNumId="79" w15:restartNumberingAfterBreak="0">
+  <w:abstractNum w:abstractNumId="80" w15:restartNumberingAfterBreak="0">
     <w:nsid w:val="53E0012D"/>
     <w:multiLevelType w:val="multilevel"/>
     <w:tmpl w:val="593E2830"/>
@@ -18997,7 +18581,7 @@
       </w:rPr>
     </w:lvl>
   </w:abstractNum>
-  <w:abstractNum w:abstractNumId="80" w15:restartNumberingAfterBreak="0">
+  <w:abstractNum w:abstractNumId="81" w15:restartNumberingAfterBreak="0">
     <w:nsid w:val="54B439DD"/>
     <w:multiLevelType w:val="hybridMultilevel"/>
     <w:tmpl w:val="FFFFFFFF"/>
@@ -19110,7 +18694,7 @@
       </w:rPr>
     </w:lvl>
   </w:abstractNum>
-  <w:abstractNum w:abstractNumId="81" w15:restartNumberingAfterBreak="0">
+  <w:abstractNum w:abstractNumId="82" w15:restartNumberingAfterBreak="0">
     <w:nsid w:val="55CD575E"/>
     <w:multiLevelType w:val="hybridMultilevel"/>
     <w:tmpl w:val="18805470"/>
@@ -19223,7 +18807,7 @@
       </w:rPr>
     </w:lvl>
   </w:abstractNum>
-  <w:abstractNum w:abstractNumId="82" w15:restartNumberingAfterBreak="0">
+  <w:abstractNum w:abstractNumId="83" w15:restartNumberingAfterBreak="0">
     <w:nsid w:val="56F407E4"/>
     <w:multiLevelType w:val="multilevel"/>
     <w:tmpl w:val="DA464248"/>
@@ -19336,7 +18920,7 @@
       </w:rPr>
     </w:lvl>
   </w:abstractNum>
-  <w:abstractNum w:abstractNumId="83" w15:restartNumberingAfterBreak="0">
+  <w:abstractNum w:abstractNumId="84" w15:restartNumberingAfterBreak="0">
     <w:nsid w:val="579A7B43"/>
     <w:multiLevelType w:val="hybridMultilevel"/>
     <w:tmpl w:val="3DC87EBC"/>
@@ -19449,7 +19033,7 @@
       </w:rPr>
     </w:lvl>
   </w:abstractNum>
-  <w:abstractNum w:abstractNumId="84" w15:restartNumberingAfterBreak="0">
+  <w:abstractNum w:abstractNumId="85" w15:restartNumberingAfterBreak="0">
     <w:nsid w:val="5A8575A7"/>
     <w:multiLevelType w:val="multilevel"/>
     <w:tmpl w:val="A8123432"/>
@@ -19562,7 +19146,7 @@
       </w:rPr>
     </w:lvl>
   </w:abstractNum>
-  <w:abstractNum w:abstractNumId="85" w15:restartNumberingAfterBreak="0">
+  <w:abstractNum w:abstractNumId="86" w15:restartNumberingAfterBreak="0">
     <w:nsid w:val="5A967E28"/>
     <w:multiLevelType w:val="multilevel"/>
     <w:tmpl w:val="0809001F"/>
@@ -19676,7 +19260,7 @@
       </w:rPr>
     </w:lvl>
   </w:abstractNum>
-  <w:abstractNum w:abstractNumId="86" w15:restartNumberingAfterBreak="0">
+  <w:abstractNum w:abstractNumId="87" w15:restartNumberingAfterBreak="0">
     <w:nsid w:val="5AFD62C6"/>
     <w:multiLevelType w:val="multilevel"/>
     <w:tmpl w:val="2B7EC5A0"/>
@@ -19766,7 +19350,7 @@
       </w:pPr>
     </w:lvl>
   </w:abstractNum>
-  <w:abstractNum w:abstractNumId="87" w15:restartNumberingAfterBreak="0">
+  <w:abstractNum w:abstractNumId="88" w15:restartNumberingAfterBreak="0">
     <w:nsid w:val="5B99C419"/>
     <w:multiLevelType w:val="hybridMultilevel"/>
     <w:tmpl w:val="FFFFFFFF"/>
@@ -19852,7 +19436,7 @@
       </w:pPr>
     </w:lvl>
   </w:abstractNum>
-  <w:abstractNum w:abstractNumId="88" w15:restartNumberingAfterBreak="0">
+  <w:abstractNum w:abstractNumId="89" w15:restartNumberingAfterBreak="0">
     <w:nsid w:val="5D9979E3"/>
     <w:multiLevelType w:val="multilevel"/>
     <w:tmpl w:val="3774AEC0"/>
@@ -19939,13 +19523,13 @@
       </w:pPr>
     </w:lvl>
   </w:abstractNum>
-  <w:abstractNum w:abstractNumId="89" w15:restartNumberingAfterBreak="0">
+  <w:abstractNum w:abstractNumId="90" w15:restartNumberingAfterBreak="0">
     <w:nsid w:val="5F10331B"/>
     <w:multiLevelType w:val="multilevel"/>
     <w:tmpl w:val="F6084292"/>
     <w:numStyleLink w:val="CurrentList11"/>
   </w:abstractNum>
-  <w:abstractNum w:abstractNumId="90" w15:restartNumberingAfterBreak="0">
+  <w:abstractNum w:abstractNumId="91" w15:restartNumberingAfterBreak="0">
     <w:nsid w:val="616B19C4"/>
     <w:multiLevelType w:val="multilevel"/>
     <w:tmpl w:val="72465CDA"/>
@@ -20058,7 +19642,7 @@
       </w:rPr>
     </w:lvl>
   </w:abstractNum>
-  <w:abstractNum w:abstractNumId="91" w15:restartNumberingAfterBreak="0">
+  <w:abstractNum w:abstractNumId="92" w15:restartNumberingAfterBreak="0">
     <w:nsid w:val="625769CF"/>
     <w:multiLevelType w:val="multilevel"/>
     <w:tmpl w:val="08090025"/>
@@ -20153,7 +19737,7 @@
       </w:pPr>
     </w:lvl>
   </w:abstractNum>
-  <w:abstractNum w:abstractNumId="92" w15:restartNumberingAfterBreak="0">
+  <w:abstractNum w:abstractNumId="93" w15:restartNumberingAfterBreak="0">
     <w:nsid w:val="634E05D4"/>
     <w:multiLevelType w:val="hybridMultilevel"/>
     <w:tmpl w:val="65B677E0"/>
@@ -20266,7 +19850,7 @@
       </w:rPr>
     </w:lvl>
   </w:abstractNum>
-  <w:abstractNum w:abstractNumId="93" w15:restartNumberingAfterBreak="0">
+  <w:abstractNum w:abstractNumId="94" w15:restartNumberingAfterBreak="0">
     <w:nsid w:val="644A43E5"/>
     <w:multiLevelType w:val="hybridMultilevel"/>
     <w:tmpl w:val="84F0719A"/>
@@ -20379,7 +19963,7 @@
       </w:rPr>
     </w:lvl>
   </w:abstractNum>
-  <w:abstractNum w:abstractNumId="94" w15:restartNumberingAfterBreak="0">
+  <w:abstractNum w:abstractNumId="95" w15:restartNumberingAfterBreak="0">
     <w:nsid w:val="655A0026"/>
     <w:multiLevelType w:val="multilevel"/>
     <w:tmpl w:val="BEF44822"/>
@@ -20492,7 +20076,7 @@
       </w:rPr>
     </w:lvl>
   </w:abstractNum>
-  <w:abstractNum w:abstractNumId="95" w15:restartNumberingAfterBreak="0">
+  <w:abstractNum w:abstractNumId="96" w15:restartNumberingAfterBreak="0">
     <w:nsid w:val="695D6005"/>
     <w:multiLevelType w:val="hybridMultilevel"/>
     <w:tmpl w:val="DB5A9BE8"/>
@@ -20578,7 +20162,7 @@
       </w:pPr>
     </w:lvl>
   </w:abstractNum>
-  <w:abstractNum w:abstractNumId="96" w15:restartNumberingAfterBreak="0">
+  <w:abstractNum w:abstractNumId="97" w15:restartNumberingAfterBreak="0">
     <w:nsid w:val="697243DC"/>
     <w:multiLevelType w:val="hybridMultilevel"/>
     <w:tmpl w:val="FFFFFFFF"/>
@@ -20664,7 +20248,7 @@
       </w:pPr>
     </w:lvl>
   </w:abstractNum>
-  <w:abstractNum w:abstractNumId="97" w15:restartNumberingAfterBreak="0">
+  <w:abstractNum w:abstractNumId="98" w15:restartNumberingAfterBreak="0">
     <w:nsid w:val="69ED005E"/>
     <w:multiLevelType w:val="multilevel"/>
     <w:tmpl w:val="AA3400A6"/>
@@ -20777,7 +20361,7 @@
       </w:pPr>
     </w:lvl>
   </w:abstractNum>
-  <w:abstractNum w:abstractNumId="98" w15:restartNumberingAfterBreak="0">
+  <w:abstractNum w:abstractNumId="99" w15:restartNumberingAfterBreak="0">
     <w:nsid w:val="6B1DB83E"/>
     <w:multiLevelType w:val="hybridMultilevel"/>
     <w:tmpl w:val="FFFFFFFF"/>
@@ -20890,7 +20474,7 @@
       </w:rPr>
     </w:lvl>
   </w:abstractNum>
-  <w:abstractNum w:abstractNumId="99" w15:restartNumberingAfterBreak="0">
+  <w:abstractNum w:abstractNumId="100" w15:restartNumberingAfterBreak="0">
     <w:nsid w:val="6B6311B5"/>
     <w:multiLevelType w:val="multilevel"/>
     <w:tmpl w:val="511AD880"/>
@@ -21003,7 +20587,7 @@
       </w:rPr>
     </w:lvl>
   </w:abstractNum>
-  <w:abstractNum w:abstractNumId="100" w15:restartNumberingAfterBreak="0">
+  <w:abstractNum w:abstractNumId="101" w15:restartNumberingAfterBreak="0">
     <w:nsid w:val="6D3DF3CB"/>
     <w:multiLevelType w:val="hybridMultilevel"/>
     <w:tmpl w:val="FFFFFFFF"/>
@@ -21089,7 +20673,7 @@
       </w:pPr>
     </w:lvl>
   </w:abstractNum>
-  <w:abstractNum w:abstractNumId="101" w15:restartNumberingAfterBreak="0">
+  <w:abstractNum w:abstractNumId="102" w15:restartNumberingAfterBreak="0">
     <w:nsid w:val="6D74539C"/>
     <w:multiLevelType w:val="multilevel"/>
     <w:tmpl w:val="84F403B2"/>
@@ -21202,7 +20786,7 @@
       </w:rPr>
     </w:lvl>
   </w:abstractNum>
-  <w:abstractNum w:abstractNumId="102" w15:restartNumberingAfterBreak="0">
+  <w:abstractNum w:abstractNumId="103" w15:restartNumberingAfterBreak="0">
     <w:nsid w:val="70D56DFE"/>
     <w:multiLevelType w:val="multilevel"/>
     <w:tmpl w:val="84F403B2"/>
@@ -21316,7 +20900,7 @@
       </w:rPr>
     </w:lvl>
   </w:abstractNum>
-  <w:abstractNum w:abstractNumId="103" w15:restartNumberingAfterBreak="0">
+  <w:abstractNum w:abstractNumId="104" w15:restartNumberingAfterBreak="0">
     <w:nsid w:val="73981CB1"/>
     <w:multiLevelType w:val="hybridMultilevel"/>
     <w:tmpl w:val="FFFFFFFF"/>
@@ -21429,7 +21013,7 @@
       </w:rPr>
     </w:lvl>
   </w:abstractNum>
-  <w:abstractNum w:abstractNumId="104" w15:restartNumberingAfterBreak="0">
+  <w:abstractNum w:abstractNumId="105" w15:restartNumberingAfterBreak="0">
     <w:nsid w:val="748E48C8"/>
     <w:multiLevelType w:val="hybridMultilevel"/>
     <w:tmpl w:val="FFFFFFFF"/>
@@ -21542,7 +21126,7 @@
       </w:rPr>
     </w:lvl>
   </w:abstractNum>
-  <w:abstractNum w:abstractNumId="105" w15:restartNumberingAfterBreak="0">
+  <w:abstractNum w:abstractNumId="106" w15:restartNumberingAfterBreak="0">
     <w:nsid w:val="76F421D8"/>
     <w:multiLevelType w:val="hybridMultilevel"/>
     <w:tmpl w:val="512A0F40"/>
@@ -21655,7 +21239,7 @@
       </w:rPr>
     </w:lvl>
   </w:abstractNum>
-  <w:abstractNum w:abstractNumId="106" w15:restartNumberingAfterBreak="0">
+  <w:abstractNum w:abstractNumId="107" w15:restartNumberingAfterBreak="0">
     <w:nsid w:val="779FEE8A"/>
     <w:multiLevelType w:val="hybridMultilevel"/>
     <w:tmpl w:val="FFFFFFFF"/>
@@ -21768,7 +21352,7 @@
       </w:rPr>
     </w:lvl>
   </w:abstractNum>
-  <w:abstractNum w:abstractNumId="107" w15:restartNumberingAfterBreak="0">
+  <w:abstractNum w:abstractNumId="108" w15:restartNumberingAfterBreak="0">
     <w:nsid w:val="78580E64"/>
     <w:multiLevelType w:val="multilevel"/>
     <w:tmpl w:val="F6084292"/>
@@ -21882,13 +21466,13 @@
       </w:rPr>
     </w:lvl>
   </w:abstractNum>
-  <w:abstractNum w:abstractNumId="108" w15:restartNumberingAfterBreak="0">
+  <w:abstractNum w:abstractNumId="109" w15:restartNumberingAfterBreak="0">
     <w:nsid w:val="78663817"/>
     <w:multiLevelType w:val="multilevel"/>
     <w:tmpl w:val="84F403B2"/>
     <w:numStyleLink w:val="CurrentList10"/>
   </w:abstractNum>
-  <w:abstractNum w:abstractNumId="109" w15:restartNumberingAfterBreak="0">
+  <w:abstractNum w:abstractNumId="110" w15:restartNumberingAfterBreak="0">
     <w:nsid w:val="7A50D04B"/>
     <w:multiLevelType w:val="hybridMultilevel"/>
     <w:tmpl w:val="FFFFFFFF"/>
@@ -22001,7 +21585,7 @@
       </w:rPr>
     </w:lvl>
   </w:abstractNum>
-  <w:abstractNum w:abstractNumId="110" w15:restartNumberingAfterBreak="0">
+  <w:abstractNum w:abstractNumId="111" w15:restartNumberingAfterBreak="0">
     <w:nsid w:val="7B832388"/>
     <w:multiLevelType w:val="multilevel"/>
     <w:tmpl w:val="2B7EC5A0"/>
@@ -22091,7 +21675,7 @@
       </w:pPr>
     </w:lvl>
   </w:abstractNum>
-  <w:abstractNum w:abstractNumId="111" w15:restartNumberingAfterBreak="0">
+  <w:abstractNum w:abstractNumId="112" w15:restartNumberingAfterBreak="0">
     <w:nsid w:val="7BA7DB24"/>
     <w:multiLevelType w:val="hybridMultilevel"/>
     <w:tmpl w:val="961E7A56"/>
@@ -22204,7 +21788,7 @@
       </w:rPr>
     </w:lvl>
   </w:abstractNum>
-  <w:abstractNum w:abstractNumId="112" w15:restartNumberingAfterBreak="0">
+  <w:abstractNum w:abstractNumId="113" w15:restartNumberingAfterBreak="0">
     <w:nsid w:val="7C7C7C8E"/>
     <w:multiLevelType w:val="hybridMultilevel"/>
     <w:tmpl w:val="A64C5446"/>
@@ -22317,7 +21901,7 @@
       </w:rPr>
     </w:lvl>
   </w:abstractNum>
-  <w:abstractNum w:abstractNumId="113" w15:restartNumberingAfterBreak="0">
+  <w:abstractNum w:abstractNumId="114" w15:restartNumberingAfterBreak="0">
     <w:nsid w:val="7F61762B"/>
     <w:multiLevelType w:val="hybridMultilevel"/>
     <w:tmpl w:val="5B78915A"/>
@@ -22430,7 +22014,7 @@
       </w:rPr>
     </w:lvl>
   </w:abstractNum>
-  <w:abstractNum w:abstractNumId="114" w15:restartNumberingAfterBreak="0">
+  <w:abstractNum w:abstractNumId="115" w15:restartNumberingAfterBreak="0">
     <w:nsid w:val="7F8DBECC"/>
     <w:multiLevelType w:val="hybridMultilevel"/>
     <w:tmpl w:val="FFFFFFFF"/>
@@ -22517,286 +22101,286 @@
     </w:lvl>
   </w:abstractNum>
   <w:num w:numId="1" w16cid:durableId="336349909">
-    <w:abstractNumId w:val="71"/>
+    <w:abstractNumId w:val="72"/>
   </w:num>
   <w:num w:numId="2" w16cid:durableId="414861078">
     <w:abstractNumId w:val="10"/>
   </w:num>
   <w:num w:numId="3" w16cid:durableId="1554536641">
-    <w:abstractNumId w:val="37"/>
+    <w:abstractNumId w:val="38"/>
   </w:num>
   <w:num w:numId="4" w16cid:durableId="922299968">
-    <w:abstractNumId w:val="45"/>
+    <w:abstractNumId w:val="46"/>
   </w:num>
   <w:num w:numId="5" w16cid:durableId="110561315">
-    <w:abstractNumId w:val="94"/>
+    <w:abstractNumId w:val="95"/>
   </w:num>
   <w:num w:numId="6" w16cid:durableId="1592465410">
     <w:abstractNumId w:val="16"/>
   </w:num>
   <w:num w:numId="7" w16cid:durableId="992443989">
-    <w:abstractNumId w:val="58"/>
+    <w:abstractNumId w:val="59"/>
   </w:num>
   <w:num w:numId="8" w16cid:durableId="1755517927">
-    <w:abstractNumId w:val="95"/>
+    <w:abstractNumId w:val="96"/>
   </w:num>
   <w:num w:numId="9" w16cid:durableId="1202327175">
-    <w:abstractNumId w:val="83"/>
+    <w:abstractNumId w:val="84"/>
   </w:num>
   <w:num w:numId="10" w16cid:durableId="33816737">
-    <w:abstractNumId w:val="81"/>
+    <w:abstractNumId w:val="82"/>
   </w:num>
   <w:num w:numId="11" w16cid:durableId="1569457128">
-    <w:abstractNumId w:val="92"/>
+    <w:abstractNumId w:val="93"/>
   </w:num>
   <w:num w:numId="12" w16cid:durableId="254822610">
     <w:abstractNumId w:val="17"/>
   </w:num>
   <w:num w:numId="13" w16cid:durableId="1999264653">
+    <w:abstractNumId w:val="114"/>
+  </w:num>
+  <w:num w:numId="14" w16cid:durableId="1905868251">
+    <w:abstractNumId w:val="32"/>
+  </w:num>
+  <w:num w:numId="15" w16cid:durableId="1207596473">
+    <w:abstractNumId w:val="112"/>
+  </w:num>
+  <w:num w:numId="16" w16cid:durableId="255333099">
+    <w:abstractNumId w:val="43"/>
+  </w:num>
+  <w:num w:numId="17" w16cid:durableId="1924679370">
+    <w:abstractNumId w:val="106"/>
+  </w:num>
+  <w:num w:numId="18" w16cid:durableId="67269607">
+    <w:abstractNumId w:val="91"/>
+  </w:num>
+  <w:num w:numId="19" w16cid:durableId="644050798">
+    <w:abstractNumId w:val="42"/>
+  </w:num>
+  <w:num w:numId="20" w16cid:durableId="609896600">
+    <w:abstractNumId w:val="66"/>
+  </w:num>
+  <w:num w:numId="21" w16cid:durableId="783577274">
+    <w:abstractNumId w:val="54"/>
+  </w:num>
+  <w:num w:numId="22" w16cid:durableId="1781339604">
     <w:abstractNumId w:val="113"/>
   </w:num>
-  <w:num w:numId="14" w16cid:durableId="1905868251">
-    <w:abstractNumId w:val="31"/>
-  </w:num>
-  <w:num w:numId="15" w16cid:durableId="1207596473">
-    <w:abstractNumId w:val="111"/>
-  </w:num>
-  <w:num w:numId="16" w16cid:durableId="255333099">
-    <w:abstractNumId w:val="42"/>
-  </w:num>
-  <w:num w:numId="17" w16cid:durableId="1924679370">
-    <w:abstractNumId w:val="105"/>
-  </w:num>
-  <w:num w:numId="18" w16cid:durableId="67269607">
-    <w:abstractNumId w:val="90"/>
-  </w:num>
-  <w:num w:numId="19" w16cid:durableId="644050798">
-    <w:abstractNumId w:val="41"/>
-  </w:num>
-  <w:num w:numId="20" w16cid:durableId="609896600">
-    <w:abstractNumId w:val="65"/>
-  </w:num>
-  <w:num w:numId="21" w16cid:durableId="783577274">
-    <w:abstractNumId w:val="53"/>
-  </w:num>
-  <w:num w:numId="22" w16cid:durableId="1781339604">
-    <w:abstractNumId w:val="112"/>
-  </w:num>
   <w:num w:numId="23" w16cid:durableId="606887391">
-    <w:abstractNumId w:val="50"/>
+    <w:abstractNumId w:val="51"/>
   </w:num>
   <w:num w:numId="24" w16cid:durableId="266886387">
-    <w:abstractNumId w:val="22"/>
+    <w:abstractNumId w:val="23"/>
   </w:num>
   <w:num w:numId="25" w16cid:durableId="389547677">
-    <w:abstractNumId w:val="84"/>
+    <w:abstractNumId w:val="85"/>
   </w:num>
   <w:num w:numId="26" w16cid:durableId="1725717821">
-    <w:abstractNumId w:val="97"/>
+    <w:abstractNumId w:val="98"/>
   </w:num>
   <w:num w:numId="27" w16cid:durableId="998381505">
     <w:abstractNumId w:val="15"/>
   </w:num>
   <w:num w:numId="28" w16cid:durableId="697662395">
-    <w:abstractNumId w:val="61"/>
+    <w:abstractNumId w:val="62"/>
   </w:num>
   <w:num w:numId="29" w16cid:durableId="1151367008">
-    <w:abstractNumId w:val="56"/>
+    <w:abstractNumId w:val="57"/>
   </w:num>
   <w:num w:numId="30" w16cid:durableId="1210918481">
-    <w:abstractNumId w:val="40"/>
+    <w:abstractNumId w:val="41"/>
   </w:num>
   <w:num w:numId="31" w16cid:durableId="1795639879">
-    <w:abstractNumId w:val="74"/>
+    <w:abstractNumId w:val="75"/>
   </w:num>
   <w:num w:numId="32" w16cid:durableId="904031109">
-    <w:abstractNumId w:val="36"/>
+    <w:abstractNumId w:val="37"/>
   </w:num>
   <w:num w:numId="33" w16cid:durableId="1577938554">
-    <w:abstractNumId w:val="110"/>
+    <w:abstractNumId w:val="111"/>
   </w:num>
   <w:num w:numId="34" w16cid:durableId="199175458">
-    <w:abstractNumId w:val="86"/>
+    <w:abstractNumId w:val="87"/>
   </w:num>
   <w:num w:numId="35" w16cid:durableId="423304255">
-    <w:abstractNumId w:val="24"/>
+    <w:abstractNumId w:val="25"/>
   </w:num>
   <w:num w:numId="36" w16cid:durableId="1403454761">
-    <w:abstractNumId w:val="54"/>
+    <w:abstractNumId w:val="55"/>
   </w:num>
   <w:num w:numId="37" w16cid:durableId="544563430">
-    <w:abstractNumId w:val="78"/>
+    <w:abstractNumId w:val="79"/>
   </w:num>
   <w:num w:numId="38" w16cid:durableId="933048362">
-    <w:abstractNumId w:val="43"/>
+    <w:abstractNumId w:val="44"/>
   </w:num>
   <w:num w:numId="39" w16cid:durableId="1950115891">
-    <w:abstractNumId w:val="114"/>
+    <w:abstractNumId w:val="115"/>
   </w:num>
   <w:num w:numId="40" w16cid:durableId="1132482155">
-    <w:abstractNumId w:val="21"/>
+    <w:abstractNumId w:val="22"/>
   </w:num>
   <w:num w:numId="41" w16cid:durableId="722410404">
-    <w:abstractNumId w:val="70"/>
+    <w:abstractNumId w:val="71"/>
   </w:num>
   <w:num w:numId="42" w16cid:durableId="624192111">
-    <w:abstractNumId w:val="87"/>
+    <w:abstractNumId w:val="88"/>
   </w:num>
   <w:num w:numId="43" w16cid:durableId="2142575668">
-    <w:abstractNumId w:val="96"/>
+    <w:abstractNumId w:val="97"/>
   </w:num>
   <w:num w:numId="44" w16cid:durableId="1033728111">
-    <w:abstractNumId w:val="63"/>
+    <w:abstractNumId w:val="64"/>
   </w:num>
   <w:num w:numId="45" w16cid:durableId="848956930">
-    <w:abstractNumId w:val="106"/>
+    <w:abstractNumId w:val="107"/>
   </w:num>
   <w:num w:numId="46" w16cid:durableId="213153907">
     <w:abstractNumId w:val="13"/>
   </w:num>
   <w:num w:numId="47" w16cid:durableId="741178917">
-    <w:abstractNumId w:val="98"/>
+    <w:abstractNumId w:val="99"/>
   </w:num>
   <w:num w:numId="48" w16cid:durableId="411973708">
     <w:abstractNumId w:val="18"/>
   </w:num>
   <w:num w:numId="49" w16cid:durableId="1889415308">
-    <w:abstractNumId w:val="80"/>
+    <w:abstractNumId w:val="81"/>
   </w:num>
   <w:num w:numId="50" w16cid:durableId="726613328">
+    <w:abstractNumId w:val="105"/>
+  </w:num>
+  <w:num w:numId="51" w16cid:durableId="1529181502">
+    <w:abstractNumId w:val="65"/>
+  </w:num>
+  <w:num w:numId="52" w16cid:durableId="970286277">
+    <w:abstractNumId w:val="20"/>
+  </w:num>
+  <w:num w:numId="53" w16cid:durableId="596865798">
+    <w:abstractNumId w:val="48"/>
+  </w:num>
+  <w:num w:numId="54" w16cid:durableId="205141027">
+    <w:abstractNumId w:val="58"/>
+  </w:num>
+  <w:num w:numId="55" w16cid:durableId="1629554637">
+    <w:abstractNumId w:val="101"/>
+  </w:num>
+  <w:num w:numId="56" w16cid:durableId="2083596222">
+    <w:abstractNumId w:val="26"/>
+  </w:num>
+  <w:num w:numId="57" w16cid:durableId="1678311715">
+    <w:abstractNumId w:val="28"/>
+  </w:num>
+  <w:num w:numId="58" w16cid:durableId="1201279514">
+    <w:abstractNumId w:val="67"/>
+  </w:num>
+  <w:num w:numId="59" w16cid:durableId="812215297">
+    <w:abstractNumId w:val="69"/>
+  </w:num>
+  <w:num w:numId="60" w16cid:durableId="967707996">
+    <w:abstractNumId w:val="110"/>
+  </w:num>
+  <w:num w:numId="61" w16cid:durableId="1098137175">
+    <w:abstractNumId w:val="30"/>
+  </w:num>
+  <w:num w:numId="62" w16cid:durableId="1660694759">
     <w:abstractNumId w:val="104"/>
   </w:num>
-  <w:num w:numId="51" w16cid:durableId="1529181502">
-    <w:abstractNumId w:val="64"/>
+  <w:num w:numId="63" w16cid:durableId="1074888028">
+    <w:abstractNumId w:val="45"/>
   </w:num>
-  <w:num w:numId="52" w16cid:durableId="970286277">
-    <w:abstractNumId w:val="19"/>
+  <w:num w:numId="64" w16cid:durableId="395401372">
+    <w:abstractNumId w:val="60"/>
   </w:num>
-  <w:num w:numId="53" w16cid:durableId="596865798">
-    <w:abstractNumId w:val="47"/>
+  <w:num w:numId="65" w16cid:durableId="446774991">
+    <w:abstractNumId w:val="61"/>
   </w:num>
-  <w:num w:numId="54" w16cid:durableId="205141027">
-    <w:abstractNumId w:val="57"/>
+  <w:num w:numId="66" w16cid:durableId="1087507395">
+    <w:abstractNumId w:val="76"/>
   </w:num>
-  <w:num w:numId="55" w16cid:durableId="1629554637">
-    <w:abstractNumId w:val="100"/>
+  <w:num w:numId="67" w16cid:durableId="719865581">
+    <w:abstractNumId w:val="39"/>
   </w:num>
-  <w:num w:numId="56" w16cid:durableId="2083596222">
-    <w:abstractNumId w:val="25"/>
+  <w:num w:numId="68" w16cid:durableId="382290683">
+    <w:abstractNumId w:val="94"/>
   </w:num>
-  <w:num w:numId="57" w16cid:durableId="1678311715">
-    <w:abstractNumId w:val="27"/>
+  <w:num w:numId="69" w16cid:durableId="472719696">
+    <w:abstractNumId w:val="70"/>
   </w:num>
-  <w:num w:numId="58" w16cid:durableId="1201279514">
-    <w:abstractNumId w:val="66"/>
+  <w:num w:numId="70" w16cid:durableId="541747401">
+    <w:abstractNumId w:val="49"/>
   </w:num>
-  <w:num w:numId="59" w16cid:durableId="812215297">
+  <w:num w:numId="71" w16cid:durableId="66928284">
     <w:abstractNumId w:val="68"/>
   </w:num>
-  <w:num w:numId="60" w16cid:durableId="967707996">
-    <w:abstractNumId w:val="109"/>
+  <w:num w:numId="72" w16cid:durableId="577325248">
+    <w:abstractNumId w:val="50"/>
   </w:num>
-  <w:num w:numId="61" w16cid:durableId="1098137175">
+  <w:num w:numId="73" w16cid:durableId="1390151693">
+    <w:abstractNumId w:val="102"/>
+  </w:num>
+  <w:num w:numId="74" w16cid:durableId="1447575029">
     <w:abstractNumId w:val="29"/>
   </w:num>
-  <w:num w:numId="62" w16cid:durableId="1660694759">
-    <w:abstractNumId w:val="103"/>
-  </w:num>
-  <w:num w:numId="63" w16cid:durableId="1074888028">
-    <w:abstractNumId w:val="44"/>
-  </w:num>
-  <w:num w:numId="64" w16cid:durableId="395401372">
-    <w:abstractNumId w:val="59"/>
-  </w:num>
-  <w:num w:numId="65" w16cid:durableId="446774991">
-    <w:abstractNumId w:val="60"/>
-  </w:num>
-  <w:num w:numId="66" w16cid:durableId="1087507395">
-    <w:abstractNumId w:val="75"/>
-  </w:num>
-  <w:num w:numId="67" w16cid:durableId="719865581">
-    <w:abstractNumId w:val="38"/>
-  </w:num>
-  <w:num w:numId="68" w16cid:durableId="382290683">
-    <w:abstractNumId w:val="93"/>
-  </w:num>
-  <w:num w:numId="69" w16cid:durableId="472719696">
-    <w:abstractNumId w:val="69"/>
-  </w:num>
-  <w:num w:numId="70" w16cid:durableId="541747401">
-    <w:abstractNumId w:val="48"/>
-  </w:num>
-  <w:num w:numId="71" w16cid:durableId="66928284">
-    <w:abstractNumId w:val="67"/>
-  </w:num>
-  <w:num w:numId="72" w16cid:durableId="577325248">
-    <w:abstractNumId w:val="49"/>
-  </w:num>
-  <w:num w:numId="73" w16cid:durableId="1390151693">
-    <w:abstractNumId w:val="101"/>
-  </w:num>
-  <w:num w:numId="74" w16cid:durableId="1447575029">
-    <w:abstractNumId w:val="28"/>
-  </w:num>
   <w:num w:numId="75" w16cid:durableId="1480685891">
-    <w:abstractNumId w:val="88"/>
+    <w:abstractNumId w:val="89"/>
   </w:num>
   <w:num w:numId="76" w16cid:durableId="440538493">
-    <w:abstractNumId w:val="51"/>
+    <w:abstractNumId w:val="52"/>
   </w:num>
   <w:num w:numId="77" w16cid:durableId="1031491795">
-    <w:abstractNumId w:val="30"/>
+    <w:abstractNumId w:val="31"/>
   </w:num>
   <w:num w:numId="78" w16cid:durableId="850681445">
-    <w:abstractNumId w:val="73"/>
+    <w:abstractNumId w:val="74"/>
   </w:num>
   <w:num w:numId="79" w16cid:durableId="1077938050">
-    <w:abstractNumId w:val="76"/>
+    <w:abstractNumId w:val="77"/>
   </w:num>
   <w:num w:numId="80" w16cid:durableId="1388920618">
-    <w:abstractNumId w:val="20"/>
+    <w:abstractNumId w:val="21"/>
   </w:num>
   <w:num w:numId="81" w16cid:durableId="538590936">
     <w:abstractNumId w:val="11"/>
   </w:num>
   <w:num w:numId="82" w16cid:durableId="892615543">
-    <w:abstractNumId w:val="107"/>
+    <w:abstractNumId w:val="108"/>
   </w:num>
   <w:num w:numId="83" w16cid:durableId="1734237649">
-    <w:abstractNumId w:val="26"/>
+    <w:abstractNumId w:val="27"/>
   </w:num>
   <w:num w:numId="84" w16cid:durableId="466625658">
-    <w:abstractNumId w:val="85"/>
+    <w:abstractNumId w:val="86"/>
   </w:num>
   <w:num w:numId="85" w16cid:durableId="996809307">
-    <w:abstractNumId w:val="46"/>
+    <w:abstractNumId w:val="47"/>
   </w:num>
   <w:num w:numId="86" w16cid:durableId="920986330">
-    <w:abstractNumId w:val="23"/>
+    <w:abstractNumId w:val="24"/>
   </w:num>
   <w:num w:numId="87" w16cid:durableId="1346709298">
-    <w:abstractNumId w:val="79"/>
+    <w:abstractNumId w:val="80"/>
   </w:num>
   <w:num w:numId="88" w16cid:durableId="803623609">
     <w:abstractNumId w:val="12"/>
   </w:num>
   <w:num w:numId="89" w16cid:durableId="202788078">
-    <w:abstractNumId w:val="52"/>
+    <w:abstractNumId w:val="53"/>
   </w:num>
   <w:num w:numId="90" w16cid:durableId="66926623">
-    <w:abstractNumId w:val="33"/>
+    <w:abstractNumId w:val="34"/>
   </w:num>
   <w:num w:numId="91" w16cid:durableId="1769884824">
-    <w:abstractNumId w:val="35"/>
+    <w:abstractNumId w:val="36"/>
   </w:num>
   <w:num w:numId="92" w16cid:durableId="182716375">
     <w:abstractNumId w:val="14"/>
   </w:num>
   <w:num w:numId="93" w16cid:durableId="5207302">
-    <w:abstractNumId w:val="34"/>
+    <w:abstractNumId w:val="35"/>
   </w:num>
   <w:num w:numId="94" w16cid:durableId="1877739759">
-    <w:abstractNumId w:val="102"/>
+    <w:abstractNumId w:val="103"/>
   </w:num>
   <w:num w:numId="95" w16cid:durableId="1930309608">
     <w:abstractNumId w:val="0"/>
@@ -22829,44 +22413,47 @@
     <w:abstractNumId w:val="9"/>
   </w:num>
   <w:num w:numId="105" w16cid:durableId="778985439">
-    <w:abstractNumId w:val="62"/>
+    <w:abstractNumId w:val="63"/>
   </w:num>
   <w:num w:numId="106" w16cid:durableId="1048606452">
-    <w:abstractNumId w:val="77"/>
+    <w:abstractNumId w:val="78"/>
   </w:num>
   <w:num w:numId="107" w16cid:durableId="452987798">
-    <w:abstractNumId w:val="55"/>
+    <w:abstractNumId w:val="56"/>
   </w:num>
   <w:num w:numId="108" w16cid:durableId="2063165236">
-    <w:abstractNumId w:val="108"/>
+    <w:abstractNumId w:val="109"/>
   </w:num>
   <w:num w:numId="109" w16cid:durableId="1817379557">
-    <w:abstractNumId w:val="72"/>
+    <w:abstractNumId w:val="73"/>
   </w:num>
   <w:num w:numId="110" w16cid:durableId="224100244">
-    <w:abstractNumId w:val="39"/>
+    <w:abstractNumId w:val="40"/>
   </w:num>
   <w:num w:numId="111" w16cid:durableId="327559095">
-    <w:abstractNumId w:val="89"/>
+    <w:abstractNumId w:val="90"/>
   </w:num>
   <w:num w:numId="112" w16cid:durableId="497228403">
-    <w:abstractNumId w:val="82"/>
+    <w:abstractNumId w:val="83"/>
   </w:num>
   <w:num w:numId="113" w16cid:durableId="785346556">
-    <w:abstractNumId w:val="99"/>
+    <w:abstractNumId w:val="100"/>
   </w:num>
   <w:num w:numId="114" w16cid:durableId="868838793">
-    <w:abstractNumId w:val="91"/>
+    <w:abstractNumId w:val="92"/>
   </w:num>
   <w:num w:numId="115" w16cid:durableId="327562698">
-    <w:abstractNumId w:val="32"/>
+    <w:abstractNumId w:val="33"/>
+  </w:num>
+  <w:num w:numId="116" w16cid:durableId="1297644075">
+    <w:abstractNumId w:val="19"/>
   </w:num>
   <w:numIdMacAtCleanup w:val="113"/>
 </w:numbering>
 </file>
 
 <file path=word/styles.xml><?xml version="1.0" encoding="utf-8"?>
-<w:styles xmlns:mc="http://schemas.openxmlformats.org/markup-compatibility/2006" xmlns:r="http://schemas.openxmlformats.org/officeDocument/2006/relationships" xmlns:w="http://schemas.openxmlformats.org/wordprocessingml/2006/main" xmlns:w14="http://schemas.microsoft.com/office/word/2010/wordml" xmlns:w15="http://schemas.microsoft.com/office/word/2012/wordml" xmlns:w16cex="http://schemas.microsoft.com/office/word/2018/wordml/cex" xmlns:w16cid="http://schemas.microsoft.com/office/word/2016/wordml/cid" xmlns:w16="http://schemas.microsoft.com/office/word/2018/wordml" xmlns:w16sdtdh="http://schemas.microsoft.com/office/word/2020/wordml/sdtdatahash" xmlns:w16se="http://schemas.microsoft.com/office/word/2015/wordml/symex" mc:Ignorable="w14 w15 w16se w16cid w16 w16cex w16sdtdh">
+<w:styles xmlns:mc="http://schemas.openxmlformats.org/markup-compatibility/2006" xmlns:r="http://schemas.openxmlformats.org/officeDocument/2006/relationships" xmlns:w="http://schemas.openxmlformats.org/wordprocessingml/2006/main" xmlns:w14="http://schemas.microsoft.com/office/word/2010/wordml" xmlns:w15="http://schemas.microsoft.com/office/word/2012/wordml" xmlns:w16cex="http://schemas.microsoft.com/office/word/2018/wordml/cex" xmlns:w16cid="http://schemas.microsoft.com/office/word/2016/wordml/cid" xmlns:w16="http://schemas.microsoft.com/office/word/2018/wordml" xmlns:w16du="http://schemas.microsoft.com/office/word/2023/wordml/word16du" xmlns:w16sdtdh="http://schemas.microsoft.com/office/word/2020/wordml/sdtdatahash" xmlns:w16sdtfl="http://schemas.microsoft.com/office/word/2024/wordml/sdtformatlock" xmlns:w16se="http://schemas.microsoft.com/office/word/2015/wordml/symex" mc:Ignorable="w14 w15 w16se w16cid w16 w16cex w16sdtdh w16sdtfl w16du">
   <w:docDefaults>
     <w:rPrDefault>
       <w:rPr>

</xml_diff>